<commit_message>
QR banyak meja: cukup isi jumlahnya, bukan rentang dari–sampai
Yang diketahui pemilik resto adalah "mejaku ada sepuluh", bukan "dari
nomor satu sampai nomor sepuluh". Rentang memaksanya menerjemahkan dulu
apa yang sudah dia tahu jadi dua angka, dan menyediakan dua kolom yang
bisa diisi terbalik. Sekarang satu isian: jumlah meja.

Nomornya juga tidak lagi diberi nol di depan. Nomor itu tersimpan di
dalam QR dan muncul di layar dapur, jadi harus sama persis dengan yang
diketik orang di mode satu meja — "07" dan "7" adalah dua meja berbeda
di mata siapa pun yang membacanya, dan tidak ada alasan mode borongan
menghasilkan penomoran yang berbeda dari mode satuan.

Urutan berkas di galeri tetap terjaga, tapi lewat nama berkasnya:
nomor urut berimbuhan nol dipasang di depan nama, bukan menumpang pada
nomor mejanya. Ada tesnya — dua belas berkas yang diurutkan sebagai teks
harus tetap berurutan meja 1 sampai 12.

Co-Authored-By: Claude Opus 5 <noreply@anthropic.com>
</commit_message>
<xml_diff>
--- a/docs/FSD-KAATAGO.docx
+++ b/docs/FSD-KAATAGO.docx
@@ -7600,7 +7600,20 @@
               <w:rPr>
                 <w:sz w:val="19"/>
               </w:rPr>
-              <w:t xml:space="preserve">Membuat sederet meja sekaligus: awalan opsional + rentang, maksimal </w:t>
+              <w:t xml:space="preserve">Membuat banyak meja sekaligus: </w:t>
+            </w:r>
+            <w:r>
+              <w:rPr>
+                <w:b/>
+                <w:sz w:val="19"/>
+              </w:rPr>
+              <w:t>isi jumlah mejanya</w:t>
+            </w:r>
+            <w:r>
+              <w:rPr>
+                <w:sz w:val="19"/>
+              </w:rPr>
+              <w:t xml:space="preserve">, misal 10 → 10 QR bernomor 1–10. Maksimal </w:t>
             </w:r>
             <w:r>
               <w:rPr>
@@ -7641,7 +7654,43 @@
               <w:rPr>
                 <w:sz w:val="19"/>
               </w:rPr>
-              <w:t xml:space="preserve">Nomornya diberi nol di depan mengikuti nomor terbesar (8–12 → </w:t>
+              <w:t>Awalan opsional; diisi "A" menghasilkan A1, A2, A3, …</w:t>
+            </w:r>
+          </w:p>
+        </w:tc>
+      </w:tr>
+      <w:tr>
+        <w:tc>
+          <w:tcPr>
+            <w:tcW w:type="dxa" w:w="4929"/>
+            <w:shd w:val="clear" w:fill="F4F5FB"/>
+          </w:tcPr>
+          <w:p>
+            <w:pPr>
+              <w:spacing w:after="40" w:before="40"/>
+            </w:pPr>
+            <w:r>
+              <w:rPr>
+                <w:sz w:val="19"/>
+              </w:rPr>
+              <w:t>F-QR-07</w:t>
+            </w:r>
+          </w:p>
+        </w:tc>
+        <w:tc>
+          <w:tcPr>
+            <w:tcW w:type="dxa" w:w="4929"/>
+            <w:shd w:val="clear" w:fill="F4F5FB"/>
+          </w:tcPr>
+          <w:p>
+            <w:pPr>
+              <w:spacing w:after="40" w:before="40"/>
+            </w:pPr>
+            <w:r>
+              <w:rPr>
+                <w:sz w:val="19"/>
+              </w:rPr>
+              <w:t>Nomor meja ditulis polos (</w:t>
             </w:r>
             <w:r>
               <w:rPr>
@@ -7649,13 +7698,13 @@
                 <w:color w:val="3730A3"/>
                 <w:sz w:val="19"/>
               </w:rPr>
-              <w:t>08</w:t>
-            </w:r>
-            <w:r>
-              <w:rPr>
-                <w:sz w:val="19"/>
-              </w:rPr>
-              <w:t>…</w:t>
+              <w:t>7</w:t>
+            </w:r>
+            <w:r>
+              <w:rPr>
+                <w:sz w:val="19"/>
+              </w:rPr>
+              <w:t xml:space="preserve">, bukan </w:t>
             </w:r>
             <w:r>
               <w:rPr>
@@ -7663,13 +7712,13 @@
                 <w:color w:val="3730A3"/>
                 <w:sz w:val="19"/>
               </w:rPr>
-              <w:t>12</w:t>
-            </w:r>
-            <w:r>
-              <w:rPr>
-                <w:sz w:val="19"/>
-              </w:rPr>
-              <w:t>)</w:t>
+              <w:t>07</w:t>
+            </w:r>
+            <w:r>
+              <w:rPr>
+                <w:sz w:val="19"/>
+              </w:rPr>
+              <w:t>) supaya sama dengan mode satu meja; urutan berkas di galeri dijaga lewat nama berkasnya</w:t>
             </w:r>
           </w:p>
         </w:tc>
@@ -7678,7 +7727,6 @@
         <w:tc>
           <w:tcPr>
             <w:tcW w:type="dxa" w:w="4929"/>
-            <w:shd w:val="clear" w:fill="F4F5FB"/>
           </w:tcPr>
           <w:p>
             <w:pPr>
@@ -7692,6 +7740,24 @@
             </w:r>
           </w:p>
         </w:tc>
+        <w:tc>
+          <w:tcPr>
+            <w:tcW w:type="dxa" w:w="4929"/>
+          </w:tcPr>
+          <w:p>
+            <w:pPr>
+              <w:spacing w:after="40" w:before="40"/>
+            </w:pPr>
+            <w:r>
+              <w:rPr>
+                <w:sz w:val="19"/>
+              </w:rPr>
+              <w:t>Kartunya bergaya KaataGo, memuat nama resto dan nomor meja</w:t>
+            </w:r>
+          </w:p>
+        </w:tc>
+      </w:tr>
+      <w:tr>
         <w:tc>
           <w:tcPr>
             <w:tcW w:type="dxa" w:w="4929"/>
@@ -7705,7 +7771,37 @@
               <w:rPr>
                 <w:sz w:val="19"/>
               </w:rPr>
-              <w:t>Kartunya bergaya KaataGo, memuat nama resto dan nomor meja</w:t>
+              <w:t>F-QR-05</w:t>
+            </w:r>
+          </w:p>
+        </w:tc>
+        <w:tc>
+          <w:tcPr>
+            <w:tcW w:type="dxa" w:w="4929"/>
+            <w:shd w:val="clear" w:fill="F4F5FB"/>
+          </w:tcPr>
+          <w:p>
+            <w:pPr>
+              <w:spacing w:after="40" w:before="40"/>
+            </w:pPr>
+            <w:r>
+              <w:rPr>
+                <w:sz w:val="19"/>
+              </w:rPr>
+              <w:t xml:space="preserve">Menyimpan ke galeri satuan maupun </w:t>
+            </w:r>
+            <w:r>
+              <w:rPr>
+                <w:b/>
+                <w:sz w:val="19"/>
+              </w:rPr>
+              <w:t>seluruhnya sekaligus</w:t>
+            </w:r>
+            <w:r>
+              <w:rPr>
+                <w:sz w:val="19"/>
+              </w:rPr>
+              <w:t>, dengan penghitung kemajuan</w:t>
             </w:r>
           </w:p>
         </w:tc>
@@ -7723,62 +7819,13 @@
               <w:rPr>
                 <w:sz w:val="19"/>
               </w:rPr>
-              <w:t>F-QR-05</w:t>
+              <w:t>F-QR-06</w:t>
             </w:r>
           </w:p>
         </w:tc>
         <w:tc>
           <w:tcPr>
             <w:tcW w:type="dxa" w:w="4929"/>
-          </w:tcPr>
-          <w:p>
-            <w:pPr>
-              <w:spacing w:after="40" w:before="40"/>
-            </w:pPr>
-            <w:r>
-              <w:rPr>
-                <w:sz w:val="19"/>
-              </w:rPr>
-              <w:t xml:space="preserve">Menyimpan ke galeri satuan maupun </w:t>
-            </w:r>
-            <w:r>
-              <w:rPr>
-                <w:b/>
-                <w:sz w:val="19"/>
-              </w:rPr>
-              <w:t>seluruhnya sekaligus</w:t>
-            </w:r>
-            <w:r>
-              <w:rPr>
-                <w:sz w:val="19"/>
-              </w:rPr>
-              <w:t>, dengan penghitung kemajuan</w:t>
-            </w:r>
-          </w:p>
-        </w:tc>
-      </w:tr>
-      <w:tr>
-        <w:tc>
-          <w:tcPr>
-            <w:tcW w:type="dxa" w:w="4929"/>
-            <w:shd w:val="clear" w:fill="F4F5FB"/>
-          </w:tcPr>
-          <w:p>
-            <w:pPr>
-              <w:spacing w:after="40" w:before="40"/>
-            </w:pPr>
-            <w:r>
-              <w:rPr>
-                <w:sz w:val="19"/>
-              </w:rPr>
-              <w:t>F-QR-06</w:t>
-            </w:r>
-          </w:p>
-        </w:tc>
-        <w:tc>
-          <w:tcPr>
-            <w:tcW w:type="dxa" w:w="4929"/>
-            <w:shd w:val="clear" w:fill="F4F5FB"/>
           </w:tcPr>
           <w:p>
             <w:pPr>
@@ -9884,7 +9931,7 @@
                 <w:b/>
                 <w:sz w:val="19"/>
               </w:rPr>
-              <w:t>Rentang nomor meja</w:t>
+              <w:t>Jumlah meja</w:t>
             </w:r>
           </w:p>
         </w:tc>
@@ -9901,7 +9948,7 @@
                 <w:b/>
                 <w:sz w:val="19"/>
               </w:rPr>
-              <w:t>4</w:t>
+              <w:t>3</w:t>
             </w:r>
             <w:r>
               <w:rPr>
@@ -9939,7 +9986,7 @@
               <w:rPr>
                 <w:sz w:val="19"/>
               </w:rPr>
-              <w:t>1 ≤ dari ≤ sampai; maksimal 100 baris</w:t>
+              <w:t>1 sampai 100</w:t>
             </w:r>
           </w:p>
         </w:tc>
@@ -12113,7 +12160,7 @@
                 <w:b/>
                 <w:sz w:val="19"/>
               </w:rPr>
-              <w:t>Nomor meja borongan berimbuhan nol</w:t>
+              <w:t>Maksimal 100 QR sekali buat</w:t>
             </w:r>
           </w:p>
         </w:tc>
@@ -12129,57 +12176,7 @@
               <w:rPr>
                 <w:sz w:val="19"/>
               </w:rPr>
-              <w:t xml:space="preserve">Rentang 1–12 menghasilkan </w:t>
-            </w:r>
-            <w:r>
-              <w:rPr>
-                <w:rFonts w:ascii="Consolas" w:hAnsi="Consolas"/>
-                <w:color w:val="3730A3"/>
-                <w:sz w:val="19"/>
-              </w:rPr>
-              <w:t>01</w:t>
-            </w:r>
-            <w:r>
-              <w:rPr>
-                <w:sz w:val="19"/>
-              </w:rPr>
-              <w:t>…</w:t>
-            </w:r>
-            <w:r>
-              <w:rPr>
-                <w:rFonts w:ascii="Consolas" w:hAnsi="Consolas"/>
-                <w:color w:val="3730A3"/>
-                <w:sz w:val="19"/>
-              </w:rPr>
-              <w:t>12</w:t>
-            </w:r>
-            <w:r>
-              <w:rPr>
-                <w:sz w:val="19"/>
-              </w:rPr>
-              <w:t xml:space="preserve">, bukan </w:t>
-            </w:r>
-            <w:r>
-              <w:rPr>
-                <w:rFonts w:ascii="Consolas" w:hAnsi="Consolas"/>
-                <w:color w:val="3730A3"/>
-                <w:sz w:val="19"/>
-              </w:rPr>
-              <w:t>1</w:t>
-            </w:r>
-            <w:r>
-              <w:rPr>
-                <w:sz w:val="19"/>
-              </w:rPr>
-              <w:t>…</w:t>
-            </w:r>
-            <w:r>
-              <w:rPr>
-                <w:rFonts w:ascii="Consolas" w:hAnsi="Consolas"/>
-                <w:color w:val="3730A3"/>
-                <w:sz w:val="19"/>
-              </w:rPr>
-              <w:t>12</w:t>
+              <w:t>Batas yang disengaja</w:t>
             </w:r>
           </w:p>
         </w:tc>
@@ -12199,7 +12196,7 @@
                 <w:b/>
                 <w:sz w:val="19"/>
               </w:rPr>
-              <w:t>Maksimal 100 QR sekali buat</w:t>
+              <w:t>Struk &amp; QR butuh internet saat dibuat</w:t>
             </w:r>
           </w:p>
         </w:tc>
@@ -12216,7 +12213,7 @@
               <w:rPr>
                 <w:sz w:val="19"/>
               </w:rPr>
-              <w:t>Batas yang disengaja</w:t>
+              <w:t>Dalam keadaan benar-benar luring, hurufnya jatuh ke font bawaan; bentuknya tetap benar</w:t>
             </w:r>
           </w:p>
         </w:tc>
@@ -12235,50 +12232,13 @@
                 <w:b/>
                 <w:sz w:val="19"/>
               </w:rPr>
-              <w:t>Struk &amp; QR butuh internet saat dibuat</w:t>
+              <w:t>Titik lokasi memakai layanan gratis</w:t>
             </w:r>
           </w:p>
         </w:tc>
         <w:tc>
           <w:tcPr>
             <w:tcW w:type="dxa" w:w="4929"/>
-          </w:tcPr>
-          <w:p>
-            <w:pPr>
-              <w:spacing w:after="40" w:before="40"/>
-            </w:pPr>
-            <w:r>
-              <w:rPr>
-                <w:sz w:val="19"/>
-              </w:rPr>
-              <w:t>Dalam keadaan benar-benar luring, hurufnya jatuh ke font bawaan; bentuknya tetap benar</w:t>
-            </w:r>
-          </w:p>
-        </w:tc>
-      </w:tr>
-      <w:tr>
-        <w:tc>
-          <w:tcPr>
-            <w:tcW w:type="dxa" w:w="4929"/>
-            <w:shd w:val="clear" w:fill="F4F5FB"/>
-          </w:tcPr>
-          <w:p>
-            <w:pPr>
-              <w:spacing w:after="40" w:before="40"/>
-            </w:pPr>
-            <w:r>
-              <w:rPr>
-                <w:b/>
-                <w:sz w:val="19"/>
-              </w:rPr>
-              <w:t>Titik lokasi memakai layanan gratis</w:t>
-            </w:r>
-          </w:p>
-        </w:tc>
-        <w:tc>
-          <w:tcPr>
-            <w:tcW w:type="dxa" w:w="4929"/>
-            <w:shd w:val="clear" w:fill="F4F5FB"/>
           </w:tcPr>
           <w:p>
             <w:pPr>

</xml_diff>

<commit_message>
FSD: keterangan untuk seluruh 208 tangkapan layar
Label generik "Mode Terang 01" tidak memberi tahu apa pun tentang apa
yang sedang ditunjukkan. Tiap gambar sekarang menyebut layarnya dan
apa yang bisa dilakukan di sana.

Co-Authored-By: Claude Opus 5 <noreply@anthropic.com>
</commit_message>
<xml_diff>
--- a/docs/FSD-KAATAGO.docx
+++ b/docs/FSD-KAATAGO.docx
@@ -142,7 +142,7 @@
               <w:rPr>
                 <w:sz w:val="20"/>
               </w:rPr>
-              <w:t>1.45.0 (build 88)</w:t>
+              <w:t>1.45.2 (build 90)</w:t>
             </w:r>
           </w:p>
         </w:tc>
@@ -17711,7 +17711,7 @@
                 <w:color w:val="6E728C"/>
                 <w:sz w:val="15"/>
               </w:rPr>
-              <w:t>Mode Terang 01</w:t>
+              <w:t>Halaman awal — pilih peran, pemilih tema, nomor versi</w:t>
             </w:r>
           </w:p>
         </w:tc>
@@ -17730,7 +17730,7 @@
                 <w:color w:val="6E728C"/>
                 <w:sz w:val="15"/>
               </w:rPr>
-              <w:t>Mode Terang 02</w:t>
+              <w:t>Tentang KaataGo — tautan situs dan ringkasan fitur tiap peran</w:t>
             </w:r>
           </w:p>
         </w:tc>
@@ -17749,7 +17749,7 @@
                 <w:color w:val="6E728C"/>
                 <w:sz w:val="15"/>
               </w:rPr>
-              <w:t>Mode Terang 03</w:t>
+              <w:t>Ajakan login; tamu memilih Lewati, Pesan Tanpa Login</w:t>
             </w:r>
           </w:p>
         </w:tc>
@@ -17920,7 +17920,7 @@
                 <w:color w:val="6E728C"/>
                 <w:sz w:val="15"/>
               </w:rPr>
-              <w:t>Mode Terang 04</w:t>
+              <w:t>Layar pembuka tamu — Scan QR Meja, Pilih Resto, dan Riwayat Pesanan Saya</w:t>
             </w:r>
           </w:p>
         </w:tc>
@@ -17939,7 +17939,7 @@
                 <w:color w:val="6E728C"/>
                 <w:sz w:val="15"/>
               </w:rPr>
-              <w:t>Mode Terang 05</w:t>
+              <w:t>Pilih Resto sebelum izin lokasi diberikan — hanya bagian Semua Resto</w:t>
             </w:r>
           </w:p>
         </w:tc>
@@ -17958,7 +17958,7 @@
                 <w:color w:val="6E728C"/>
                 <w:sz w:val="15"/>
               </w:rPr>
-              <w:t>Mode Terang 06</w:t>
+              <w:t>Layar yang sama setelah lokasi diketahui — bagian Terdekat muncul berikut jaraknya</w:t>
             </w:r>
           </w:p>
         </w:tc>
@@ -18129,7 +18129,7 @@
                 <w:color w:val="6E728C"/>
                 <w:sz w:val="15"/>
               </w:rPr>
-              <w:t>Mode Terang 07</w:t>
+              <w:t>Menu resto — banner promo, kategori terlipat, keranjang kosong</w:t>
             </w:r>
           </w:p>
         </w:tc>
@@ -18148,7 +18148,7 @@
                 <w:color w:val="6E728C"/>
                 <w:sz w:val="15"/>
               </w:rPr>
-              <w:t>Mode Terang 08</w:t>
+              <w:t>Dialog menu makanan — Level Pedas, catatan, jumlah, subtotal</w:t>
             </w:r>
           </w:p>
         </w:tc>
@@ -18167,7 +18167,7 @@
                 <w:color w:val="6E728C"/>
                 <w:sz w:val="15"/>
               </w:rPr>
-              <w:t>Mode Terang 09</w:t>
+              <w:t>Dialog menu minuman — tiga kelompok level: Gula, Es, dan Ukuran</w:t>
             </w:r>
           </w:p>
         </w:tc>
@@ -18338,7 +18338,7 @@
                 <w:color w:val="6E728C"/>
                 <w:sz w:val="15"/>
               </w:rPr>
-              <w:t>Mode Terang 10</w:t>
+              <w:t>Keranjang Take Away — nomor meja tidak diminta, nama pemesan wajib</w:t>
             </w:r>
           </w:p>
         </w:tc>
@@ -18357,7 +18357,7 @@
                 <w:color w:val="6E728C"/>
                 <w:sz w:val="15"/>
               </w:rPr>
-              <w:t>Mode Terang 11</w:t>
+              <w:t>Cara bayar Tunai dipilih — tombolnya berubah jadi Pesan &amp; Bayar di Kasir</w:t>
             </w:r>
           </w:p>
         </w:tc>
@@ -18376,7 +18376,7 @@
                 <w:color w:val="6E728C"/>
                 <w:sz w:val="15"/>
               </w:rPr>
-              <w:t>Mode Terang 12</w:t>
+              <w:t>Pesanan diterima — nomor pesanan untuk disebutkan di kasir dan hitung mundur 30 menit</w:t>
             </w:r>
           </w:p>
         </w:tc>
@@ -18479,7 +18479,7 @@
                 <w:color w:val="6E728C"/>
                 <w:sz w:val="15"/>
               </w:rPr>
-              <w:t>Mode Terang 13</w:t>
+              <w:t>Riwayat Saya milik tamu — peringatan bahwa riwayatnya hanya tersimpan di HP ini</w:t>
             </w:r>
           </w:p>
         </w:tc>
@@ -18687,7 +18687,7 @@
                 <w:color w:val="6E728C"/>
                 <w:sz w:val="15"/>
               </w:rPr>
-              <w:t>Mode Gelap 01</w:t>
+              <w:t>Halaman awal dengan tema Gelap aktif</w:t>
             </w:r>
           </w:p>
         </w:tc>
@@ -18706,7 +18706,7 @@
                 <w:color w:val="6E728C"/>
                 <w:sz w:val="15"/>
               </w:rPr>
-              <w:t>Mode Gelap 02</w:t>
+              <w:t>Layar pembuka tamu</w:t>
             </w:r>
           </w:p>
         </w:tc>
@@ -18725,7 +18725,7 @@
                 <w:color w:val="6E728C"/>
                 <w:sz w:val="15"/>
               </w:rPr>
-              <w:t>Mode Gelap 03</w:t>
+              <w:t>Pilih Resto — Terdekat dan Semua Resto</w:t>
             </w:r>
           </w:p>
         </w:tc>
@@ -18896,7 +18896,7 @@
                 <w:color w:val="6E728C"/>
                 <w:sz w:val="15"/>
               </w:rPr>
-              <w:t>Mode Gelap 04</w:t>
+              <w:t>Menu resto — banner promo dan kategori</w:t>
             </w:r>
           </w:p>
         </w:tc>
@@ -18915,7 +18915,7 @@
                 <w:color w:val="6E728C"/>
                 <w:sz w:val="15"/>
               </w:rPr>
-              <w:t>Mode Gelap 05</w:t>
+              <w:t>Dialog menu — deskripsi produk ikut tampil di bawah harganya</w:t>
             </w:r>
           </w:p>
         </w:tc>
@@ -18934,7 +18934,7 @@
                 <w:color w:val="6E728C"/>
                 <w:sz w:val="15"/>
               </w:rPr>
-              <w:t>Mode Gelap 06</w:t>
+              <w:t>Keranjang Dine In — nomor meja dan nama pemesan, rincian biaya service dan PPN</w:t>
             </w:r>
           </w:p>
         </w:tc>
@@ -19105,7 +19105,7 @@
                 <w:color w:val="6E728C"/>
                 <w:sz w:val="15"/>
               </w:rPr>
-              <w:t>Mode Gelap 07</w:t>
+              <w:t>Bayar dengan QRIS — kartu QR berbingkai, masa berlaku, simpan ke galeri</w:t>
             </w:r>
           </w:p>
         </w:tc>
@@ -19124,7 +19124,7 @@
                 <w:color w:val="6E728C"/>
                 <w:sz w:val="15"/>
               </w:rPr>
-              <w:t>Mode Gelap 08</w:t>
+              <w:t>Pembayaran berhasil berikut nomor pesanannya</w:t>
             </w:r>
           </w:p>
         </w:tc>
@@ -19143,7 +19143,7 @@
                 <w:color w:val="6E728C"/>
                 <w:sz w:val="15"/>
               </w:rPr>
-              <w:t>Mode Gelap 09</w:t>
+              <w:t>Pesanan Saya — status dapur dan pembayaran untuk sesi meja ini</w:t>
             </w:r>
           </w:p>
         </w:tc>
@@ -19976,7 +19976,7 @@
                 <w:color w:val="6E728C"/>
                 <w:sz w:val="15"/>
               </w:rPr>
-              <w:t>Terang — Halaman awal — pilih peran, pemilih tema (Terang aktif), nomor versi</w:t>
+              <w:t>Halaman awal — masuk sebagai Pelanggan</w:t>
             </w:r>
           </w:p>
         </w:tc>
@@ -19995,7 +19995,7 @@
                 <w:color w:val="6E728C"/>
                 <w:sz w:val="15"/>
               </w:rPr>
-              <w:t>Terang — Ajakan login Gmail; boleh dilewati dan tetap memesan sebagai tamu</w:t>
+              <w:t>Ajakan login Gmail, dengan pilihan "Lewati, Pesan Tanpa Login"</w:t>
             </w:r>
           </w:p>
         </w:tc>
@@ -20014,7 +20014,7 @@
                 <w:color w:val="6E728C"/>
                 <w:sz w:val="15"/>
               </w:rPr>
-              <w:t>Terang — Proses masuk akun Google</w:t>
+              <w:t>Menyiapkan data setelah login</w:t>
             </w:r>
           </w:p>
         </w:tc>
@@ -20185,7 +20185,7 @@
                 <w:color w:val="6E728C"/>
                 <w:sz w:val="15"/>
               </w:rPr>
-              <w:t>Terang — Menu utama pelanggan — Pesan, Profil, Riwayat, Kotak Masuk (3 belum dibaca), Tampilan, Tes Notifikasi, Keluar</w:t>
+              <w:t>Menu utama pelanggan — Pesan, Profil, Riwayat, Kotak Masuk, Tampilan, Tes Notifikasi, Keluar</w:t>
             </w:r>
           </w:p>
         </w:tc>
@@ -20204,7 +20204,7 @@
                 <w:color w:val="6E728C"/>
                 <w:sz w:val="15"/>
               </w:rPr>
-              <w:t>Terang — Mau Pesan Di Mana? — Scan QR Meja atau Pilih Resto</w:t>
+              <w:t>Mau Pesan Di Mana? — pemindai QR meja terbuka di bawah</w:t>
             </w:r>
           </w:p>
         </w:tc>
@@ -20223,7 +20223,7 @@
                 <w:color w:val="6E728C"/>
                 <w:sz w:val="15"/>
               </w:rPr>
-              <w:t>Terang — Layar yang sama tanpa bilah alat tangkapan layar</w:t>
+              <w:t>Mau Pesan Di Mana? — Scan QR Meja atau Pilih Resto</w:t>
             </w:r>
           </w:p>
         </w:tc>
@@ -20394,7 +20394,7 @@
                 <w:color w:val="6E728C"/>
                 <w:sz w:val="15"/>
               </w:rPr>
-              <w:t>Terang — Pilih Resto — pencarian, bagian Terdekat berikut jaraknya, lalu Semua Resto</w:t>
+              <w:t>Pilih Resto — daftar terdekat dengan jarak, lalu semua resto, bisa dicari</w:t>
             </w:r>
           </w:p>
         </w:tc>
@@ -20413,7 +20413,7 @@
                 <w:color w:val="6E728C"/>
                 <w:sz w:val="15"/>
               </w:rPr>
-              <w:t>Terang — Menu resto — banner promo di atas, kategori masih terlipat, keranjang kosong</w:t>
+              <w:t>Menu resto — banner promo di atas, kategori terlipat, keranjang masih kosong</w:t>
             </w:r>
           </w:p>
         </w:tc>
@@ -20432,7 +20432,7 @@
                 <w:color w:val="6E728C"/>
                 <w:sz w:val="15"/>
               </w:rPr>
-              <w:t>Terang — Kategori Makanan dibuka — kartu produk berfoto dan harga</w:t>
+              <w:t>Kategori Makanan terbuka — foto, nama, harga, tombol tambah</w:t>
             </w:r>
           </w:p>
         </w:tc>
@@ -20603,7 +20603,7 @@
                 <w:color w:val="6E728C"/>
                 <w:sz w:val="15"/>
               </w:rPr>
-              <w:t>Terang — Dialog tambah menu — pilihan Level Pedas, catatan, jumlah, subtotal</w:t>
+              <w:t>Detail menu — level pedas, catatan opsional, jumlah, subtotal</w:t>
             </w:r>
           </w:p>
         </w:tc>
@@ -20622,7 +20622,7 @@
                 <w:color w:val="6E728C"/>
                 <w:sz w:val="15"/>
               </w:rPr>
-              <w:t>Terang — Menu yang sudah masuk keranjang membawa lencana jumlah; bilah bawah menampilkan total</w:t>
+              <w:t>Menu setelah item ditambahkan — bilah keranjang muncul di bawah</w:t>
             </w:r>
           </w:p>
         </w:tc>
@@ -20641,7 +20641,7 @@
                 <w:color w:val="6E728C"/>
                 <w:sz w:val="15"/>
               </w:rPr>
-              <w:t>Terang — Keranjang — Dine In/Take Away, nomor meja dan nama wajib, rincian biaya, pilihan cara bayar</w:t>
+              <w:t>Keranjang — Dine In/Take Away, nomor meja &amp; nama wajib, rincian biaya service dan PPN, pilihan QRIS/Tunai</w:t>
             </w:r>
           </w:p>
         </w:tc>
@@ -20812,7 +20812,7 @@
                 <w:color w:val="6E728C"/>
                 <w:sz w:val="15"/>
               </w:rPr>
-              <w:t>Terang — Nomor meja terisi; tombol bayar aktif</w:t>
+              <w:t>Keranjang dengan nomor meja terisi</w:t>
             </w:r>
           </w:p>
         </w:tc>
@@ -20831,7 +20831,7 @@
                 <w:color w:val="6E728C"/>
                 <w:sz w:val="15"/>
               </w:rPr>
-              <w:t>Terang — Cara bayar Tunai dipilih — tombolnya berubah jadi Pesan &amp; Bayar di Kasir</w:t>
+              <w:t>Keranjang dengan cara bayar Tunai — tombol berubah jadi "Pesan &amp; Bayar di Kasir"</w:t>
             </w:r>
           </w:p>
         </w:tc>
@@ -20850,7 +20850,7 @@
                 <w:color w:val="6E728C"/>
                 <w:sz w:val="15"/>
               </w:rPr>
-              <w:t>Terang — Pesanan diterima — nomor pesanan, nominal, dan hitung mundur 30 menit</w:t>
+              <w:t>Pesanan Diterima (tunai) — nomor pesanan, nominal, hitung mundur 30 menit sebelum pesanan hangus</w:t>
             </w:r>
           </w:p>
         </w:tc>
@@ -21021,7 +21021,7 @@
                 <w:color w:val="6E728C"/>
                 <w:sz w:val="15"/>
               </w:rPr>
-              <w:t>Terang — Pesanan Saya — status dapur dan pembayaran, berikut tombol Batalkan Pesanan</w:t>
+              <w:t>Pesanan Saya — pesanan yang belum dibayar bisa dibatalkan sendiri</w:t>
             </w:r>
           </w:p>
         </w:tc>
@@ -21040,7 +21040,7 @@
                 <w:color w:val="6E728C"/>
                 <w:sz w:val="15"/>
               </w:rPr>
-              <w:t>Terang — Lengkapi Profil — foto, nama, email terkunci, nomor telepon opsional</w:t>
+              <w:t>Lengkapi Profil — foto, nama, email terkunci, nomor telepon opsional</w:t>
             </w:r>
           </w:p>
         </w:tc>
@@ -21059,7 +21059,7 @@
                 <w:color w:val="6E728C"/>
                 <w:sz w:val="15"/>
               </w:rPr>
-              <w:t>Terang — Riwayat Saya — pesanan lintas tanggal; yang belum dibayar masih bisa dibatalkan</w:t>
+              <w:t>Riwayat Saya — semua pesanan lintas resto, dengan tombol batal pada yang belum dibayar</w:t>
             </w:r>
           </w:p>
         </w:tc>
@@ -21245,7 +21245,7 @@
                 <w:color w:val="6E728C"/>
                 <w:sz w:val="15"/>
               </w:rPr>
-              <w:t>Gelap — Halaman awal — pemilih tema dengan Gelap aktif</w:t>
+              <w:t>Halaman awal dalam mode gelap</w:t>
             </w:r>
           </w:p>
         </w:tc>
@@ -21264,7 +21264,7 @@
                 <w:color w:val="6E728C"/>
                 <w:sz w:val="15"/>
               </w:rPr>
-              <w:t>Gelap — Tentang KaataGo — tautan situs dan ringkasan fitur per peran</w:t>
+              <w:t>Tentang KaataGo — tautan situs dan penjelasan fitur per peran</w:t>
             </w:r>
           </w:p>
         </w:tc>
@@ -21283,7 +21283,7 @@
                 <w:color w:val="6E728C"/>
                 <w:sz w:val="15"/>
               </w:rPr>
-              <w:t>Gelap — Ajakan login Gmail</w:t>
+              <w:t>Ajakan login Gmail dalam mode gelap</w:t>
             </w:r>
           </w:p>
         </w:tc>
@@ -21454,7 +21454,7 @@
                 <w:color w:val="6E728C"/>
                 <w:sz w:val="15"/>
               </w:rPr>
-              <w:t>Gelap — Menyiapkan akun lewat layanan Google</w:t>
+              <w:t>Menyiapkan data setelah login</w:t>
             </w:r>
           </w:p>
         </w:tc>
@@ -21473,7 +21473,7 @@
                 <w:color w:val="6E728C"/>
                 <w:sz w:val="15"/>
               </w:rPr>
-              <w:t>Gelap — Proses masuk berlanjut</w:t>
+              <w:t>Menyiapkan data (lanjutan)</w:t>
             </w:r>
           </w:p>
         </w:tc>
@@ -21492,7 +21492,7 @@
                 <w:color w:val="6E728C"/>
                 <w:sz w:val="15"/>
               </w:rPr>
-              <w:t>Gelap — Menu utama pelanggan</w:t>
+              <w:t>Menu utama pelanggan dalam mode gelap</w:t>
             </w:r>
           </w:p>
         </w:tc>
@@ -21663,7 +21663,7 @@
                 <w:color w:val="6E728C"/>
                 <w:sz w:val="15"/>
               </w:rPr>
-              <w:t>Gelap — Mau Pesan Di Mana?</w:t>
+              <w:t>Mau Pesan Di Mana?</w:t>
             </w:r>
           </w:p>
         </w:tc>
@@ -21682,7 +21682,7 @@
                 <w:color w:val="6E728C"/>
                 <w:sz w:val="15"/>
               </w:rPr>
-              <w:t>Gelap — Pilih Resto — Terdekat dan Semua Resto</w:t>
+              <w:t>Pilih Resto — daftar terdekat dan semua resto</w:t>
             </w:r>
           </w:p>
         </w:tc>
@@ -21701,7 +21701,7 @@
                 <w:color w:val="6E728C"/>
                 <w:sz w:val="15"/>
               </w:rPr>
-              <w:t>Gelap — Menu resto — banner promo dan kategori</w:t>
+              <w:t>Menu resto dengan banner promo — banner ikut tergulir bersama daftar menu</w:t>
             </w:r>
           </w:p>
         </w:tc>
@@ -21872,7 +21872,7 @@
                 <w:color w:val="6E728C"/>
                 <w:sz w:val="15"/>
               </w:rPr>
-              <w:t>Gelap — Banner promo dibuka — gambarnya tampil utuh berikut judul dan keterangannya</w:t>
+              <w:t>Banner promo diketuk — syarat dan periode promonya dibuka penuh</w:t>
             </w:r>
           </w:p>
         </w:tc>
@@ -21891,7 +21891,7 @@
                 <w:color w:val="6E728C"/>
                 <w:sz w:val="15"/>
               </w:rPr>
-              <w:t>Gelap — Kategori Makanan dibuka</w:t>
+              <w:t>Kategori Makanan terbuka</w:t>
             </w:r>
           </w:p>
         </w:tc>
@@ -21910,7 +21910,7 @@
                 <w:color w:val="6E728C"/>
                 <w:sz w:val="15"/>
               </w:rPr>
-              <w:t>Gelap — Kategori Minuman dibuka — banner ikut tergulir bersama menunya</w:t>
+              <w:t>Kategori Minuman terbuka</w:t>
             </w:r>
           </w:p>
         </w:tc>
@@ -22081,7 +22081,7 @@
                 <w:color w:val="6E728C"/>
                 <w:sz w:val="15"/>
               </w:rPr>
-              <w:t>Gelap — Keranjang dua menu — masing-masing membawa level yang dipilih</w:t>
+              <w:t>Keranjang berisi dua item, lengkap dengan pilihan level per item</w:t>
             </w:r>
           </w:p>
         </w:tc>
@@ -22100,7 +22100,7 @@
                 <w:color w:val="6E728C"/>
                 <w:sz w:val="15"/>
               </w:rPr>
-              <w:t>Gelap — Bayar dengan QRIS — kartu QR berbingkai KaataGo, masa berlaku, simpan ke galeri</w:t>
+              <w:t>Bayar dengan QRIS — QR berbingkai KaataGo, hitung mundur, simpan ke galeri</w:t>
             </w:r>
           </w:p>
         </w:tc>
@@ -22119,7 +22119,7 @@
                 <w:color w:val="6E728C"/>
                 <w:sz w:val="15"/>
               </w:rPr>
-              <w:t>Gelap — Pembayaran berhasil berikut nomor pesanannya</w:t>
+              <w:t>Pembayaran Berhasil — pesanan diteruskan ke kasir</w:t>
             </w:r>
           </w:p>
         </w:tc>
@@ -22290,7 +22290,7 @@
                 <w:color w:val="6E728C"/>
                 <w:sz w:val="15"/>
               </w:rPr>
-              <w:t>Gelap — Struk pembayaran — rincian menu, biaya service, PPN, dan cara bayar</w:t>
+              <w:t>Struk Pembayaran — rincian item, biaya service, PPN, metode; bisa disimpan atau dibagikan</w:t>
             </w:r>
           </w:p>
         </w:tc>
@@ -22309,7 +22309,7 @@
                 <w:color w:val="6E728C"/>
                 <w:sz w:val="15"/>
               </w:rPr>
-              <w:t>Gelap — Pesanan Saya</w:t>
+              <w:t>Pesanan Saya — status dapur dan status bayar terpisah, termasuk yang dibatalkan</w:t>
             </w:r>
           </w:p>
         </w:tc>
@@ -22328,7 +22328,7 @@
                 <w:color w:val="6E728C"/>
                 <w:sz w:val="15"/>
               </w:rPr>
-              <w:t>Gelap — Lengkapi Profil</w:t>
+              <w:t>Lengkapi Profil dalam mode gelap</w:t>
             </w:r>
           </w:p>
         </w:tc>
@@ -22499,7 +22499,7 @@
                 <w:color w:val="6E728C"/>
                 <w:sz w:val="15"/>
               </w:rPr>
-              <w:t>Gelap — Riwayat Saya</w:t>
+              <w:t>Riwayat Saya dalam mode gelap</w:t>
             </w:r>
           </w:p>
         </w:tc>
@@ -22518,7 +22518,7 @@
                 <w:color w:val="6E728C"/>
                 <w:sz w:val="15"/>
               </w:rPr>
-              <w:t>Gelap — Kotak Masuk — tab Update Aplikasi berisi pemberitahuan versi</w:t>
+              <w:t>Kotak Masuk pelanggan — tab Update Aplikasi dan General, yang belum dibaca bertanda titik</w:t>
             </w:r>
           </w:p>
         </w:tc>
@@ -22537,7 +22537,7 @@
                 <w:color w:val="6E728C"/>
                 <w:sz w:val="15"/>
               </w:rPr>
-              <w:t>Gelap — Dialog Tampilan — pilihannya menyusut jadi ikon saja karena ruangnya sempit</w:t>
+              <w:t>Pemilih tampilan: terang, gelap, atau ikut setelan HP — berlaku di perangkat ini saja</w:t>
             </w:r>
           </w:p>
         </w:tc>
@@ -22640,7 +22640,7 @@
                 <w:color w:val="6E728C"/>
                 <w:sz w:val="15"/>
               </w:rPr>
-              <w:t>Gelap — Konfirmasi keluar akun</w:t>
+              <w:t>Konfirmasi keluar dari akun</w:t>
             </w:r>
           </w:p>
         </w:tc>
@@ -22856,7 +22856,7 @@
                 <w:color w:val="6E728C"/>
                 <w:sz w:val="15"/>
               </w:rPr>
-              <w:t>Mode Terang 01</w:t>
+              <w:t>Halaman awal — masuk sebagai Karyawan Resto</w:t>
             </w:r>
           </w:p>
         </w:tc>
@@ -22875,7 +22875,7 @@
                 <w:color w:val="6E728C"/>
                 <w:sz w:val="15"/>
               </w:rPr>
-              <w:t>Mode Terang 02</w:t>
+              <w:t>Memilih akun Google karyawan</w:t>
             </w:r>
           </w:p>
         </w:tc>
@@ -22894,7 +22894,7 @@
                 <w:color w:val="6E728C"/>
                 <w:sz w:val="15"/>
               </w:rPr>
-              <w:t>Mode Terang 03</w:t>
+              <w:t>Menu kasir — Input Pesanan, Pending Payment (2 menunggu), Riwayat Kasir, Saldo, Setor, Kotak Masuk, Diskon</w:t>
             </w:r>
           </w:p>
         </w:tc>
@@ -23065,7 +23065,7 @@
                 <w:color w:val="6E728C"/>
                 <w:sz w:val="15"/>
               </w:rPr>
-              <w:t>Mode Terang 04</w:t>
+              <w:t>Input Pesanan — kategori Makanan terbuka; angka di pojok kartu adalah sisa stok</w:t>
             </w:r>
           </w:p>
         </w:tc>
@@ -23084,7 +23084,7 @@
                 <w:color w:val="6E728C"/>
                 <w:sz w:val="15"/>
               </w:rPr>
-              <w:t>Mode Terang 05</w:t>
+              <w:t>Kategori Minuman ikut terbuka</w:t>
             </w:r>
           </w:p>
         </w:tc>
@@ -23103,7 +23103,7 @@
                 <w:color w:val="6E728C"/>
                 <w:sz w:val="15"/>
               </w:rPr>
-              <w:t>Mode Terang 06</w:t>
+              <w:t>Checkout — tombol bayar mati sampai nomor meja diisi; diskon sudah terhitung dan menurunkan nominal DIBAYAR</w:t>
             </w:r>
           </w:p>
         </w:tc>
@@ -23274,7 +23274,7 @@
                 <w:color w:val="6E728C"/>
                 <w:sz w:val="15"/>
               </w:rPr>
-              <w:t>Mode Terang 07</w:t>
+              <w:t>Nomor meja dan nama pelanggan terisi — ketiga tombol pembayaran menyala</w:t>
             </w:r>
           </w:p>
         </w:tc>
@@ -23293,7 +23293,7 @@
                 <w:color w:val="6E728C"/>
                 <w:sz w:val="15"/>
               </w:rPr>
-              <w:t>Mode Terang 08</w:t>
+              <w:t>Bayar dengan QRIS di meja kasir — QR berbingkai KaataGo dan tombol Cetak QR untuk Customer</w:t>
             </w:r>
           </w:p>
         </w:tc>
@@ -23312,7 +23312,7 @@
                 <w:color w:val="6E728C"/>
                 <w:sz w:val="15"/>
               </w:rPr>
-              <w:t>Mode Terang 09</w:t>
+              <w:t>Pembayaran berhasil — struk lengkap berikut nama kasirnya, siap dicetak</w:t>
             </w:r>
           </w:p>
         </w:tc>
@@ -23483,7 +23483,7 @@
                 <w:color w:val="6E728C"/>
                 <w:sz w:val="15"/>
               </w:rPr>
-              <w:t>Mode Terang 10</w:t>
+              <w:t>Pending Payment — dua pesanan menunggu, masing-masing dengan sisa waktu bayarnya</w:t>
             </w:r>
           </w:p>
         </w:tc>
@@ -23502,7 +23502,7 @@
                 <w:color w:val="6E728C"/>
                 <w:sz w:val="15"/>
               </w:rPr>
-              <w:t>Mode Terang 11</w:t>
+              <w:t>Memilih cara terima pembayaran: Tunai, QRIS, atau Transfer</w:t>
             </w:r>
           </w:p>
         </w:tc>
@@ -23521,7 +23521,7 @@
                 <w:color w:val="6E728C"/>
                 <w:sz w:val="15"/>
               </w:rPr>
-              <w:t>Mode Terang 12</w:t>
+              <w:t>Dialog pembayaran tunai — pilihan nominal cepat; tombol terima mati selama uangnya kurang</w:t>
             </w:r>
           </w:p>
         </w:tc>
@@ -23692,7 +23692,7 @@
                 <w:color w:val="6E728C"/>
                 <w:sz w:val="15"/>
               </w:rPr>
-              <w:t>Mode Terang 13</w:t>
+              <w:t>Uang diterima diisi — kembaliannya dihitung otomatis</w:t>
             </w:r>
           </w:p>
         </w:tc>
@@ -23711,7 +23711,7 @@
                 <w:color w:val="6E728C"/>
                 <w:sz w:val="15"/>
               </w:rPr>
-              <w:t>Mode Terang 14</w:t>
+              <w:t>Pesanan lunas hilang dari antrean; pemberitahuan menyebutkan kembaliannya</w:t>
             </w:r>
           </w:p>
         </w:tc>
@@ -23730,7 +23730,7 @@
                 <w:color w:val="6E728C"/>
                 <w:sz w:val="15"/>
               </w:rPr>
-              <w:t>Mode Terang 15</w:t>
+              <w:t>Riwayat Kasir — rekap per hari berikut rincian per cara bayar dan tombol cetak ulang struk</w:t>
             </w:r>
           </w:p>
         </w:tc>
@@ -23901,7 +23901,7 @@
                 <w:color w:val="6E728C"/>
                 <w:sz w:val="15"/>
               </w:rPr>
-              <w:t>Mode Terang 16</w:t>
+              <w:t>Saldo &amp; Pengeluaran — saldo total, saldo cash dan non-cash, petty cash, rekening resto</w:t>
             </w:r>
           </w:p>
         </w:tc>
@@ -23920,7 +23920,7 @@
                 <w:color w:val="6E728C"/>
                 <w:sz w:val="15"/>
               </w:rPr>
-              <w:t>Mode Terang 17</w:t>
+              <w:t>Setor Saldo Cash — tunai di laci berikut rinciannya dan riwayat setoran</w:t>
             </w:r>
           </w:p>
         </w:tc>
@@ -23939,7 +23939,7 @@
                 <w:color w:val="6E728C"/>
                 <w:sz w:val="15"/>
               </w:rPr>
-              <w:t>Mode Terang 18</w:t>
+              <w:t>Diskon — kartu promo berikut lencana Berjalan dan masa berlakunya</w:t>
             </w:r>
           </w:p>
         </w:tc>
@@ -24125,7 +24125,7 @@
                 <w:color w:val="6E728C"/>
                 <w:sz w:val="15"/>
               </w:rPr>
-              <w:t>Mode Gelap 01</w:t>
+              <w:t>Halaman awal, tema gelap</w:t>
             </w:r>
           </w:p>
         </w:tc>
@@ -24144,7 +24144,7 @@
                 <w:color w:val="6E728C"/>
                 <w:sz w:val="15"/>
               </w:rPr>
-              <w:t>Mode Gelap 02</w:t>
+              <w:t>Memilih akun Google karyawan</w:t>
             </w:r>
           </w:p>
         </w:tc>
@@ -24163,7 +24163,7 @@
                 <w:color w:val="6E728C"/>
                 <w:sz w:val="15"/>
               </w:rPr>
-              <w:t>Mode Gelap 03</w:t>
+              <w:t>Menu kasir</w:t>
             </w:r>
           </w:p>
         </w:tc>
@@ -24334,7 +24334,7 @@
                 <w:color w:val="6E728C"/>
                 <w:sz w:val="15"/>
               </w:rPr>
-              <w:t>Mode Gelap 04</w:t>
+              <w:t>Input Pesanan — kategori masih terlipat</w:t>
             </w:r>
           </w:p>
         </w:tc>
@@ -24353,7 +24353,7 @@
                 <w:color w:val="6E728C"/>
                 <w:sz w:val="15"/>
               </w:rPr>
-              <w:t>Mode Gelap 05</w:t>
+              <w:t>Kedua kategori terbuka berikut sisa stok tiap menu</w:t>
             </w:r>
           </w:p>
         </w:tc>
@@ -24372,7 +24372,7 @@
                 <w:color w:val="6E728C"/>
                 <w:sz w:val="15"/>
               </w:rPr>
-              <w:t>Mode Gelap 06</w:t>
+              <w:t>Dialog menu — deskripsi, sisa stok, level, catatan, dan jumlah</w:t>
             </w:r>
           </w:p>
         </w:tc>
@@ -24543,7 +24543,7 @@
                 <w:color w:val="6E728C"/>
                 <w:sz w:val="15"/>
               </w:rPr>
-              <w:t>Mode Gelap 07</w:t>
+              <w:t>Dialog minuman — tiga kelompok level sekaligus</w:t>
             </w:r>
           </w:p>
         </w:tc>
@@ -24562,7 +24562,7 @@
                 <w:color w:val="6E728C"/>
                 <w:sz w:val="15"/>
               </w:rPr>
-              <w:t>Mode Gelap 08</w:t>
+              <w:t>Checkout Dine In — tombol bayar mati sebelum nomor meja diisi</w:t>
             </w:r>
           </w:p>
         </w:tc>
@@ -24581,7 +24581,7 @@
                 <w:color w:val="6E728C"/>
                 <w:sz w:val="15"/>
               </w:rPr>
-              <w:t>Mode Gelap 09</w:t>
+              <w:t>Checkout Take Away — yang diminta nama pelanggan, bukan nomor meja</w:t>
             </w:r>
           </w:p>
         </w:tc>
@@ -24752,7 +24752,7 @@
                 <w:color w:val="6E728C"/>
                 <w:sz w:val="15"/>
               </w:rPr>
-              <w:t>Mode Gelap 10</w:t>
+              <w:t>Nama pelanggan terisi — tombol pembayaran menyala</w:t>
             </w:r>
           </w:p>
         </w:tc>
@@ -24771,7 +24771,7 @@
                 <w:color w:val="6E728C"/>
                 <w:sz w:val="15"/>
               </w:rPr>
-              <w:t>Mode Gelap 11</w:t>
+              <w:t>Dialog pembayaran tunai — papan angka terbuka, tombol terima masih mati</w:t>
             </w:r>
           </w:p>
         </w:tc>
@@ -24790,7 +24790,7 @@
                 <w:color w:val="6E728C"/>
                 <w:sz w:val="15"/>
               </w:rPr>
-              <w:t>Mode Gelap 12</w:t>
+              <w:t>Uang diterima diisi — kembalian muncul dan tombol terima menyala</w:t>
             </w:r>
           </w:p>
         </w:tc>
@@ -24961,7 +24961,7 @@
                 <w:color w:val="6E728C"/>
                 <w:sz w:val="15"/>
               </w:rPr>
-              <w:t>Mode Gelap 13</w:t>
+              <w:t>Dialog yang sama dilihat utuh</w:t>
             </w:r>
           </w:p>
         </w:tc>
@@ -24980,7 +24980,7 @@
                 <w:color w:val="6E728C"/>
                 <w:sz w:val="15"/>
               </w:rPr>
-              <w:t>Mode Gelap 14</w:t>
+              <w:t>Kembalian Rp 38.950 untuk uang Rp 100.000</w:t>
             </w:r>
           </w:p>
         </w:tc>
@@ -24999,7 +24999,7 @@
                 <w:color w:val="6E728C"/>
                 <w:sz w:val="15"/>
               </w:rPr>
-              <w:t>Mode Gelap 15</w:t>
+              <w:t>Struk — memuat uang bayar dan kembaliannya</w:t>
             </w:r>
           </w:p>
         </w:tc>
@@ -25170,7 +25170,7 @@
                 <w:color w:val="6E728C"/>
                 <w:sz w:val="15"/>
               </w:rPr>
-              <w:t>Mode Gelap 16</w:t>
+              <w:t>Layar pelanggan setelah memilih bayar tunai — nomor pesanan dan hitung mundur</w:t>
             </w:r>
           </w:p>
         </w:tc>
@@ -25189,7 +25189,7 @@
                 <w:color w:val="6E728C"/>
                 <w:sz w:val="15"/>
               </w:rPr>
-              <w:t>Mode Gelap 17</w:t>
+              <w:t>Menu kasir — penanda Pending Payment berubah jadi 1</w:t>
             </w:r>
           </w:p>
         </w:tc>
@@ -25208,7 +25208,7 @@
                 <w:color w:val="6E728C"/>
                 <w:sz w:val="15"/>
               </w:rPr>
-              <w:t>Mode Gelap 18</w:t>
+              <w:t>Pending Payment — satu pesanan tamu menunggu dibayar</w:t>
             </w:r>
           </w:p>
         </w:tc>
@@ -25379,7 +25379,7 @@
                 <w:color w:val="6E728C"/>
                 <w:sz w:val="15"/>
               </w:rPr>
-              <w:t>Mode Gelap 19</w:t>
+              <w:t>Rincian pesanan sebelum uangnya diterima</w:t>
             </w:r>
           </w:p>
         </w:tc>
@@ -25398,7 +25398,7 @@
                 <w:color w:val="6E728C"/>
                 <w:sz w:val="15"/>
               </w:rPr>
-              <w:t>Mode Gelap 20</w:t>
+              <w:t>Memilih cara terima pembayaran</w:t>
             </w:r>
           </w:p>
         </w:tc>
@@ -25417,7 +25417,7 @@
                 <w:color w:val="6E728C"/>
                 <w:sz w:val="15"/>
               </w:rPr>
-              <w:t>Mode Gelap 21</w:t>
+              <w:t>Dialog pembayaran tunai untuk pesanan dari HP pelanggan</w:t>
             </w:r>
           </w:p>
         </w:tc>
@@ -25588,7 +25588,7 @@
                 <w:color w:val="6E728C"/>
                 <w:sz w:val="15"/>
               </w:rPr>
-              <w:t>Mode Gelap 22</w:t>
+              <w:t>Uang diterima diisi berikut kembaliannya</w:t>
             </w:r>
           </w:p>
         </w:tc>
@@ -25607,7 +25607,7 @@
                 <w:color w:val="6E728C"/>
                 <w:sz w:val="15"/>
               </w:rPr>
-              <w:t>Mode Gelap 23</w:t>
+              <w:t>Antrean kosong setelah dilunasi</w:t>
             </w:r>
           </w:p>
         </w:tc>
@@ -25626,7 +25626,7 @@
                 <w:color w:val="6E728C"/>
                 <w:sz w:val="15"/>
               </w:rPr>
-              <w:t>Mode Gelap 24</w:t>
+              <w:t>Riwayat Kasir — pesanan tadi ikut masuk rekap hari ini</w:t>
             </w:r>
           </w:p>
         </w:tc>
@@ -25797,7 +25797,7 @@
                 <w:color w:val="6E728C"/>
                 <w:sz w:val="15"/>
               </w:rPr>
-              <w:t>Mode Gelap 25</w:t>
+              <w:t>Saldo &amp; Pengeluaran</w:t>
             </w:r>
           </w:p>
         </w:tc>
@@ -25816,7 +25816,7 @@
                 <w:color w:val="6E728C"/>
                 <w:sz w:val="15"/>
               </w:rPr>
-              <w:t>Mode Gelap 26</w:t>
+              <w:t>Top Up Petty Cash — kasir mengajukan, menunggu persetujuan Finance</w:t>
             </w:r>
           </w:p>
         </w:tc>
@@ -25835,7 +25835,7 @@
                 <w:color w:val="6E728C"/>
                 <w:sz w:val="15"/>
               </w:rPr>
-              <w:t>Mode Gelap 27</w:t>
+              <w:t>Pengajuan tercatat sebagai Pending dan ditandai di kartu Petty Cash</w:t>
             </w:r>
           </w:p>
         </w:tc>
@@ -26006,7 +26006,7 @@
                 <w:color w:val="6E728C"/>
                 <w:sz w:val="15"/>
               </w:rPr>
-              <w:t>Mode Gelap 28</w:t>
+              <w:t>Setor Saldo Cash — tunai di laci berikut rinciannya</w:t>
             </w:r>
           </w:p>
         </w:tc>
@@ -26025,7 +26025,7 @@
                 <w:color w:val="6E728C"/>
                 <w:sz w:val="15"/>
               </w:rPr>
-              <w:t>Mode Gelap 29</w:t>
+              <w:t>Formulir setoran — rekening tujuan terisi dari Pengaturan Pembayaran, bukti bisa dilampirkan</w:t>
             </w:r>
           </w:p>
         </w:tc>
@@ -26044,7 +26044,7 @@
                 <w:color w:val="6E728C"/>
                 <w:sz w:val="15"/>
               </w:rPr>
-              <w:t>Mode Gelap 30</w:t>
+              <w:t>Setoran tercatat Pending dan mengurangi tunai di laci</w:t>
             </w:r>
           </w:p>
         </w:tc>
@@ -26181,7 +26181,7 @@
                 <w:color w:val="6E728C"/>
                 <w:sz w:val="15"/>
               </w:rPr>
-              <w:t>Mode Gelap 31</w:t>
+              <w:t>Diskon — daftar promo resto</w:t>
             </w:r>
           </w:p>
         </w:tc>
@@ -26200,7 +26200,7 @@
                 <w:color w:val="6E728C"/>
                 <w:sz w:val="15"/>
               </w:rPr>
-              <w:t>Mode Gelap 32</w:t>
+              <w:t>Ubah Diskon — dasar promo, potongan, dan masa berlakunya</w:t>
             </w:r>
           </w:p>
         </w:tc>
@@ -26405,7 +26405,7 @@
                 <w:color w:val="6E728C"/>
                 <w:sz w:val="15"/>
               </w:rPr>
-              <w:t>Mode Terang 01</w:t>
+              <w:t>Halaman awal</w:t>
             </w:r>
           </w:p>
         </w:tc>
@@ -26424,7 +26424,7 @@
                 <w:color w:val="6E728C"/>
                 <w:sz w:val="15"/>
               </w:rPr>
-              <w:t>Mode Terang 02</w:t>
+              <w:t>Masuk sebagai karyawan</w:t>
             </w:r>
           </w:p>
         </w:tc>
@@ -26443,7 +26443,7 @@
                 <w:color w:val="6E728C"/>
                 <w:sz w:val="15"/>
               </w:rPr>
-              <w:t>Mode Terang 03</w:t>
+              <w:t>Tab Menunggu Bayar — kosong; pesanan yang belum dibayar berhenti di sini, bukan di antrean masak</w:t>
             </w:r>
           </w:p>
         </w:tc>
@@ -26614,7 +26614,7 @@
                 <w:color w:val="6E728C"/>
                 <w:sz w:val="15"/>
               </w:rPr>
-              <w:t>Mode Terang 04</w:t>
+              <w:t>Tab Baru — pesanan siap dimasak, dikelompokkan Dine In dan Take Away, berikut tombol Mulai Masak</w:t>
             </w:r>
           </w:p>
         </w:tc>
@@ -26633,7 +26633,7 @@
                 <w:color w:val="6E728C"/>
                 <w:sz w:val="15"/>
               </w:rPr>
-              <w:t>Mode Terang 05</w:t>
+              <w:t>Tab Diproses — belum ada yang dikerjakan</w:t>
             </w:r>
           </w:p>
         </w:tc>
@@ -26652,7 +26652,7 @@
                 <w:color w:val="6E728C"/>
                 <w:sz w:val="15"/>
               </w:rPr>
-              <w:t>Mode Terang 06</w:t>
+              <w:t>Tab Selesai — dikelompokkan per tanggal dan tertutup secara bawaan</w:t>
             </w:r>
           </w:p>
         </w:tc>
@@ -26823,7 +26823,7 @@
                 <w:color w:val="6E728C"/>
                 <w:sz w:val="15"/>
               </w:rPr>
-              <w:t>Mode Terang 07</w:t>
+              <w:t>Pesanan berpindah ke Diproses — tombolnya berubah jadi Cek Menu &amp; Selesai</w:t>
             </w:r>
           </w:p>
         </w:tc>
@@ -26842,7 +26842,7 @@
                 <w:color w:val="6E728C"/>
                 <w:sz w:val="15"/>
               </w:rPr>
-              <w:t>Mode Terang 08</w:t>
+              <w:t>Daftar centang per menu — seluruhnya tercentang, pesanan siap ditutup</w:t>
             </w:r>
           </w:p>
         </w:tc>
@@ -26861,7 +26861,7 @@
                 <w:color w:val="6E728C"/>
                 <w:sz w:val="15"/>
               </w:rPr>
-              <w:t>Mode Terang 09</w:t>
+              <w:t>Tab Selesai — pesanan hari ini beserta rinciannya</w:t>
             </w:r>
           </w:p>
         </w:tc>
@@ -27047,7 +27047,7 @@
                 <w:color w:val="6E728C"/>
                 <w:sz w:val="15"/>
               </w:rPr>
-              <w:t>Mode Gelap 01</w:t>
+              <w:t>Halaman awal, tema gelap</w:t>
             </w:r>
           </w:p>
         </w:tc>
@@ -27066,7 +27066,7 @@
                 <w:color w:val="6E728C"/>
                 <w:sz w:val="15"/>
               </w:rPr>
-              <w:t>Mode Gelap 02</w:t>
+              <w:t>Masuk sebagai karyawan</w:t>
             </w:r>
           </w:p>
         </w:tc>
@@ -27085,7 +27085,7 @@
                 <w:color w:val="6E728C"/>
                 <w:sz w:val="15"/>
               </w:rPr>
-              <w:t>Mode Gelap 03</w:t>
+              <w:t>Tab Menunggu Bayar</w:t>
             </w:r>
           </w:p>
         </w:tc>
@@ -27256,7 +27256,7 @@
                 <w:color w:val="6E728C"/>
                 <w:sz w:val="15"/>
               </w:rPr>
-              <w:t>Mode Gelap 04</w:t>
+              <w:t>Tab Baru — dua pesanan menunggu dimasak</w:t>
             </w:r>
           </w:p>
         </w:tc>
@@ -27275,7 +27275,7 @@
                 <w:color w:val="6E728C"/>
                 <w:sz w:val="15"/>
               </w:rPr>
-              <w:t>Mode Gelap 05</w:t>
+              <w:t>Tab Diproses</w:t>
             </w:r>
           </w:p>
         </w:tc>
@@ -27294,7 +27294,7 @@
                 <w:color w:val="6E728C"/>
                 <w:sz w:val="15"/>
               </w:rPr>
-              <w:t>Mode Gelap 06</w:t>
+              <w:t>Daftar centang — baru sebagian dicentang, tombolnya jadi Simpan Progres</w:t>
             </w:r>
           </w:p>
         </w:tc>
@@ -27431,7 +27431,7 @@
                 <w:color w:val="6E728C"/>
                 <w:sz w:val="15"/>
               </w:rPr>
-              <w:t>Mode Gelap 07</w:t>
+              <w:t>Seluruh menu tercentang — tombolnya berubah jadi Tandai Pesanan Selesai</w:t>
             </w:r>
           </w:p>
         </w:tc>
@@ -27450,7 +27450,7 @@
                 <w:color w:val="6E728C"/>
                 <w:sz w:val="15"/>
               </w:rPr>
-              <w:t>Mode Gelap 08</w:t>
+              <w:t>Tab Selesai</w:t>
             </w:r>
           </w:p>
         </w:tc>
@@ -27655,7 +27655,7 @@
                 <w:color w:val="6E728C"/>
                 <w:sz w:val="15"/>
               </w:rPr>
-              <w:t>Mode Terang 01</w:t>
+              <w:t>Halaman awal</w:t>
             </w:r>
           </w:p>
         </w:tc>
@@ -27674,7 +27674,7 @@
                 <w:color w:val="6E728C"/>
                 <w:sz w:val="15"/>
               </w:rPr>
-              <w:t>Mode Terang 02</w:t>
+              <w:t>Masuk sebagai karyawan</w:t>
             </w:r>
           </w:p>
         </w:tc>
@@ -27693,7 +27693,7 @@
                 <w:color w:val="6E728C"/>
                 <w:sz w:val="15"/>
               </w:rPr>
-              <w:t>Mode Terang 03</w:t>
+              <w:t>Menu admin — Kasir, Kelola Produk, Pesanan Masuk, Pending Payment, Riwayat Kasir, Pengaturan, Saldo</w:t>
             </w:r>
           </w:p>
         </w:tc>
@@ -27864,7 +27864,7 @@
                 <w:color w:val="6E728C"/>
                 <w:sz w:val="15"/>
               </w:rPr>
-              <w:t>Mode Terang 04</w:t>
+              <w:t>Kelola Produk tab Produk — saklar di tiap baris menandai habis tanpa membuka formulirnya</w:t>
             </w:r>
           </w:p>
         </w:tc>
@@ -27883,7 +27883,7 @@
                 <w:color w:val="6E728C"/>
                 <w:sz w:val="15"/>
               </w:rPr>
-              <w:t>Mode Terang 05</w:t>
+              <w:t>Tab Kategori</w:t>
             </w:r>
           </w:p>
         </w:tc>
@@ -27902,7 +27902,7 @@
                 <w:color w:val="6E728C"/>
                 <w:sz w:val="15"/>
               </w:rPr>
-              <w:t>Mode Terang 06</w:t>
+              <w:t>Tab Level — lima kelompok bawaan berikut pilihannya, bisa diubah dan ditambah</w:t>
             </w:r>
           </w:p>
         </w:tc>
@@ -28073,7 +28073,7 @@
                 <w:color w:val="6E728C"/>
                 <w:sz w:val="15"/>
               </w:rPr>
-              <w:t>Mode Terang 07</w:t>
+              <w:t>Pending Payment — admin memegang antrean yang sama dengan kasir</w:t>
             </w:r>
           </w:p>
         </w:tc>
@@ -28092,7 +28092,7 @@
                 <w:color w:val="6E728C"/>
                 <w:sz w:val="15"/>
               </w:rPr>
-              <w:t>Mode Terang 08</w:t>
+              <w:t>Memilih cara terima pembayaran</w:t>
             </w:r>
           </w:p>
         </w:tc>
@@ -28111,7 +28111,7 @@
                 <w:color w:val="6E728C"/>
                 <w:sz w:val="15"/>
               </w:rPr>
-              <w:t>Mode Terang 09</w:t>
+              <w:t>Pelunasan lewat QRIS — QR-nya bisa dicetak untuk diserahkan ke pelanggan</w:t>
             </w:r>
           </w:p>
         </w:tc>
@@ -28282,7 +28282,7 @@
                 <w:color w:val="6E728C"/>
                 <w:sz w:val="15"/>
               </w:rPr>
-              <w:t>Mode Terang 10</w:t>
+              <w:t>Antrean kosong; pemberitahuan menyebutkan pesanan lunas lewat QRIS</w:t>
             </w:r>
           </w:p>
         </w:tc>
@@ -28301,7 +28301,7 @@
                 <w:color w:val="6E728C"/>
                 <w:sz w:val="15"/>
               </w:rPr>
-              <w:t>Mode Terang 11</w:t>
+              <w:t>Pengaturan — Info Resto, Banner Promo, QR Meja, Info Pembayaran, dan blok Tampilan</w:t>
             </w:r>
           </w:p>
         </w:tc>
@@ -28320,7 +28320,7 @@
                 <w:color w:val="6E728C"/>
                 <w:sz w:val="15"/>
               </w:rPr>
-              <w:t>Mode Terang 12</w:t>
+              <w:t>Info Resto — pratinjau peta lokasi dan saklar cara makan yang dilayani</w:t>
             </w:r>
           </w:p>
         </w:tc>
@@ -28491,7 +28491,7 @@
                 <w:color w:val="6E728C"/>
                 <w:sz w:val="15"/>
               </w:rPr>
-              <w:t>Mode Terang 13</w:t>
+              <w:t>Banner Promo — daftar banner berikut urutan tampil dan tombol aktif/nonaktif</w:t>
             </w:r>
           </w:p>
         </w:tc>
@@ -28510,7 +28510,7 @@
                 <w:color w:val="6E728C"/>
                 <w:sz w:val="15"/>
               </w:rPr>
-              <w:t>Mode Terang 14</w:t>
+              <w:t>Generator QR Meja mode satu meja — pratinjau kartunya berubah saat nomornya diketik</w:t>
             </w:r>
           </w:p>
         </w:tc>
@@ -28529,7 +28529,7 @@
                 <w:color w:val="6E728C"/>
                 <w:sz w:val="15"/>
               </w:rPr>
-              <w:t>Mode Terang 15</w:t>
+              <w:t>Info Pembayaran — hanya bisa dilihat; yang mengubah adalah Finance</w:t>
             </w:r>
           </w:p>
         </w:tc>
@@ -28700,7 +28700,7 @@
                 <w:color w:val="6E728C"/>
                 <w:sz w:val="15"/>
               </w:rPr>
-              <w:t>Mode Terang 16</w:t>
+              <w:t>Saldo &amp; Pengeluaran</w:t>
             </w:r>
           </w:p>
         </w:tc>
@@ -28719,7 +28719,7 @@
                 <w:color w:val="6E728C"/>
                 <w:sz w:val="15"/>
               </w:rPr>
-              <w:t>Mode Terang 17</w:t>
+              <w:t>Setor Saldo Cash — setoran yang sudah dikonfirmasi Finance</w:t>
             </w:r>
           </w:p>
         </w:tc>
@@ -28738,7 +28738,7 @@
                 <w:color w:val="6E728C"/>
                 <w:sz w:val="15"/>
               </w:rPr>
-              <w:t>Mode Terang 18</w:t>
+              <w:t>Kirim Pengumuman — pemilih sasaran Karyawan, Customer, atau Semua</w:t>
             </w:r>
           </w:p>
         </w:tc>
@@ -28841,7 +28841,7 @@
                 <w:color w:val="6E728C"/>
                 <w:sz w:val="15"/>
               </w:rPr>
-              <w:t>Mode Terang 19</w:t>
+              <w:t>Diskon</w:t>
             </w:r>
           </w:p>
         </w:tc>
@@ -29049,7 +29049,7 @@
                 <w:color w:val="6E728C"/>
                 <w:sz w:val="15"/>
               </w:rPr>
-              <w:t>Mode Gelap 01</w:t>
+              <w:t>Halaman awal, tema gelap</w:t>
             </w:r>
           </w:p>
         </w:tc>
@@ -29068,7 +29068,7 @@
                 <w:color w:val="6E728C"/>
                 <w:sz w:val="15"/>
               </w:rPr>
-              <w:t>Mode Gelap 02</w:t>
+              <w:t>Masuk sebagai karyawan</w:t>
             </w:r>
           </w:p>
         </w:tc>
@@ -29087,7 +29087,7 @@
                 <w:color w:val="6E728C"/>
                 <w:sz w:val="15"/>
               </w:rPr>
-              <w:t>Mode Gelap 03</w:t>
+              <w:t>Menu admin</w:t>
             </w:r>
           </w:p>
         </w:tc>
@@ -29258,7 +29258,7 @@
                 <w:color w:val="6E728C"/>
                 <w:sz w:val="15"/>
               </w:rPr>
-              <w:t>Mode Gelap 04</w:t>
+              <w:t>Kelola Produk tab Produk</w:t>
             </w:r>
           </w:p>
         </w:tc>
@@ -29277,7 +29277,7 @@
                 <w:color w:val="6E728C"/>
                 <w:sz w:val="15"/>
               </w:rPr>
-              <w:t>Mode Gelap 05</w:t>
+              <w:t>Tab Kategori</w:t>
             </w:r>
           </w:p>
         </w:tc>
@@ -29296,7 +29296,7 @@
                 <w:color w:val="6E728C"/>
                 <w:sz w:val="15"/>
               </w:rPr>
-              <w:t>Mode Gelap 06</w:t>
+              <w:t>Tab Level</w:t>
             </w:r>
           </w:p>
         </w:tc>
@@ -29467,7 +29467,7 @@
                 <w:color w:val="6E728C"/>
                 <w:sz w:val="15"/>
               </w:rPr>
-              <w:t>Mode Gelap 07</w:t>
+              <w:t>Pesanan Masuk — seluruh pesanan resto berikut status bayar dan status dapurnya</w:t>
             </w:r>
           </w:p>
         </w:tc>
@@ -29486,7 +29486,7 @@
                 <w:color w:val="6E728C"/>
                 <w:sz w:val="15"/>
               </w:rPr>
-              <w:t>Mode Gelap 08</w:t>
+              <w:t>Riwayat Kasir</w:t>
             </w:r>
           </w:p>
         </w:tc>
@@ -29505,7 +29505,7 @@
                 <w:color w:val="6E728C"/>
                 <w:sz w:val="15"/>
               </w:rPr>
-              <w:t>Mode Gelap 09</w:t>
+              <w:t>Pengaturan</w:t>
             </w:r>
           </w:p>
         </w:tc>
@@ -29676,7 +29676,7 @@
                 <w:color w:val="6E728C"/>
                 <w:sz w:val="15"/>
               </w:rPr>
-              <w:t>Mode Gelap 10</w:t>
+              <w:t>Info Resto berikut pratinjau petanya</w:t>
             </w:r>
           </w:p>
         </w:tc>
@@ -29695,7 +29695,7 @@
                 <w:color w:val="6E728C"/>
                 <w:sz w:val="15"/>
               </w:rPr>
-              <w:t>Mode Gelap 11</w:t>
+              <w:t>Banner Promo</w:t>
             </w:r>
           </w:p>
         </w:tc>
@@ -29714,7 +29714,7 @@
                 <w:color w:val="6E728C"/>
                 <w:sz w:val="15"/>
               </w:rPr>
-              <w:t>Mode Gelap 12</w:t>
+              <w:t>Ubah Banner — gambar, judul, keterangan, dan masa berlakunya</w:t>
             </w:r>
           </w:p>
         </w:tc>
@@ -29885,7 +29885,7 @@
                 <w:color w:val="6E728C"/>
                 <w:sz w:val="15"/>
               </w:rPr>
-              <w:t>Mode Gelap 13</w:t>
+              <w:t>Generator QR Meja mode satu meja</w:t>
             </w:r>
           </w:p>
         </w:tc>
@@ -29904,7 +29904,7 @@
                 <w:color w:val="6E728C"/>
                 <w:sz w:val="15"/>
               </w:rPr>
-              <w:t>Mode Gelap 14</w:t>
+              <w:t>Mode banyak meja — cukup mengisi jumlah mejanya, lalu Download Semua</w:t>
             </w:r>
           </w:p>
         </w:tc>
@@ -29923,7 +29923,7 @@
                 <w:color w:val="6E728C"/>
                 <w:sz w:val="15"/>
               </w:rPr>
-              <w:t>Mode Gelap 15</w:t>
+              <w:t>Info Pembayaran</w:t>
             </w:r>
           </w:p>
         </w:tc>
@@ -30094,7 +30094,7 @@
                 <w:color w:val="6E728C"/>
                 <w:sz w:val="15"/>
               </w:rPr>
-              <w:t>Mode Gelap 16</w:t>
+              <w:t>Saldo &amp; Pengeluaran — pengajuan petty cash yang menunggu persetujuan ikut terlihat</w:t>
             </w:r>
           </w:p>
         </w:tc>
@@ -30113,7 +30113,7 @@
                 <w:color w:val="6E728C"/>
                 <w:sz w:val="15"/>
               </w:rPr>
-              <w:t>Mode Gelap 17</w:t>
+              <w:t>Rincian petty cash — pengajuan Pending diberi penanda tersendiri</w:t>
             </w:r>
           </w:p>
         </w:tc>
@@ -30132,7 +30132,7 @@
                 <w:color w:val="6E728C"/>
                 <w:sz w:val="15"/>
               </w:rPr>
-              <w:t>Mode Gelap 18</w:t>
+              <w:t>Setor Saldo Cash — setoran yang masih menunggu approval Finance</w:t>
             </w:r>
           </w:p>
         </w:tc>
@@ -30303,7 +30303,7 @@
                 <w:color w:val="6E728C"/>
                 <w:sz w:val="15"/>
               </w:rPr>
-              <w:t>Mode Gelap 19</w:t>
+              <w:t>Kirim Pengumuman</w:t>
             </w:r>
           </w:p>
         </w:tc>
@@ -30322,7 +30322,7 @@
                 <w:color w:val="6E728C"/>
                 <w:sz w:val="15"/>
               </w:rPr>
-              <w:t>Mode Gelap 20</w:t>
+              <w:t>Diskon</w:t>
             </w:r>
           </w:p>
         </w:tc>
@@ -30341,7 +30341,7 @@
                 <w:color w:val="6E728C"/>
                 <w:sz w:val="15"/>
               </w:rPr>
-              <w:t>Mode Gelap 21</w:t>
+              <w:t>Ubah Diskon berbasis menu — beberapa menu dipilih sekaligus untuk bundling</w:t>
             </w:r>
           </w:p>
         </w:tc>
@@ -30444,7 +30444,7 @@
                 <w:color w:val="6E728C"/>
                 <w:sz w:val="15"/>
               </w:rPr>
-              <w:t>Mode Gelap 22</w:t>
+              <w:t>Bagian bawah formulir diskon — bentuk potongan dan masa berlakunya</w:t>
             </w:r>
           </w:p>
         </w:tc>
@@ -30660,7 +30660,7 @@
                 <w:color w:val="6E728C"/>
                 <w:sz w:val="15"/>
               </w:rPr>
-              <w:t>Mode Terang 01</w:t>
+              <w:t>Halaman awal — masuk sebagai Karyawan Resto</w:t>
             </w:r>
           </w:p>
         </w:tc>
@@ -30679,7 +30679,7 @@
                 <w:color w:val="6E728C"/>
                 <w:sz w:val="15"/>
               </w:rPr>
-              <w:t>Mode Terang 02</w:t>
+              <w:t>Menyiapkan data resto setelah masuk</w:t>
             </w:r>
           </w:p>
         </w:tc>
@@ -30698,7 +30698,7 @@
                 <w:color w:val="6E728C"/>
                 <w:sz w:val="15"/>
               </w:rPr>
-              <w:t>Mode Terang 03</w:t>
+              <w:t>Pemasukan — total semua waktu, dirinci per hari dengan pecahan Tunai/QRIS</w:t>
             </w:r>
           </w:p>
         </w:tc>
@@ -30869,7 +30869,7 @@
                 <w:color w:val="6E728C"/>
                 <w:sz w:val="15"/>
               </w:rPr>
-              <w:t>Mode Terang 04</w:t>
+              <w:t>Menu Finance dengan pemilih resto: semua angka mengikuti resto yang dipilih</w:t>
             </w:r>
           </w:p>
         </w:tc>
@@ -30888,7 +30888,7 @@
                 <w:color w:val="6E728C"/>
                 <w:sz w:val="15"/>
               </w:rPr>
-              <w:t>Mode Terang 05</w:t>
+              <w:t>Saldo &amp; Pengeluaran — saldo total, pecahan Cash/Non Cash, Petty Cash &amp; Riwayat Pengeluaran yang bisa dilipat</w:t>
             </w:r>
           </w:p>
         </w:tc>
@@ -30907,7 +30907,7 @@
                 <w:color w:val="6E728C"/>
                 <w:sz w:val="15"/>
               </w:rPr>
-              <w:t>Mode Terang 06</w:t>
+              <w:t>Setor Saldo Cash — tunai di laci, rincian yang sudah disetor &amp; dipindah, riwayat setoran</w:t>
             </w:r>
           </w:p>
         </w:tc>
@@ -31078,7 +31078,7 @@
                 <w:color w:val="6E728C"/>
                 <w:sz w:val="15"/>
               </w:rPr>
-              <w:t>Mode Terang 07</w:t>
+              <w:t>Mapping GL Account — akun pemasukan per metode bayar dan akun Petty Cash</w:t>
             </w:r>
           </w:p>
         </w:tc>
@@ -31097,7 +31097,7 @@
                 <w:color w:val="6E728C"/>
                 <w:sz w:val="15"/>
               </w:rPr>
-              <w:t>Mode Terang 08</w:t>
+              <w:t>Mapping GL Account (lanjutan) — tarif PPN 11% &amp; service 5%, GL Total Saldo, GL Suspense</w:t>
             </w:r>
           </w:p>
         </w:tc>
@@ -31116,7 +31116,7 @@
                 <w:color w:val="6E728C"/>
                 <w:sz w:val="15"/>
               </w:rPr>
-              <w:t>Mode Terang 09</w:t>
+              <w:t>Pencairan Gateway — dana penyedia pembayaran yang masuk rekening berikut potongan MDR</w:t>
             </w:r>
           </w:p>
         </w:tc>
@@ -31219,7 +31219,7 @@
                 <w:color w:val="6E728C"/>
                 <w:sz w:val="15"/>
               </w:rPr>
-              <w:t>Mode Terang 10</w:t>
+              <w:t>Jurnal GL — saldo GL Total, total debit &amp; kredit, tiap baris dengan nomor akun dan referensi pesanan</w:t>
             </w:r>
           </w:p>
         </w:tc>
@@ -31427,7 +31427,7 @@
                 <w:color w:val="6E728C"/>
                 <w:sz w:val="15"/>
               </w:rPr>
-              <w:t>Mode Gelap 01</w:t>
+              <w:t>Halaman awal dalam mode gelap</w:t>
             </w:r>
           </w:p>
         </w:tc>
@@ -31446,7 +31446,7 @@
                 <w:color w:val="6E728C"/>
                 <w:sz w:val="15"/>
               </w:rPr>
-              <w:t>Mode Gelap 02</w:t>
+              <w:t>Menyiapkan data resto</w:t>
             </w:r>
           </w:p>
         </w:tc>
@@ -31465,7 +31465,7 @@
                 <w:color w:val="6E728C"/>
                 <w:sz w:val="15"/>
               </w:rPr>
-              <w:t>Mode Gelap 03</w:t>
+              <w:t>Menyiapkan data resto (lanjutan)</w:t>
             </w:r>
           </w:p>
         </w:tc>
@@ -31636,7 +31636,7 @@
                 <w:color w:val="6E728C"/>
                 <w:sz w:val="15"/>
               </w:rPr>
-              <w:t>Mode Gelap 04</w:t>
+              <w:t>Pemasukan dalam mode gelap</w:t>
             </w:r>
           </w:p>
         </w:tc>
@@ -31655,7 +31655,7 @@
                 <w:color w:val="6E728C"/>
                 <w:sz w:val="15"/>
               </w:rPr>
-              <w:t>Mode Gelap 05</w:t>
+              <w:t>Menu Finance dengan penanda merah pada menu yang menunggu persetujuan</w:t>
             </w:r>
           </w:p>
         </w:tc>
@@ -31674,7 +31674,7 @@
                 <w:color w:val="6E728C"/>
                 <w:sz w:val="15"/>
               </w:rPr>
-              <w:t>Mode Gelap 06</w:t>
+              <w:t>Saldo &amp; Pengeluaran — top up petty cash menunggu persetujuan, dengan tombol Setuju/Tolak</w:t>
             </w:r>
           </w:p>
         </w:tc>
@@ -31845,7 +31845,7 @@
                 <w:color w:val="6E728C"/>
                 <w:sz w:val="15"/>
               </w:rPr>
-              <w:t>Mode Gelap 07</w:t>
+              <w:t>Dialog Setuju top up — menjelaskan perpindahan dari GL Suspense Petty Cash ke GL Petty Cash</w:t>
             </w:r>
           </w:p>
         </w:tc>
@@ -31864,7 +31864,7 @@
                 <w:color w:val="6E728C"/>
                 <w:sz w:val="15"/>
               </w:rPr>
-              <w:t>Mode Gelap 08</w:t>
+              <w:t>Saldo &amp; Pengeluaran setelah top up disetujui</w:t>
             </w:r>
           </w:p>
         </w:tc>
@@ -31883,7 +31883,7 @@
                 <w:color w:val="6E728C"/>
                 <w:sz w:val="15"/>
               </w:rPr>
-              <w:t>Mode Gelap 09</w:t>
+              <w:t>Setor Saldo Cash — setoran berstatus Pending menunggu konfirmasi Finance</w:t>
             </w:r>
           </w:p>
         </w:tc>
@@ -32054,7 +32054,7 @@
                 <w:color w:val="6E728C"/>
                 <w:sz w:val="15"/>
               </w:rPr>
-              <w:t>Mode Gelap 10</w:t>
+              <w:t>Dialog Konfirmasi setoran — mengingatkan mencocokkan nominal di rekening lebih dulu</w:t>
             </w:r>
           </w:p>
         </w:tc>
@@ -32073,7 +32073,7 @@
                 <w:color w:val="6E728C"/>
                 <w:sz w:val="15"/>
               </w:rPr>
-              <w:t>Mode Gelap 11</w:t>
+              <w:t>Setor Saldo Cash setelah dikonfirmasi — status berubah Completed</w:t>
             </w:r>
           </w:p>
         </w:tc>
@@ -32092,7 +32092,7 @@
                 <w:color w:val="6E728C"/>
                 <w:sz w:val="15"/>
               </w:rPr>
-              <w:t>Mode Gelap 12</w:t>
+              <w:t>Mapping GL Account dalam mode gelap</w:t>
             </w:r>
           </w:p>
         </w:tc>
@@ -32263,7 +32263,7 @@
                 <w:color w:val="6E728C"/>
                 <w:sz w:val="15"/>
               </w:rPr>
-              <w:t>Mode Gelap 13</w:t>
+              <w:t>Mapping GL Account (lanjutan) — tarif pajak, GL Total Saldo, GL Suspense</w:t>
             </w:r>
           </w:p>
         </w:tc>
@@ -32282,7 +32282,7 @@
                 <w:color w:val="6E728C"/>
                 <w:sz w:val="15"/>
               </w:rPr>
-              <w:t>Mode Gelap 14</w:t>
+              <w:t>Pencairan Gateway dalam mode gelap</w:t>
             </w:r>
           </w:p>
         </w:tc>
@@ -32301,7 +32301,7 @@
                 <w:color w:val="6E728C"/>
                 <w:sz w:val="15"/>
               </w:rPr>
-              <w:t>Mode Gelap 15</w:t>
+              <w:t>Jurnal GL — jejak audit persetujuan: titipan suspense dilepas, dana pindah ke akun tujuan</w:t>
             </w:r>
           </w:p>
         </w:tc>
@@ -32438,7 +32438,7 @@
                 <w:color w:val="6E728C"/>
                 <w:sz w:val="15"/>
               </w:rPr>
-              <w:t>Mode Gelap 16</w:t>
+              <w:t>Laporan Transaksi — rentang tanggal, saldo awal &amp; akhir, ekspor PDF</w:t>
             </w:r>
           </w:p>
         </w:tc>
@@ -32457,7 +32457,7 @@
                 <w:color w:val="6E728C"/>
                 <w:sz w:val="15"/>
               </w:rPr>
-              <w:t>Mode Gelap 17</w:t>
+              <w:t>Pengaturan Pembayaran — QRIS dan rekening transfer, hanya bisa dilihat oleh Finance</w:t>
             </w:r>
           </w:p>
         </w:tc>
@@ -32662,7 +32662,7 @@
                 <w:color w:val="6E728C"/>
                 <w:sz w:val="15"/>
               </w:rPr>
-              <w:t>Mode Terang 01</w:t>
+              <w:t>Halaman awal — masuk sebagai Karyawan Resto</w:t>
             </w:r>
           </w:p>
         </w:tc>
@@ -32681,7 +32681,7 @@
                 <w:color w:val="6E728C"/>
                 <w:sz w:val="15"/>
               </w:rPr>
-              <w:t>Mode Terang 02</w:t>
+              <w:t>Menyiapkan data resto setelah masuk</w:t>
             </w:r>
           </w:p>
         </w:tc>
@@ -32700,7 +32700,7 @@
                 <w:color w:val="6E728C"/>
                 <w:sz w:val="15"/>
               </w:rPr>
-              <w:t>Mode Terang 03</w:t>
+              <w:t>Pemilih resto — Owner dengan lebih dari satu resto berpindah dari sini</w:t>
             </w:r>
           </w:p>
         </w:tc>
@@ -32871,7 +32871,7 @@
                 <w:color w:val="6E728C"/>
                 <w:sz w:val="15"/>
               </w:rPr>
-              <w:t>Mode Terang 04</w:t>
+              <w:t>Menu Owner, kelompok PENJUALAN — Kasir, Pesanan Masuk, Layar Dapur, Pending Payment, Riwayat Kasir</w:t>
             </w:r>
           </w:p>
         </w:tc>
@@ -32890,7 +32890,7 @@
                 <w:color w:val="6E728C"/>
                 <w:sz w:val="15"/>
               </w:rPr>
-              <w:t>Mode Terang 05</w:t>
+              <w:t>Kelompok KEUANGAN — akses penuh seperti Finance, termasuk Jurnal GL</w:t>
             </w:r>
           </w:p>
         </w:tc>
@@ -32909,7 +32909,7 @@
                 <w:color w:val="6E728C"/>
                 <w:sz w:val="15"/>
               </w:rPr>
-              <w:t>Mode Terang 06</w:t>
+              <w:t>Kelompok PENGELOLAAN — Kelola Produk, Pengaturan, Kirim Pengumuman, Kotak Masuk, Diskon, Keluar</w:t>
             </w:r>
           </w:p>
         </w:tc>
@@ -33095,7 +33095,7 @@
                 <w:color w:val="6E728C"/>
                 <w:sz w:val="15"/>
               </w:rPr>
-              <w:t>Mode Gelap 01</w:t>
+              <w:t>Halaman awal dalam mode gelap</w:t>
             </w:r>
           </w:p>
         </w:tc>
@@ -33114,7 +33114,7 @@
                 <w:color w:val="6E728C"/>
                 <w:sz w:val="15"/>
               </w:rPr>
-              <w:t>Mode Gelap 02</w:t>
+              <w:t>Menyiapkan data resto</w:t>
             </w:r>
           </w:p>
         </w:tc>
@@ -33133,7 +33133,7 @@
                 <w:color w:val="6E728C"/>
                 <w:sz w:val="15"/>
               </w:rPr>
-              <w:t>Mode Gelap 03</w:t>
+              <w:t>Kelompok PENJUALAN dalam mode gelap</w:t>
             </w:r>
           </w:p>
         </w:tc>
@@ -33270,7 +33270,7 @@
                 <w:color w:val="6E728C"/>
                 <w:sz w:val="15"/>
               </w:rPr>
-              <w:t>Mode Gelap 04</w:t>
+              <w:t>Kelompok KEUANGAN dalam mode gelap</w:t>
             </w:r>
           </w:p>
         </w:tc>
@@ -33289,7 +33289,7 @@
                 <w:color w:val="6E728C"/>
                 <w:sz w:val="15"/>
               </w:rPr>
-              <w:t>Mode Gelap 05</w:t>
+              <w:t>Kelompok PENGELOLAAN dalam mode gelap</w:t>
             </w:r>
           </w:p>
         </w:tc>
@@ -33312,7 +33312,7 @@
           <w:i/>
           <w:sz w:val="21"/>
         </w:rPr>
-        <w:t>Dokumen ini disusun dari aplikasi versi 1.45.0. Sisi teknisnya — arsitektur, tabel, keamanan baris, prasyarat basis data — ada di `SPESIFIKASI-KAATAGO`.</w:t>
+        <w:t>Dokumen ini disusun dari aplikasi versi 1.45.2. Sisi teknisnya — arsitektur, tabel, keamanan baris, prasyarat basis data — ada di `SPESIFIKASI-KAATAGO`.</w:t>
       </w:r>
     </w:p>
     <w:sectPr>
@@ -33436,7 +33436,7 @@
         <w:color w:val="6E728C"/>
         <w:sz w:val="17"/>
       </w:rPr>
-      <w:t>KaataGo — Functional Specification Document  |  v1.45.0</w:t>
+      <w:t>KaataGo — Functional Specification Document  |  v1.45.2</w:t>
     </w:r>
   </w:p>
 </w:hdr>

</xml_diff>

<commit_message>
Diskon: syarat jumlah pembelian, dan tabel fitur A.1-A.7 di FSD
"Beli 2 Mont Blanc diskon 30%" tidak bisa dinyatakan: aturan diskon
hanya menyebut menunya, bukan berapa banyak. Akibatnya promo yang
dimaksudkan untuk mendorong pembelian kedua ikut terpakai oleh yang
membeli satu.

Jumlahnya dihitung per menu, bukan per keranjang — kalau dijumlahkan
lintas menu, keranjang apa pun berisi dua barang lolos "beli 2".

Bawaannya 1, jadi seluruh promo yang sudah ada berlaku persis seperti
sebelumnya.

Co-Authored-By: Claude Opus 5 <noreply@anthropic.com>
</commit_message>
<xml_diff>
--- a/docs/FSD-KAATAGO.docx
+++ b/docs/FSD-KAATAGO.docx
@@ -10192,43 +10192,36 @@
               <w:rPr>
                 <w:sz w:val="19"/>
               </w:rPr>
-              <w:t>F-DS-03</w:t>
-            </w:r>
-          </w:p>
-        </w:tc>
-        <w:tc>
-          <w:tcPr>
-            <w:tcW w:type="dxa" w:w="4929"/>
-          </w:tcPr>
-          <w:p>
-            <w:pPr>
-              <w:spacing w:after="40" w:before="40"/>
-            </w:pPr>
-            <w:r>
-              <w:rPr>
-                <w:sz w:val="19"/>
-              </w:rPr>
-              <w:t xml:space="preserve">Potongan berbentuk </w:t>
+              <w:t>F-DS-10</w:t>
+            </w:r>
+          </w:p>
+        </w:tc>
+        <w:tc>
+          <w:tcPr>
+            <w:tcW w:type="dxa" w:w="4929"/>
+          </w:tcPr>
+          <w:p>
+            <w:pPr>
+              <w:spacing w:after="40" w:before="40"/>
+            </w:pPr>
+            <w:r>
+              <w:rPr>
+                <w:sz w:val="19"/>
+              </w:rPr>
+              <w:t xml:space="preserve">Diskon berbasis menu dapat mensyaratkan </w:t>
             </w:r>
             <w:r>
               <w:rPr>
                 <w:b/>
                 <w:sz w:val="19"/>
               </w:rPr>
-              <w:t>persen</w:t>
-            </w:r>
-            <w:r>
-              <w:rPr>
-                <w:sz w:val="19"/>
-              </w:rPr>
-              <w:t xml:space="preserve"> (1–100) atau </w:t>
-            </w:r>
-            <w:r>
-              <w:rPr>
-                <w:b/>
-                <w:sz w:val="19"/>
-              </w:rPr>
-              <w:t>rupiah</w:t>
+              <w:t>jumlah minimum pembelian</w:t>
+            </w:r>
+            <w:r>
+              <w:rPr>
+                <w:sz w:val="19"/>
+              </w:rPr>
+              <w:t xml:space="preserve"> — "beli 2 lebih murah"; bawaannya 1</w:t>
             </w:r>
           </w:p>
         </w:tc>
@@ -10247,7 +10240,7 @@
               <w:rPr>
                 <w:sz w:val="19"/>
               </w:rPr>
-              <w:t>F-DS-04</w:t>
+              <w:t>F-DS-03</w:t>
             </w:r>
           </w:p>
         </w:tc>
@@ -10264,7 +10257,27 @@
               <w:rPr>
                 <w:sz w:val="19"/>
               </w:rPr>
-              <w:t>Masa berlaku: mulai tidak boleh mundur ke belakang, berakhir minimal besok</w:t>
+              <w:t xml:space="preserve">Potongan berbentuk </w:t>
+            </w:r>
+            <w:r>
+              <w:rPr>
+                <w:b/>
+                <w:sz w:val="19"/>
+              </w:rPr>
+              <w:t>persen</w:t>
+            </w:r>
+            <w:r>
+              <w:rPr>
+                <w:sz w:val="19"/>
+              </w:rPr>
+              <w:t xml:space="preserve"> (1–100) atau </w:t>
+            </w:r>
+            <w:r>
+              <w:rPr>
+                <w:b/>
+                <w:sz w:val="19"/>
+              </w:rPr>
+              <w:t>rupiah</w:t>
             </w:r>
           </w:p>
         </w:tc>
@@ -10282,69 +10295,23 @@
               <w:rPr>
                 <w:sz w:val="19"/>
               </w:rPr>
-              <w:t>F-DS-05</w:t>
-            </w:r>
-          </w:p>
-        </w:tc>
-        <w:tc>
-          <w:tcPr>
-            <w:tcW w:type="dxa" w:w="4929"/>
-          </w:tcPr>
-          <w:p>
-            <w:pPr>
-              <w:spacing w:after="40" w:before="40"/>
-            </w:pPr>
-            <w:r>
-              <w:rPr>
-                <w:sz w:val="19"/>
-              </w:rPr>
-              <w:t xml:space="preserve">Lencana status: </w:t>
-            </w:r>
-            <w:r>
-              <w:rPr>
-                <w:b/>
-                <w:sz w:val="19"/>
-              </w:rPr>
-              <w:t>Berjalan</w:t>
-            </w:r>
-            <w:r>
-              <w:rPr>
-                <w:sz w:val="19"/>
-              </w:rPr>
-              <w:t xml:space="preserve">, </w:t>
-            </w:r>
-            <w:r>
-              <w:rPr>
-                <w:b/>
-                <w:sz w:val="19"/>
-              </w:rPr>
-              <w:t>Terjadwal</w:t>
-            </w:r>
-            <w:r>
-              <w:rPr>
-                <w:sz w:val="19"/>
-              </w:rPr>
-              <w:t xml:space="preserve">, </w:t>
-            </w:r>
-            <w:r>
-              <w:rPr>
-                <w:b/>
-                <w:sz w:val="19"/>
-              </w:rPr>
-              <w:t>Sudah lewat</w:t>
-            </w:r>
-            <w:r>
-              <w:rPr>
-                <w:sz w:val="19"/>
-              </w:rPr>
-              <w:t xml:space="preserve">, </w:t>
-            </w:r>
-            <w:r>
-              <w:rPr>
-                <w:b/>
-                <w:sz w:val="19"/>
-              </w:rPr>
-              <w:t>Nonaktif</w:t>
+              <w:t>F-DS-04</w:t>
+            </w:r>
+          </w:p>
+        </w:tc>
+        <w:tc>
+          <w:tcPr>
+            <w:tcW w:type="dxa" w:w="4929"/>
+          </w:tcPr>
+          <w:p>
+            <w:pPr>
+              <w:spacing w:after="40" w:before="40"/>
+            </w:pPr>
+            <w:r>
+              <w:rPr>
+                <w:sz w:val="19"/>
+              </w:rPr>
+              <w:t>Masa berlaku: mulai tidak boleh mundur ke belakang, berakhir minimal besok</w:t>
             </w:r>
           </w:p>
         </w:tc>
@@ -10363,7 +10330,7 @@
               <w:rPr>
                 <w:sz w:val="19"/>
               </w:rPr>
-              <w:t>F-DS-06</w:t>
+              <w:t>F-DS-05</w:t>
             </w:r>
           </w:p>
         </w:tc>
@@ -10380,7 +10347,53 @@
               <w:rPr>
                 <w:sz w:val="19"/>
               </w:rPr>
-              <w:t>Dapat dinonaktifkan tanpa dihapus</w:t>
+              <w:t xml:space="preserve">Lencana status: </w:t>
+            </w:r>
+            <w:r>
+              <w:rPr>
+                <w:b/>
+                <w:sz w:val="19"/>
+              </w:rPr>
+              <w:t>Berjalan</w:t>
+            </w:r>
+            <w:r>
+              <w:rPr>
+                <w:sz w:val="19"/>
+              </w:rPr>
+              <w:t xml:space="preserve">, </w:t>
+            </w:r>
+            <w:r>
+              <w:rPr>
+                <w:b/>
+                <w:sz w:val="19"/>
+              </w:rPr>
+              <w:t>Terjadwal</w:t>
+            </w:r>
+            <w:r>
+              <w:rPr>
+                <w:sz w:val="19"/>
+              </w:rPr>
+              <w:t xml:space="preserve">, </w:t>
+            </w:r>
+            <w:r>
+              <w:rPr>
+                <w:b/>
+                <w:sz w:val="19"/>
+              </w:rPr>
+              <w:t>Sudah lewat</w:t>
+            </w:r>
+            <w:r>
+              <w:rPr>
+                <w:sz w:val="19"/>
+              </w:rPr>
+              <w:t xml:space="preserve">, </w:t>
+            </w:r>
+            <w:r>
+              <w:rPr>
+                <w:b/>
+                <w:sz w:val="19"/>
+              </w:rPr>
+              <w:t>Nonaktif</w:t>
             </w:r>
           </w:p>
         </w:tc>
@@ -10398,30 +10411,23 @@
               <w:rPr>
                 <w:sz w:val="19"/>
               </w:rPr>
-              <w:t>F-DS-07</w:t>
-            </w:r>
-          </w:p>
-        </w:tc>
-        <w:tc>
-          <w:tcPr>
-            <w:tcW w:type="dxa" w:w="4929"/>
-          </w:tcPr>
-          <w:p>
-            <w:pPr>
-              <w:spacing w:after="40" w:before="40"/>
-            </w:pPr>
-            <w:r>
-              <w:rPr>
-                <w:sz w:val="19"/>
-              </w:rPr>
-              <w:t xml:space="preserve">Potongan tampil sebagai baris tersendiri berikut nama promonya, lalu nominal </w:t>
-            </w:r>
-            <w:r>
-              <w:rPr>
-                <w:b/>
-                <w:sz w:val="19"/>
-              </w:rPr>
-              <w:t>DIBAYAR</w:t>
+              <w:t>F-DS-06</w:t>
+            </w:r>
+          </w:p>
+        </w:tc>
+        <w:tc>
+          <w:tcPr>
+            <w:tcW w:type="dxa" w:w="4929"/>
+          </w:tcPr>
+          <w:p>
+            <w:pPr>
+              <w:spacing w:after="40" w:before="40"/>
+            </w:pPr>
+            <w:r>
+              <w:rPr>
+                <w:sz w:val="19"/>
+              </w:rPr>
+              <w:t>Dapat dinonaktifkan tanpa dihapus</w:t>
             </w:r>
           </w:p>
         </w:tc>
@@ -10440,7 +10446,7 @@
               <w:rPr>
                 <w:sz w:val="19"/>
               </w:rPr>
-              <w:t>F-DS-08</w:t>
+              <w:t>F-DS-07</w:t>
             </w:r>
           </w:p>
         </w:tc>
@@ -10457,7 +10463,14 @@
               <w:rPr>
                 <w:sz w:val="19"/>
               </w:rPr>
-              <w:t>Diskon tercatat pada pesanannya, sehingga struk lama tetap menyebut potongan yang benar</w:t>
+              <w:t xml:space="preserve">Potongan tampil sebagai baris tersendiri berikut nama promonya, lalu nominal </w:t>
+            </w:r>
+            <w:r>
+              <w:rPr>
+                <w:b/>
+                <w:sz w:val="19"/>
+              </w:rPr>
+              <w:t>DIBAYAR</w:t>
             </w:r>
           </w:p>
         </w:tc>
@@ -10475,6 +10488,41 @@
               <w:rPr>
                 <w:sz w:val="19"/>
               </w:rPr>
+              <w:t>F-DS-08</w:t>
+            </w:r>
+          </w:p>
+        </w:tc>
+        <w:tc>
+          <w:tcPr>
+            <w:tcW w:type="dxa" w:w="4929"/>
+          </w:tcPr>
+          <w:p>
+            <w:pPr>
+              <w:spacing w:after="40" w:before="40"/>
+            </w:pPr>
+            <w:r>
+              <w:rPr>
+                <w:sz w:val="19"/>
+              </w:rPr>
+              <w:t>Diskon tercatat pada pesanannya, sehingga struk lama tetap menyebut potongan yang benar</w:t>
+            </w:r>
+          </w:p>
+        </w:tc>
+      </w:tr>
+      <w:tr>
+        <w:tc>
+          <w:tcPr>
+            <w:tcW w:type="dxa" w:w="4929"/>
+            <w:shd w:val="clear" w:fill="F4F5FB"/>
+          </w:tcPr>
+          <w:p>
+            <w:pPr>
+              <w:spacing w:after="40" w:before="40"/>
+            </w:pPr>
+            <w:r>
+              <w:rPr>
+                <w:sz w:val="19"/>
+              </w:rPr>
               <w:t>F-DS-09</w:t>
             </w:r>
           </w:p>
@@ -10482,6 +10530,7 @@
         <w:tc>
           <w:tcPr>
             <w:tcW w:type="dxa" w:w="4929"/>
+            <w:shd w:val="clear" w:fill="F4F5FB"/>
           </w:tcPr>
           <w:p>
             <w:pPr>
@@ -10652,6 +10701,89 @@
                 <w:sz w:val="19"/>
               </w:rPr>
               <w:t>Kalau dipotong per baris, diskon rupiah tetap terkalikan sebanyak menu yang ikut</w:t>
+            </w:r>
+          </w:p>
+        </w:tc>
+      </w:tr>
+      <w:tr>
+        <w:tc>
+          <w:tcPr>
+            <w:tcW w:type="dxa" w:w="4929"/>
+          </w:tcPr>
+          <w:p>
+            <w:pPr>
+              <w:spacing w:after="40" w:before="40"/>
+            </w:pPr>
+            <w:r>
+              <w:rPr>
+                <w:sz w:val="19"/>
+              </w:rPr>
+              <w:t xml:space="preserve">Syarat jumlah dihitung </w:t>
+            </w:r>
+            <w:r>
+              <w:rPr>
+                <w:b/>
+                <w:sz w:val="19"/>
+              </w:rPr>
+              <w:t>per menu</w:t>
+            </w:r>
+            <w:r>
+              <w:rPr>
+                <w:sz w:val="19"/>
+              </w:rPr>
+              <w:t>, bukan per keranjang</w:t>
+            </w:r>
+          </w:p>
+        </w:tc>
+        <w:tc>
+          <w:tcPr>
+            <w:tcW w:type="dxa" w:w="4929"/>
+          </w:tcPr>
+          <w:p>
+            <w:pPr>
+              <w:spacing w:after="40" w:before="40"/>
+            </w:pPr>
+            <w:r>
+              <w:rPr>
+                <w:sz w:val="19"/>
+              </w:rPr>
+              <w:t>Kalau dijumlahkan lintas menu, keranjang apa pun berisi dua barang lolos "beli 2" — bukan itu yang dijanjikan spanduknya</w:t>
+            </w:r>
+          </w:p>
+        </w:tc>
+      </w:tr>
+      <w:tr>
+        <w:tc>
+          <w:tcPr>
+            <w:tcW w:type="dxa" w:w="4929"/>
+            <w:shd w:val="clear" w:fill="F4F5FB"/>
+          </w:tcPr>
+          <w:p>
+            <w:pPr>
+              <w:spacing w:after="40" w:before="40"/>
+            </w:pPr>
+            <w:r>
+              <w:rPr>
+                <w:sz w:val="19"/>
+              </w:rPr>
+              <w:t>Menu yang belum memenuhi syarat jumlah tidak ikut dihitung, tapi tidak menggugurkan yang sudah</w:t>
+            </w:r>
+          </w:p>
+        </w:tc>
+        <w:tc>
+          <w:tcPr>
+            <w:tcW w:type="dxa" w:w="4929"/>
+            <w:shd w:val="clear" w:fill="F4F5FB"/>
+          </w:tcPr>
+          <w:p>
+            <w:pPr>
+              <w:spacing w:after="40" w:before="40"/>
+            </w:pPr>
+            <w:r>
+              <w:rPr>
+                <w:sz w:val="19"/>
+              </w:rPr>
+              <w:t>Satu menu yang kurang tidak membatalkan promo untuk menu lain yang sudah memenuhi</w:t>
             </w:r>
           </w:p>
         </w:tc>
@@ -17534,6 +17666,464 @@
     <w:p>
       <w:r>
         <w:rPr>
+          <w:sz w:val="21"/>
+        </w:rPr>
+        <w:t>Tamu memesan tanpa mendaftar apa pun. Yang dikorbankan cuma satu — jejak pesanannya hanya tersimpan di HP itu sendiri, dan hilang bersama aplikasinya kalau dihapus.</w:t>
+      </w:r>
+    </w:p>
+    <w:tbl>
+      <w:tblPr>
+        <w:tblStyle w:val="TableGrid"/>
+        <w:tblW w:type="auto" w:w="0"/>
+        <w:tblLayout w:type="autofit"/>
+        <w:tblLook w:firstColumn="1" w:firstRow="1" w:lastColumn="0" w:lastRow="0" w:noHBand="0" w:noVBand="1" w:val="04A0"/>
+      </w:tblPr>
+      <w:tblGrid>
+        <w:gridCol w:w="4929"/>
+        <w:gridCol w:w="4929"/>
+      </w:tblGrid>
+      <w:tr>
+        <w:trPr>
+          <w:tblHeader w:val="true"/>
+        </w:trPr>
+        <w:tc>
+          <w:tcPr>
+            <w:tcW w:type="dxa" w:w="4929"/>
+            <w:shd w:val="clear" w:fill="4F46E5"/>
+          </w:tcPr>
+          <w:p>
+            <w:pPr>
+              <w:spacing w:after="40" w:before="40"/>
+            </w:pPr>
+            <w:r>
+              <w:rPr>
+                <w:b/>
+                <w:color w:val="FFFFFF"/>
+                <w:sz w:val="19"/>
+              </w:rPr>
+              <w:t>Layar</w:t>
+            </w:r>
+          </w:p>
+        </w:tc>
+        <w:tc>
+          <w:tcPr>
+            <w:tcW w:type="dxa" w:w="4929"/>
+            <w:shd w:val="clear" w:fill="4F46E5"/>
+          </w:tcPr>
+          <w:p>
+            <w:pPr>
+              <w:spacing w:after="40" w:before="40"/>
+            </w:pPr>
+            <w:r>
+              <w:rPr>
+                <w:b/>
+                <w:color w:val="FFFFFF"/>
+                <w:sz w:val="19"/>
+              </w:rPr>
+              <w:t>Yang bisa dilakukan di sana</w:t>
+            </w:r>
+          </w:p>
+        </w:tc>
+      </w:tr>
+      <w:tr>
+        <w:tc>
+          <w:tcPr>
+            <w:tcW w:type="dxa" w:w="4929"/>
+          </w:tcPr>
+          <w:p>
+            <w:pPr>
+              <w:spacing w:after="40" w:before="40"/>
+            </w:pPr>
+            <w:r>
+              <w:rPr>
+                <w:b/>
+                <w:sz w:val="19"/>
+              </w:rPr>
+              <w:t>Halaman awal</w:t>
+            </w:r>
+          </w:p>
+        </w:tc>
+        <w:tc>
+          <w:tcPr>
+            <w:tcW w:type="dxa" w:w="4929"/>
+          </w:tcPr>
+          <w:p>
+            <w:pPr>
+              <w:spacing w:after="40" w:before="40"/>
+            </w:pPr>
+            <w:r>
+              <w:rPr>
+                <w:sz w:val="19"/>
+              </w:rPr>
+              <w:t>Memilih masuk sebagai Pelanggan atau Karyawan Resto; mengatur tema; membuka Tentang KaataGo</w:t>
+            </w:r>
+          </w:p>
+        </w:tc>
+      </w:tr>
+      <w:tr>
+        <w:tc>
+          <w:tcPr>
+            <w:tcW w:type="dxa" w:w="4929"/>
+            <w:shd w:val="clear" w:fill="F4F5FB"/>
+          </w:tcPr>
+          <w:p>
+            <w:pPr>
+              <w:spacing w:after="40" w:before="40"/>
+            </w:pPr>
+            <w:r>
+              <w:rPr>
+                <w:b/>
+                <w:sz w:val="19"/>
+              </w:rPr>
+              <w:t>Ajakan login</w:t>
+            </w:r>
+          </w:p>
+        </w:tc>
+        <w:tc>
+          <w:tcPr>
+            <w:tcW w:type="dxa" w:w="4929"/>
+            <w:shd w:val="clear" w:fill="F4F5FB"/>
+          </w:tcPr>
+          <w:p>
+            <w:pPr>
+              <w:spacing w:after="40" w:before="40"/>
+            </w:pPr>
+            <w:r>
+              <w:rPr>
+                <w:sz w:val="19"/>
+              </w:rPr>
+              <w:t>Melewatinya lewat "Lewati, Pesan Tanpa Login" dan langsung memesan</w:t>
+            </w:r>
+          </w:p>
+        </w:tc>
+      </w:tr>
+      <w:tr>
+        <w:tc>
+          <w:tcPr>
+            <w:tcW w:type="dxa" w:w="4929"/>
+          </w:tcPr>
+          <w:p>
+            <w:pPr>
+              <w:spacing w:after="40" w:before="40"/>
+            </w:pPr>
+            <w:r>
+              <w:rPr>
+                <w:b/>
+                <w:sz w:val="19"/>
+              </w:rPr>
+              <w:t>Layar pembuka tamu</w:t>
+            </w:r>
+          </w:p>
+        </w:tc>
+        <w:tc>
+          <w:tcPr>
+            <w:tcW w:type="dxa" w:w="4929"/>
+          </w:tcPr>
+          <w:p>
+            <w:pPr>
+              <w:spacing w:after="40" w:before="40"/>
+            </w:pPr>
+            <w:r>
+              <w:rPr>
+                <w:sz w:val="19"/>
+              </w:rPr>
+              <w:t>Tiga pintu saja: Scan QR Meja, Pilih Resto, dan Riwayat Pesanan Saya</w:t>
+            </w:r>
+          </w:p>
+        </w:tc>
+      </w:tr>
+      <w:tr>
+        <w:tc>
+          <w:tcPr>
+            <w:tcW w:type="dxa" w:w="4929"/>
+            <w:shd w:val="clear" w:fill="F4F5FB"/>
+          </w:tcPr>
+          <w:p>
+            <w:pPr>
+              <w:spacing w:after="40" w:before="40"/>
+            </w:pPr>
+            <w:r>
+              <w:rPr>
+                <w:b/>
+                <w:sz w:val="19"/>
+              </w:rPr>
+              <w:t>Pilih Resto</w:t>
+            </w:r>
+          </w:p>
+        </w:tc>
+        <w:tc>
+          <w:tcPr>
+            <w:tcW w:type="dxa" w:w="4929"/>
+            <w:shd w:val="clear" w:fill="F4F5FB"/>
+          </w:tcPr>
+          <w:p>
+            <w:pPr>
+              <w:spacing w:after="40" w:before="40"/>
+            </w:pPr>
+            <w:r>
+              <w:rPr>
+                <w:sz w:val="19"/>
+              </w:rPr>
+              <w:t>Mencari resto; melihat yang terdekat berikut jaraknya begitu izin lokasi diberikan — sebelum itu hanya bagian Semua Resto yang tampil</w:t>
+            </w:r>
+          </w:p>
+        </w:tc>
+      </w:tr>
+      <w:tr>
+        <w:tc>
+          <w:tcPr>
+            <w:tcW w:type="dxa" w:w="4929"/>
+          </w:tcPr>
+          <w:p>
+            <w:pPr>
+              <w:spacing w:after="40" w:before="40"/>
+            </w:pPr>
+            <w:r>
+              <w:rPr>
+                <w:b/>
+                <w:sz w:val="19"/>
+              </w:rPr>
+              <w:t>Menu resto</w:t>
+            </w:r>
+          </w:p>
+        </w:tc>
+        <w:tc>
+          <w:tcPr>
+            <w:tcW w:type="dxa" w:w="4929"/>
+          </w:tcPr>
+          <w:p>
+            <w:pPr>
+              <w:spacing w:after="40" w:before="40"/>
+            </w:pPr>
+            <w:r>
+              <w:rPr>
+                <w:sz w:val="19"/>
+              </w:rPr>
+              <w:t>Melihat banner promo, membuka kategori, menambah menu ke keranjang</w:t>
+            </w:r>
+          </w:p>
+        </w:tc>
+      </w:tr>
+      <w:tr>
+        <w:tc>
+          <w:tcPr>
+            <w:tcW w:type="dxa" w:w="4929"/>
+            <w:shd w:val="clear" w:fill="F4F5FB"/>
+          </w:tcPr>
+          <w:p>
+            <w:pPr>
+              <w:spacing w:after="40" w:before="40"/>
+            </w:pPr>
+            <w:r>
+              <w:rPr>
+                <w:b/>
+                <w:sz w:val="19"/>
+              </w:rPr>
+              <w:t>Dialog menu</w:t>
+            </w:r>
+          </w:p>
+        </w:tc>
+        <w:tc>
+          <w:tcPr>
+            <w:tcW w:type="dxa" w:w="4929"/>
+            <w:shd w:val="clear" w:fill="F4F5FB"/>
+          </w:tcPr>
+          <w:p>
+            <w:pPr>
+              <w:spacing w:after="40" w:before="40"/>
+            </w:pPr>
+            <w:r>
+              <w:rPr>
+                <w:sz w:val="19"/>
+              </w:rPr>
+              <w:t>Memilih level/varian — minuman bisa punya tiga kelompok sekaligus (Gula, Es, Ukuran) — menulis catatan, mengatur jumlah</w:t>
+            </w:r>
+          </w:p>
+        </w:tc>
+      </w:tr>
+      <w:tr>
+        <w:tc>
+          <w:tcPr>
+            <w:tcW w:type="dxa" w:w="4929"/>
+          </w:tcPr>
+          <w:p>
+            <w:pPr>
+              <w:spacing w:after="40" w:before="40"/>
+            </w:pPr>
+            <w:r>
+              <w:rPr>
+                <w:b/>
+                <w:sz w:val="19"/>
+              </w:rPr>
+              <w:t>Keranjang</w:t>
+            </w:r>
+          </w:p>
+        </w:tc>
+        <w:tc>
+          <w:tcPr>
+            <w:tcW w:type="dxa" w:w="4929"/>
+          </w:tcPr>
+          <w:p>
+            <w:pPr>
+              <w:spacing w:after="40" w:before="40"/>
+            </w:pPr>
+            <w:r>
+              <w:rPr>
+                <w:sz w:val="19"/>
+              </w:rPr>
+              <w:t>Memilih Dine In atau Take Away; Take Away tidak meminta nomor meja, tapi nama pemesan tetap wajib; memilih QRIS atau Tunai</w:t>
+            </w:r>
+          </w:p>
+        </w:tc>
+      </w:tr>
+      <w:tr>
+        <w:tc>
+          <w:tcPr>
+            <w:tcW w:type="dxa" w:w="4929"/>
+            <w:shd w:val="clear" w:fill="F4F5FB"/>
+          </w:tcPr>
+          <w:p>
+            <w:pPr>
+              <w:spacing w:after="40" w:before="40"/>
+            </w:pPr>
+            <w:r>
+              <w:rPr>
+                <w:b/>
+                <w:sz w:val="19"/>
+              </w:rPr>
+              <w:t>Bayar dengan QRIS</w:t>
+            </w:r>
+          </w:p>
+        </w:tc>
+        <w:tc>
+          <w:tcPr>
+            <w:tcW w:type="dxa" w:w="4929"/>
+            <w:shd w:val="clear" w:fill="F4F5FB"/>
+          </w:tcPr>
+          <w:p>
+            <w:pPr>
+              <w:spacing w:after="40" w:before="40"/>
+            </w:pPr>
+            <w:r>
+              <w:rPr>
+                <w:sz w:val="19"/>
+              </w:rPr>
+              <w:t>Memindai QR berbingkai KaataGo, melihat masa berlakunya, menyimpannya ke galeri</w:t>
+            </w:r>
+          </w:p>
+        </w:tc>
+      </w:tr>
+      <w:tr>
+        <w:tc>
+          <w:tcPr>
+            <w:tcW w:type="dxa" w:w="4929"/>
+          </w:tcPr>
+          <w:p>
+            <w:pPr>
+              <w:spacing w:after="40" w:before="40"/>
+            </w:pPr>
+            <w:r>
+              <w:rPr>
+                <w:b/>
+                <w:sz w:val="19"/>
+              </w:rPr>
+              <w:t>Pesanan diterima</w:t>
+            </w:r>
+          </w:p>
+        </w:tc>
+        <w:tc>
+          <w:tcPr>
+            <w:tcW w:type="dxa" w:w="4929"/>
+          </w:tcPr>
+          <w:p>
+            <w:pPr>
+              <w:spacing w:after="40" w:before="40"/>
+            </w:pPr>
+            <w:r>
+              <w:rPr>
+                <w:sz w:val="19"/>
+              </w:rPr>
+              <w:t>Membaca nomor pesanan untuk disebutkan di kasir, dan hitung mundur 30 menit sebelum pesanannya hangus</w:t>
+            </w:r>
+          </w:p>
+        </w:tc>
+      </w:tr>
+      <w:tr>
+        <w:tc>
+          <w:tcPr>
+            <w:tcW w:type="dxa" w:w="4929"/>
+            <w:shd w:val="clear" w:fill="F4F5FB"/>
+          </w:tcPr>
+          <w:p>
+            <w:pPr>
+              <w:spacing w:after="40" w:before="40"/>
+            </w:pPr>
+            <w:r>
+              <w:rPr>
+                <w:b/>
+                <w:sz w:val="19"/>
+              </w:rPr>
+              <w:t>Pesanan Saya</w:t>
+            </w:r>
+          </w:p>
+        </w:tc>
+        <w:tc>
+          <w:tcPr>
+            <w:tcW w:type="dxa" w:w="4929"/>
+            <w:shd w:val="clear" w:fill="F4F5FB"/>
+          </w:tcPr>
+          <w:p>
+            <w:pPr>
+              <w:spacing w:after="40" w:before="40"/>
+            </w:pPr>
+            <w:r>
+              <w:rPr>
+                <w:sz w:val="19"/>
+              </w:rPr>
+              <w:t>Memantau status dapur dan pembayaran untuk sesi meja yang sedang berjalan</w:t>
+            </w:r>
+          </w:p>
+        </w:tc>
+      </w:tr>
+      <w:tr>
+        <w:tc>
+          <w:tcPr>
+            <w:tcW w:type="dxa" w:w="4929"/>
+          </w:tcPr>
+          <w:p>
+            <w:pPr>
+              <w:spacing w:after="40" w:before="40"/>
+            </w:pPr>
+            <w:r>
+              <w:rPr>
+                <w:b/>
+                <w:sz w:val="19"/>
+              </w:rPr>
+              <w:t>Riwayat Saya</w:t>
+            </w:r>
+          </w:p>
+        </w:tc>
+        <w:tc>
+          <w:tcPr>
+            <w:tcW w:type="dxa" w:w="4929"/>
+          </w:tcPr>
+          <w:p>
+            <w:pPr>
+              <w:spacing w:after="40" w:before="40"/>
+            </w:pPr>
+            <w:r>
+              <w:rPr>
+                <w:sz w:val="19"/>
+              </w:rPr>
+              <w:t>Melihat pesanan sebelumnya — disertai peringatan bahwa riwayatnya hanya ada di HP ini</w:t>
+            </w:r>
+          </w:p>
+        </w:tc>
+      </w:tr>
+    </w:tbl>
+    <w:p>
+      <w:r>
+        <w:rPr>
           <w:b/>
           <w:sz w:val="21"/>
         </w:rPr>
@@ -22679,6 +23269,501 @@
     <w:p>
       <w:r>
         <w:rPr>
+          <w:sz w:val="21"/>
+        </w:rPr>
+        <w:t>Kasir memegang dua antrean sekaligus: pesanan yang dia ketik sendiri di meja kasir, dan pesanan yang dikirim pelanggan dari HP-nya lalu memilih bayar tunai. Keduanya bertemu di layar yang sama.</w:t>
+      </w:r>
+    </w:p>
+    <w:tbl>
+      <w:tblPr>
+        <w:tblStyle w:val="TableGrid"/>
+        <w:tblW w:type="auto" w:w="0"/>
+        <w:tblLayout w:type="autofit"/>
+        <w:tblLook w:firstColumn="1" w:firstRow="1" w:lastColumn="0" w:lastRow="0" w:noHBand="0" w:noVBand="1" w:val="04A0"/>
+      </w:tblPr>
+      <w:tblGrid>
+        <w:gridCol w:w="4929"/>
+        <w:gridCol w:w="4929"/>
+      </w:tblGrid>
+      <w:tr>
+        <w:trPr>
+          <w:tblHeader w:val="true"/>
+        </w:trPr>
+        <w:tc>
+          <w:tcPr>
+            <w:tcW w:type="dxa" w:w="4929"/>
+            <w:shd w:val="clear" w:fill="4F46E5"/>
+          </w:tcPr>
+          <w:p>
+            <w:pPr>
+              <w:spacing w:after="40" w:before="40"/>
+            </w:pPr>
+            <w:r>
+              <w:rPr>
+                <w:b/>
+                <w:color w:val="FFFFFF"/>
+                <w:sz w:val="19"/>
+              </w:rPr>
+              <w:t>Layar</w:t>
+            </w:r>
+          </w:p>
+        </w:tc>
+        <w:tc>
+          <w:tcPr>
+            <w:tcW w:type="dxa" w:w="4929"/>
+            <w:shd w:val="clear" w:fill="4F46E5"/>
+          </w:tcPr>
+          <w:p>
+            <w:pPr>
+              <w:spacing w:after="40" w:before="40"/>
+            </w:pPr>
+            <w:r>
+              <w:rPr>
+                <w:b/>
+                <w:color w:val="FFFFFF"/>
+                <w:sz w:val="19"/>
+              </w:rPr>
+              <w:t>Yang bisa dilakukan di sana</w:t>
+            </w:r>
+          </w:p>
+        </w:tc>
+      </w:tr>
+      <w:tr>
+        <w:tc>
+          <w:tcPr>
+            <w:tcW w:type="dxa" w:w="4929"/>
+          </w:tcPr>
+          <w:p>
+            <w:pPr>
+              <w:spacing w:after="40" w:before="40"/>
+            </w:pPr>
+            <w:r>
+              <w:rPr>
+                <w:b/>
+                <w:sz w:val="19"/>
+              </w:rPr>
+              <w:t>Menu kasir</w:t>
+            </w:r>
+          </w:p>
+        </w:tc>
+        <w:tc>
+          <w:tcPr>
+            <w:tcW w:type="dxa" w:w="4929"/>
+          </w:tcPr>
+          <w:p>
+            <w:pPr>
+              <w:spacing w:after="40" w:before="40"/>
+            </w:pPr>
+            <w:r>
+              <w:rPr>
+                <w:sz w:val="19"/>
+              </w:rPr>
+              <w:t>Tujuh pintu: Input Pesanan, Pending Payment (berikut jumlah yang menunggu), Riwayat Kasir, Saldo &amp; Pengeluaran, Setor Saldo Cash, Kotak Masuk, Diskon</w:t>
+            </w:r>
+          </w:p>
+        </w:tc>
+      </w:tr>
+      <w:tr>
+        <w:tc>
+          <w:tcPr>
+            <w:tcW w:type="dxa" w:w="4929"/>
+            <w:shd w:val="clear" w:fill="F4F5FB"/>
+          </w:tcPr>
+          <w:p>
+            <w:pPr>
+              <w:spacing w:after="40" w:before="40"/>
+            </w:pPr>
+            <w:r>
+              <w:rPr>
+                <w:b/>
+                <w:sz w:val="19"/>
+              </w:rPr>
+              <w:t>Input Pesanan</w:t>
+            </w:r>
+          </w:p>
+        </w:tc>
+        <w:tc>
+          <w:tcPr>
+            <w:tcW w:type="dxa" w:w="4929"/>
+            <w:shd w:val="clear" w:fill="F4F5FB"/>
+          </w:tcPr>
+          <w:p>
+            <w:pPr>
+              <w:spacing w:after="40" w:before="40"/>
+            </w:pPr>
+            <w:r>
+              <w:rPr>
+                <w:sz w:val="19"/>
+              </w:rPr>
+              <w:t>Memilih menu per kategori; sisa stok tampil di pojok kartu — angka yang tidak pernah dilihat pelanggan</w:t>
+            </w:r>
+          </w:p>
+        </w:tc>
+      </w:tr>
+      <w:tr>
+        <w:tc>
+          <w:tcPr>
+            <w:tcW w:type="dxa" w:w="4929"/>
+          </w:tcPr>
+          <w:p>
+            <w:pPr>
+              <w:spacing w:after="40" w:before="40"/>
+            </w:pPr>
+            <w:r>
+              <w:rPr>
+                <w:b/>
+                <w:sz w:val="19"/>
+              </w:rPr>
+              <w:t>Dialog menu</w:t>
+            </w:r>
+          </w:p>
+        </w:tc>
+        <w:tc>
+          <w:tcPr>
+            <w:tcW w:type="dxa" w:w="4929"/>
+          </w:tcPr>
+          <w:p>
+            <w:pPr>
+              <w:spacing w:after="40" w:before="40"/>
+            </w:pPr>
+            <w:r>
+              <w:rPr>
+                <w:sz w:val="19"/>
+              </w:rPr>
+              <w:t>Memilih level/varian, menulis catatan, mengatur jumlah; deskripsi dan sisa stok ikut terlihat</w:t>
+            </w:r>
+          </w:p>
+        </w:tc>
+      </w:tr>
+      <w:tr>
+        <w:tc>
+          <w:tcPr>
+            <w:tcW w:type="dxa" w:w="4929"/>
+            <w:shd w:val="clear" w:fill="F4F5FB"/>
+          </w:tcPr>
+          <w:p>
+            <w:pPr>
+              <w:spacing w:after="40" w:before="40"/>
+            </w:pPr>
+            <w:r>
+              <w:rPr>
+                <w:b/>
+                <w:sz w:val="19"/>
+              </w:rPr>
+              <w:t>Checkout</w:t>
+            </w:r>
+          </w:p>
+        </w:tc>
+        <w:tc>
+          <w:tcPr>
+            <w:tcW w:type="dxa" w:w="4929"/>
+            <w:shd w:val="clear" w:fill="F4F5FB"/>
+          </w:tcPr>
+          <w:p>
+            <w:pPr>
+              <w:spacing w:after="40" w:before="40"/>
+            </w:pPr>
+            <w:r>
+              <w:rPr>
+                <w:sz w:val="19"/>
+              </w:rPr>
+              <w:t>Memilih Dine In atau Take Away; Dine In meminta nomor meja, Take Away meminta nama pelanggan; tombol pembayaran mati sampai yang wajib terisi; diskon sudah terhitung dan menurunkan nominal DIBAYAR</w:t>
+            </w:r>
+          </w:p>
+        </w:tc>
+      </w:tr>
+      <w:tr>
+        <w:tc>
+          <w:tcPr>
+            <w:tcW w:type="dxa" w:w="4929"/>
+          </w:tcPr>
+          <w:p>
+            <w:pPr>
+              <w:spacing w:after="40" w:before="40"/>
+            </w:pPr>
+            <w:r>
+              <w:rPr>
+                <w:b/>
+                <w:sz w:val="19"/>
+              </w:rPr>
+              <w:t>Bayar QRIS di kasir</w:t>
+            </w:r>
+          </w:p>
+        </w:tc>
+        <w:tc>
+          <w:tcPr>
+            <w:tcW w:type="dxa" w:w="4929"/>
+          </w:tcPr>
+          <w:p>
+            <w:pPr>
+              <w:spacing w:after="40" w:before="40"/>
+            </w:pPr>
+            <w:r>
+              <w:rPr>
+                <w:sz w:val="19"/>
+              </w:rPr>
+              <w:t>Menampilkan QR berbingkai KaataGo, dan mencetak QR itu untuk diserahkan ke pelanggan</w:t>
+            </w:r>
+          </w:p>
+        </w:tc>
+      </w:tr>
+      <w:tr>
+        <w:tc>
+          <w:tcPr>
+            <w:tcW w:type="dxa" w:w="4929"/>
+            <w:shd w:val="clear" w:fill="F4F5FB"/>
+          </w:tcPr>
+          <w:p>
+            <w:pPr>
+              <w:spacing w:after="40" w:before="40"/>
+            </w:pPr>
+            <w:r>
+              <w:rPr>
+                <w:b/>
+                <w:sz w:val="19"/>
+              </w:rPr>
+              <w:t>Dialog pembayaran tunai</w:t>
+            </w:r>
+          </w:p>
+        </w:tc>
+        <w:tc>
+          <w:tcPr>
+            <w:tcW w:type="dxa" w:w="4929"/>
+            <w:shd w:val="clear" w:fill="F4F5FB"/>
+          </w:tcPr>
+          <w:p>
+            <w:pPr>
+              <w:spacing w:after="40" w:before="40"/>
+            </w:pPr>
+            <w:r>
+              <w:rPr>
+                <w:sz w:val="19"/>
+              </w:rPr>
+              <w:t>Memakai pilihan nominal cepat atau papan angka; kembalian dihitung sendiri; tombol terima mati selama uangnya kurang</w:t>
+            </w:r>
+          </w:p>
+        </w:tc>
+      </w:tr>
+      <w:tr>
+        <w:tc>
+          <w:tcPr>
+            <w:tcW w:type="dxa" w:w="4929"/>
+          </w:tcPr>
+          <w:p>
+            <w:pPr>
+              <w:spacing w:after="40" w:before="40"/>
+            </w:pPr>
+            <w:r>
+              <w:rPr>
+                <w:b/>
+                <w:sz w:val="19"/>
+              </w:rPr>
+              <w:t>Struk</w:t>
+            </w:r>
+          </w:p>
+        </w:tc>
+        <w:tc>
+          <w:tcPr>
+            <w:tcW w:type="dxa" w:w="4929"/>
+          </w:tcPr>
+          <w:p>
+            <w:pPr>
+              <w:spacing w:after="40" w:before="40"/>
+            </w:pPr>
+            <w:r>
+              <w:rPr>
+                <w:sz w:val="19"/>
+              </w:rPr>
+              <w:t>Mencetak struk lengkap berikut nama kasir, uang bayar, dan kembaliannya</w:t>
+            </w:r>
+          </w:p>
+        </w:tc>
+      </w:tr>
+      <w:tr>
+        <w:tc>
+          <w:tcPr>
+            <w:tcW w:type="dxa" w:w="4929"/>
+            <w:shd w:val="clear" w:fill="F4F5FB"/>
+          </w:tcPr>
+          <w:p>
+            <w:pPr>
+              <w:spacing w:after="40" w:before="40"/>
+            </w:pPr>
+            <w:r>
+              <w:rPr>
+                <w:b/>
+                <w:sz w:val="19"/>
+              </w:rPr>
+              <w:t>Pending Payment</w:t>
+            </w:r>
+          </w:p>
+        </w:tc>
+        <w:tc>
+          <w:tcPr>
+            <w:tcW w:type="dxa" w:w="4929"/>
+            <w:shd w:val="clear" w:fill="F4F5FB"/>
+          </w:tcPr>
+          <w:p>
+            <w:pPr>
+              <w:spacing w:after="40" w:before="40"/>
+            </w:pPr>
+            <w:r>
+              <w:rPr>
+                <w:sz w:val="19"/>
+              </w:rPr>
+              <w:t>Melihat pesanan pelanggan yang menunggu dibayar berikut sisa waktunya; membuka rinciannya; memilih cara terima pembayaran — Tunai, QRIS, atau Transfer — walau pelanggannya tadi memilih tunai</w:t>
+            </w:r>
+          </w:p>
+        </w:tc>
+      </w:tr>
+      <w:tr>
+        <w:tc>
+          <w:tcPr>
+            <w:tcW w:type="dxa" w:w="4929"/>
+          </w:tcPr>
+          <w:p>
+            <w:pPr>
+              <w:spacing w:after="40" w:before="40"/>
+            </w:pPr>
+            <w:r>
+              <w:rPr>
+                <w:b/>
+                <w:sz w:val="19"/>
+              </w:rPr>
+              <w:t>Riwayat Kasir</w:t>
+            </w:r>
+          </w:p>
+        </w:tc>
+        <w:tc>
+          <w:tcPr>
+            <w:tcW w:type="dxa" w:w="4929"/>
+          </w:tcPr>
+          <w:p>
+            <w:pPr>
+              <w:spacing w:after="40" w:before="40"/>
+            </w:pPr>
+            <w:r>
+              <w:rPr>
+                <w:sz w:val="19"/>
+              </w:rPr>
+              <w:t>Rekap per hari berikut rincian per cara bayar, dan mencetak ulang struk</w:t>
+            </w:r>
+          </w:p>
+        </w:tc>
+      </w:tr>
+      <w:tr>
+        <w:tc>
+          <w:tcPr>
+            <w:tcW w:type="dxa" w:w="4929"/>
+            <w:shd w:val="clear" w:fill="F4F5FB"/>
+          </w:tcPr>
+          <w:p>
+            <w:pPr>
+              <w:spacing w:after="40" w:before="40"/>
+            </w:pPr>
+            <w:r>
+              <w:rPr>
+                <w:b/>
+                <w:sz w:val="19"/>
+              </w:rPr>
+              <w:t>Saldo &amp; Pengeluaran</w:t>
+            </w:r>
+          </w:p>
+        </w:tc>
+        <w:tc>
+          <w:tcPr>
+            <w:tcW w:type="dxa" w:w="4929"/>
+            <w:shd w:val="clear" w:fill="F4F5FB"/>
+          </w:tcPr>
+          <w:p>
+            <w:pPr>
+              <w:spacing w:after="40" w:before="40"/>
+            </w:pPr>
+            <w:r>
+              <w:rPr>
+                <w:sz w:val="19"/>
+              </w:rPr>
+              <w:t>Melihat saldo total, cash dan non-cash, petty cash, dan rekening resto; mengajukan Top Up Petty Cash yang menunggu persetujuan Finance</w:t>
+            </w:r>
+          </w:p>
+        </w:tc>
+      </w:tr>
+      <w:tr>
+        <w:tc>
+          <w:tcPr>
+            <w:tcW w:type="dxa" w:w="4929"/>
+          </w:tcPr>
+          <w:p>
+            <w:pPr>
+              <w:spacing w:after="40" w:before="40"/>
+            </w:pPr>
+            <w:r>
+              <w:rPr>
+                <w:b/>
+                <w:sz w:val="19"/>
+              </w:rPr>
+              <w:t>Setor Saldo Cash</w:t>
+            </w:r>
+          </w:p>
+        </w:tc>
+        <w:tc>
+          <w:tcPr>
+            <w:tcW w:type="dxa" w:w="4929"/>
+          </w:tcPr>
+          <w:p>
+            <w:pPr>
+              <w:spacing w:after="40" w:before="40"/>
+            </w:pPr>
+            <w:r>
+              <w:rPr>
+                <w:sz w:val="19"/>
+              </w:rPr>
+              <w:t>Melihat tunai di laci berikut rinciannya; mengisi formulir setoran dengan rekening tujuan yang terisi sendiri dari Pengaturan Pembayaran, dan melampirkan buktinya</w:t>
+            </w:r>
+          </w:p>
+        </w:tc>
+      </w:tr>
+      <w:tr>
+        <w:tc>
+          <w:tcPr>
+            <w:tcW w:type="dxa" w:w="4929"/>
+            <w:shd w:val="clear" w:fill="F4F5FB"/>
+          </w:tcPr>
+          <w:p>
+            <w:pPr>
+              <w:spacing w:after="40" w:before="40"/>
+            </w:pPr>
+            <w:r>
+              <w:rPr>
+                <w:b/>
+                <w:sz w:val="19"/>
+              </w:rPr>
+              <w:t>Diskon</w:t>
+            </w:r>
+          </w:p>
+        </w:tc>
+        <w:tc>
+          <w:tcPr>
+            <w:tcW w:type="dxa" w:w="4929"/>
+            <w:shd w:val="clear" w:fill="F4F5FB"/>
+          </w:tcPr>
+          <w:p>
+            <w:pPr>
+              <w:spacing w:after="40" w:before="40"/>
+            </w:pPr>
+            <w:r>
+              <w:rPr>
+                <w:sz w:val="19"/>
+              </w:rPr>
+              <w:t>Membuat dan mengubah promo — per menu, bundling, atau minimum belanja — berikut syarat jumlah dan masa berlakunya</w:t>
+            </w:r>
+          </w:p>
+        </w:tc>
+      </w:tr>
+    </w:tbl>
+    <w:p>
+      <w:r>
+        <w:rPr>
           <w:b/>
           <w:sz w:val="21"/>
         </w:rPr>
@@ -26228,6 +27313,248 @@
     <w:p>
       <w:r>
         <w:rPr>
+          <w:sz w:val="21"/>
+        </w:rPr>
+        <w:t>Layar dapur hanya empat tab, dan urutannya adalah urutan hidup sebuah pesanan. Yang belum dibayar berhenti di tab pertama dan tidak pernah sampai ke antrean masak — bahan tidak terpakai untuk pesanan yang uangnya belum tentu datang.</w:t>
+      </w:r>
+    </w:p>
+    <w:tbl>
+      <w:tblPr>
+        <w:tblStyle w:val="TableGrid"/>
+        <w:tblW w:type="auto" w:w="0"/>
+        <w:tblLayout w:type="autofit"/>
+        <w:tblLook w:firstColumn="1" w:firstRow="1" w:lastColumn="0" w:lastRow="0" w:noHBand="0" w:noVBand="1" w:val="04A0"/>
+      </w:tblPr>
+      <w:tblGrid>
+        <w:gridCol w:w="4929"/>
+        <w:gridCol w:w="4929"/>
+      </w:tblGrid>
+      <w:tr>
+        <w:trPr>
+          <w:tblHeader w:val="true"/>
+        </w:trPr>
+        <w:tc>
+          <w:tcPr>
+            <w:tcW w:type="dxa" w:w="4929"/>
+            <w:shd w:val="clear" w:fill="4F46E5"/>
+          </w:tcPr>
+          <w:p>
+            <w:pPr>
+              <w:spacing w:after="40" w:before="40"/>
+            </w:pPr>
+            <w:r>
+              <w:rPr>
+                <w:b/>
+                <w:color w:val="FFFFFF"/>
+                <w:sz w:val="19"/>
+              </w:rPr>
+              <w:t>Layar</w:t>
+            </w:r>
+          </w:p>
+        </w:tc>
+        <w:tc>
+          <w:tcPr>
+            <w:tcW w:type="dxa" w:w="4929"/>
+            <w:shd w:val="clear" w:fill="4F46E5"/>
+          </w:tcPr>
+          <w:p>
+            <w:pPr>
+              <w:spacing w:after="40" w:before="40"/>
+            </w:pPr>
+            <w:r>
+              <w:rPr>
+                <w:b/>
+                <w:color w:val="FFFFFF"/>
+                <w:sz w:val="19"/>
+              </w:rPr>
+              <w:t>Yang bisa dilakukan di sana</w:t>
+            </w:r>
+          </w:p>
+        </w:tc>
+      </w:tr>
+      <w:tr>
+        <w:tc>
+          <w:tcPr>
+            <w:tcW w:type="dxa" w:w="4929"/>
+          </w:tcPr>
+          <w:p>
+            <w:pPr>
+              <w:spacing w:after="40" w:before="40"/>
+            </w:pPr>
+            <w:r>
+              <w:rPr>
+                <w:b/>
+                <w:sz w:val="19"/>
+              </w:rPr>
+              <w:t>Tab Menunggu Bayar</w:t>
+            </w:r>
+          </w:p>
+        </w:tc>
+        <w:tc>
+          <w:tcPr>
+            <w:tcW w:type="dxa" w:w="4929"/>
+          </w:tcPr>
+          <w:p>
+            <w:pPr>
+              <w:spacing w:after="40" w:before="40"/>
+            </w:pPr>
+            <w:r>
+              <w:rPr>
+                <w:sz w:val="19"/>
+              </w:rPr>
+              <w:t>Melihat pesanan yang belum dilunasi; sengaja tanpa tombol masak</w:t>
+            </w:r>
+          </w:p>
+        </w:tc>
+      </w:tr>
+      <w:tr>
+        <w:tc>
+          <w:tcPr>
+            <w:tcW w:type="dxa" w:w="4929"/>
+            <w:shd w:val="clear" w:fill="F4F5FB"/>
+          </w:tcPr>
+          <w:p>
+            <w:pPr>
+              <w:spacing w:after="40" w:before="40"/>
+            </w:pPr>
+            <w:r>
+              <w:rPr>
+                <w:b/>
+                <w:sz w:val="19"/>
+              </w:rPr>
+              <w:t>Tab Baru</w:t>
+            </w:r>
+          </w:p>
+        </w:tc>
+        <w:tc>
+          <w:tcPr>
+            <w:tcW w:type="dxa" w:w="4929"/>
+            <w:shd w:val="clear" w:fill="F4F5FB"/>
+          </w:tcPr>
+          <w:p>
+            <w:pPr>
+              <w:spacing w:after="40" w:before="40"/>
+            </w:pPr>
+            <w:r>
+              <w:rPr>
+                <w:sz w:val="19"/>
+              </w:rPr>
+              <w:t>Melihat pesanan siap dimasak, dikelompokkan Dine In dan Take Away; menekan Mulai Masak</w:t>
+            </w:r>
+          </w:p>
+        </w:tc>
+      </w:tr>
+      <w:tr>
+        <w:tc>
+          <w:tcPr>
+            <w:tcW w:type="dxa" w:w="4929"/>
+          </w:tcPr>
+          <w:p>
+            <w:pPr>
+              <w:spacing w:after="40" w:before="40"/>
+            </w:pPr>
+            <w:r>
+              <w:rPr>
+                <w:b/>
+                <w:sz w:val="19"/>
+              </w:rPr>
+              <w:t>Tab Diproses</w:t>
+            </w:r>
+          </w:p>
+        </w:tc>
+        <w:tc>
+          <w:tcPr>
+            <w:tcW w:type="dxa" w:w="4929"/>
+          </w:tcPr>
+          <w:p>
+            <w:pPr>
+              <w:spacing w:after="40" w:before="40"/>
+            </w:pPr>
+            <w:r>
+              <w:rPr>
+                <w:sz w:val="19"/>
+              </w:rPr>
+              <w:t>Membuka daftar centang per menu; menyimpan progres sebagian, atau menutup pesanan begitu seluruh menunya tercentang</w:t>
+            </w:r>
+          </w:p>
+        </w:tc>
+      </w:tr>
+      <w:tr>
+        <w:tc>
+          <w:tcPr>
+            <w:tcW w:type="dxa" w:w="4929"/>
+            <w:shd w:val="clear" w:fill="F4F5FB"/>
+          </w:tcPr>
+          <w:p>
+            <w:pPr>
+              <w:spacing w:after="40" w:before="40"/>
+            </w:pPr>
+            <w:r>
+              <w:rPr>
+                <w:b/>
+                <w:sz w:val="19"/>
+              </w:rPr>
+              <w:t>Tab Selesai</w:t>
+            </w:r>
+          </w:p>
+        </w:tc>
+        <w:tc>
+          <w:tcPr>
+            <w:tcW w:type="dxa" w:w="4929"/>
+            <w:shd w:val="clear" w:fill="F4F5FB"/>
+          </w:tcPr>
+          <w:p>
+            <w:pPr>
+              <w:spacing w:after="40" w:before="40"/>
+            </w:pPr>
+            <w:r>
+              <w:rPr>
+                <w:sz w:val="19"/>
+              </w:rPr>
+              <w:t>Melihat pesanan yang sudah beres, dikelompokkan per tanggal dan tertutup secara bawaan</w:t>
+            </w:r>
+          </w:p>
+        </w:tc>
+      </w:tr>
+      <w:tr>
+        <w:tc>
+          <w:tcPr>
+            <w:tcW w:type="dxa" w:w="4929"/>
+          </w:tcPr>
+          <w:p>
+            <w:pPr>
+              <w:spacing w:after="40" w:before="40"/>
+            </w:pPr>
+            <w:r>
+              <w:rPr>
+                <w:b/>
+                <w:sz w:val="19"/>
+              </w:rPr>
+              <w:t>Pemilih tema</w:t>
+            </w:r>
+          </w:p>
+        </w:tc>
+        <w:tc>
+          <w:tcPr>
+            <w:tcW w:type="dxa" w:w="4929"/>
+          </w:tcPr>
+          <w:p>
+            <w:pPr>
+              <w:spacing w:after="40" w:before="40"/>
+            </w:pPr>
+            <w:r>
+              <w:rPr>
+                <w:sz w:val="19"/>
+              </w:rPr>
+              <w:t>Berganti terang, gelap, atau ikut setelan HP langsung dari layar dapur</w:t>
+            </w:r>
+          </w:p>
+        </w:tc>
+      </w:tr>
+    </w:tbl>
+    <w:p>
+      <w:r>
+        <w:rPr>
           <w:b/>
           <w:sz w:val="21"/>
         </w:rPr>
@@ -27478,6 +28805,573 @@
     <w:p>
       <w:r>
         <w:rPr>
+          <w:sz w:val="21"/>
+        </w:rPr>
+        <w:t>Admin mengurus isi restonya — menu, harga, banner, QR meja — dan ikut memegang antrean pembayaran bersama kasir. Yang tidak dia pegang adalah angka akuntansinya: Info Pembayaran dan Mapping GL milik Finance.</w:t>
+      </w:r>
+    </w:p>
+    <w:tbl>
+      <w:tblPr>
+        <w:tblStyle w:val="TableGrid"/>
+        <w:tblW w:type="auto" w:w="0"/>
+        <w:tblLayout w:type="autofit"/>
+        <w:tblLook w:firstColumn="1" w:firstRow="1" w:lastColumn="0" w:lastRow="0" w:noHBand="0" w:noVBand="1" w:val="04A0"/>
+      </w:tblPr>
+      <w:tblGrid>
+        <w:gridCol w:w="4929"/>
+        <w:gridCol w:w="4929"/>
+      </w:tblGrid>
+      <w:tr>
+        <w:trPr>
+          <w:tblHeader w:val="true"/>
+        </w:trPr>
+        <w:tc>
+          <w:tcPr>
+            <w:tcW w:type="dxa" w:w="4929"/>
+            <w:shd w:val="clear" w:fill="4F46E5"/>
+          </w:tcPr>
+          <w:p>
+            <w:pPr>
+              <w:spacing w:after="40" w:before="40"/>
+            </w:pPr>
+            <w:r>
+              <w:rPr>
+                <w:b/>
+                <w:color w:val="FFFFFF"/>
+                <w:sz w:val="19"/>
+              </w:rPr>
+              <w:t>Layar</w:t>
+            </w:r>
+          </w:p>
+        </w:tc>
+        <w:tc>
+          <w:tcPr>
+            <w:tcW w:type="dxa" w:w="4929"/>
+            <w:shd w:val="clear" w:fill="4F46E5"/>
+          </w:tcPr>
+          <w:p>
+            <w:pPr>
+              <w:spacing w:after="40" w:before="40"/>
+            </w:pPr>
+            <w:r>
+              <w:rPr>
+                <w:b/>
+                <w:color w:val="FFFFFF"/>
+                <w:sz w:val="19"/>
+              </w:rPr>
+              <w:t>Yang bisa dilakukan di sana</w:t>
+            </w:r>
+          </w:p>
+        </w:tc>
+      </w:tr>
+      <w:tr>
+        <w:tc>
+          <w:tcPr>
+            <w:tcW w:type="dxa" w:w="4929"/>
+          </w:tcPr>
+          <w:p>
+            <w:pPr>
+              <w:spacing w:after="40" w:before="40"/>
+            </w:pPr>
+            <w:r>
+              <w:rPr>
+                <w:b/>
+                <w:sz w:val="19"/>
+              </w:rPr>
+              <w:t>Menu admin</w:t>
+            </w:r>
+          </w:p>
+        </w:tc>
+        <w:tc>
+          <w:tcPr>
+            <w:tcW w:type="dxa" w:w="4929"/>
+          </w:tcPr>
+          <w:p>
+            <w:pPr>
+              <w:spacing w:after="40" w:before="40"/>
+            </w:pPr>
+            <w:r>
+              <w:rPr>
+                <w:sz w:val="19"/>
+              </w:rPr>
+              <w:t>Kasir, Kelola Produk, Pesanan Masuk, Pending Payment, Riwayat Kasir, Pengaturan, Saldo, Kirim Pengumuman, Diskon</w:t>
+            </w:r>
+          </w:p>
+        </w:tc>
+      </w:tr>
+      <w:tr>
+        <w:tc>
+          <w:tcPr>
+            <w:tcW w:type="dxa" w:w="4929"/>
+            <w:shd w:val="clear" w:fill="F4F5FB"/>
+          </w:tcPr>
+          <w:p>
+            <w:pPr>
+              <w:spacing w:after="40" w:before="40"/>
+            </w:pPr>
+            <w:r>
+              <w:rPr>
+                <w:b/>
+                <w:sz w:val="19"/>
+              </w:rPr>
+              <w:t>Kelola Produk — tab Produk</w:t>
+            </w:r>
+          </w:p>
+        </w:tc>
+        <w:tc>
+          <w:tcPr>
+            <w:tcW w:type="dxa" w:w="4929"/>
+            <w:shd w:val="clear" w:fill="F4F5FB"/>
+          </w:tcPr>
+          <w:p>
+            <w:pPr>
+              <w:spacing w:after="40" w:before="40"/>
+            </w:pPr>
+            <w:r>
+              <w:rPr>
+                <w:sz w:val="19"/>
+              </w:rPr>
+              <w:t>Menambah dan mengubah menu; menandai habis lewat saklar di barisnya, tanpa membuka formulirnya</w:t>
+            </w:r>
+          </w:p>
+        </w:tc>
+      </w:tr>
+      <w:tr>
+        <w:tc>
+          <w:tcPr>
+            <w:tcW w:type="dxa" w:w="4929"/>
+          </w:tcPr>
+          <w:p>
+            <w:pPr>
+              <w:spacing w:after="40" w:before="40"/>
+            </w:pPr>
+            <w:r>
+              <w:rPr>
+                <w:b/>
+                <w:sz w:val="19"/>
+              </w:rPr>
+              <w:t>Tab Kategori</w:t>
+            </w:r>
+          </w:p>
+        </w:tc>
+        <w:tc>
+          <w:tcPr>
+            <w:tcW w:type="dxa" w:w="4929"/>
+          </w:tcPr>
+          <w:p>
+            <w:pPr>
+              <w:spacing w:after="40" w:before="40"/>
+            </w:pPr>
+            <w:r>
+              <w:rPr>
+                <w:sz w:val="19"/>
+              </w:rPr>
+              <w:t>Menyusun kategori menu</w:t>
+            </w:r>
+          </w:p>
+        </w:tc>
+      </w:tr>
+      <w:tr>
+        <w:tc>
+          <w:tcPr>
+            <w:tcW w:type="dxa" w:w="4929"/>
+            <w:shd w:val="clear" w:fill="F4F5FB"/>
+          </w:tcPr>
+          <w:p>
+            <w:pPr>
+              <w:spacing w:after="40" w:before="40"/>
+            </w:pPr>
+            <w:r>
+              <w:rPr>
+                <w:b/>
+                <w:sz w:val="19"/>
+              </w:rPr>
+              <w:t>Tab Level</w:t>
+            </w:r>
+          </w:p>
+        </w:tc>
+        <w:tc>
+          <w:tcPr>
+            <w:tcW w:type="dxa" w:w="4929"/>
+            <w:shd w:val="clear" w:fill="F4F5FB"/>
+          </w:tcPr>
+          <w:p>
+            <w:pPr>
+              <w:spacing w:after="40" w:before="40"/>
+            </w:pPr>
+            <w:r>
+              <w:rPr>
+                <w:sz w:val="19"/>
+              </w:rPr>
+              <w:t>Mengubah dan menambah kelompok varian milik resto ini — lima kelompok bawaan sudah terisi</w:t>
+            </w:r>
+          </w:p>
+        </w:tc>
+      </w:tr>
+      <w:tr>
+        <w:tc>
+          <w:tcPr>
+            <w:tcW w:type="dxa" w:w="4929"/>
+          </w:tcPr>
+          <w:p>
+            <w:pPr>
+              <w:spacing w:after="40" w:before="40"/>
+            </w:pPr>
+            <w:r>
+              <w:rPr>
+                <w:b/>
+                <w:sz w:val="19"/>
+              </w:rPr>
+              <w:t>Pesanan Masuk</w:t>
+            </w:r>
+          </w:p>
+        </w:tc>
+        <w:tc>
+          <w:tcPr>
+            <w:tcW w:type="dxa" w:w="4929"/>
+          </w:tcPr>
+          <w:p>
+            <w:pPr>
+              <w:spacing w:after="40" w:before="40"/>
+            </w:pPr>
+            <w:r>
+              <w:rPr>
+                <w:sz w:val="19"/>
+              </w:rPr>
+              <w:t>Melihat seluruh pesanan resto berikut status bayar dan status dapurnya</w:t>
+            </w:r>
+          </w:p>
+        </w:tc>
+      </w:tr>
+      <w:tr>
+        <w:tc>
+          <w:tcPr>
+            <w:tcW w:type="dxa" w:w="4929"/>
+            <w:shd w:val="clear" w:fill="F4F5FB"/>
+          </w:tcPr>
+          <w:p>
+            <w:pPr>
+              <w:spacing w:after="40" w:before="40"/>
+            </w:pPr>
+            <w:r>
+              <w:rPr>
+                <w:b/>
+                <w:sz w:val="19"/>
+              </w:rPr>
+              <w:t>Pending Payment</w:t>
+            </w:r>
+          </w:p>
+        </w:tc>
+        <w:tc>
+          <w:tcPr>
+            <w:tcW w:type="dxa" w:w="4929"/>
+            <w:shd w:val="clear" w:fill="F4F5FB"/>
+          </w:tcPr>
+          <w:p>
+            <w:pPr>
+              <w:spacing w:after="40" w:before="40"/>
+            </w:pPr>
+            <w:r>
+              <w:rPr>
+                <w:sz w:val="19"/>
+              </w:rPr>
+              <w:t>Antrean yang sama dengan kasir: menerima pembayaran Tunai, QRIS, atau Transfer; QR-nya bisa dicetak untuk pelanggan</w:t>
+            </w:r>
+          </w:p>
+        </w:tc>
+      </w:tr>
+      <w:tr>
+        <w:tc>
+          <w:tcPr>
+            <w:tcW w:type="dxa" w:w="4929"/>
+          </w:tcPr>
+          <w:p>
+            <w:pPr>
+              <w:spacing w:after="40" w:before="40"/>
+            </w:pPr>
+            <w:r>
+              <w:rPr>
+                <w:b/>
+                <w:sz w:val="19"/>
+              </w:rPr>
+              <w:t>Pengaturan → Info Resto</w:t>
+            </w:r>
+          </w:p>
+        </w:tc>
+        <w:tc>
+          <w:tcPr>
+            <w:tcW w:type="dxa" w:w="4929"/>
+          </w:tcPr>
+          <w:p>
+            <w:pPr>
+              <w:spacing w:after="40" w:before="40"/>
+            </w:pPr>
+            <w:r>
+              <w:rPr>
+                <w:sz w:val="19"/>
+              </w:rPr>
+              <w:t>Mengubah nama dan alamat; menggeser pin di pratinjau peta; memilih cara makan yang dilayani — Dine In, Take Away, atau keduanya</w:t>
+            </w:r>
+          </w:p>
+        </w:tc>
+      </w:tr>
+      <w:tr>
+        <w:tc>
+          <w:tcPr>
+            <w:tcW w:type="dxa" w:w="4929"/>
+            <w:shd w:val="clear" w:fill="F4F5FB"/>
+          </w:tcPr>
+          <w:p>
+            <w:pPr>
+              <w:spacing w:after="40" w:before="40"/>
+            </w:pPr>
+            <w:r>
+              <w:rPr>
+                <w:b/>
+                <w:sz w:val="19"/>
+              </w:rPr>
+              <w:t>Pengaturan → Banner Promo</w:t>
+            </w:r>
+          </w:p>
+        </w:tc>
+        <w:tc>
+          <w:tcPr>
+            <w:tcW w:type="dxa" w:w="4929"/>
+            <w:shd w:val="clear" w:fill="F4F5FB"/>
+          </w:tcPr>
+          <w:p>
+            <w:pPr>
+              <w:spacing w:after="40" w:before="40"/>
+            </w:pPr>
+            <w:r>
+              <w:rPr>
+                <w:sz w:val="19"/>
+              </w:rPr>
+              <w:t>Menambah dan mengubah banner berikut gambar, judul, keterangan, urutan tampil, masa berlaku, dan saklar aktif</w:t>
+            </w:r>
+          </w:p>
+        </w:tc>
+      </w:tr>
+      <w:tr>
+        <w:tc>
+          <w:tcPr>
+            <w:tcW w:type="dxa" w:w="4929"/>
+          </w:tcPr>
+          <w:p>
+            <w:pPr>
+              <w:spacing w:after="40" w:before="40"/>
+            </w:pPr>
+            <w:r>
+              <w:rPr>
+                <w:b/>
+                <w:sz w:val="19"/>
+              </w:rPr>
+              <w:t>Pengaturan → QR Meja</w:t>
+            </w:r>
+          </w:p>
+        </w:tc>
+        <w:tc>
+          <w:tcPr>
+            <w:tcW w:type="dxa" w:w="4929"/>
+          </w:tcPr>
+          <w:p>
+            <w:pPr>
+              <w:spacing w:after="40" w:before="40"/>
+            </w:pPr>
+            <w:r>
+              <w:rPr>
+                <w:sz w:val="19"/>
+              </w:rPr>
+              <w:t>Membuat kartu QR satu meja dengan pratinjau langsung, atau sekaligus banyak meja lalu Download Semua</w:t>
+            </w:r>
+          </w:p>
+        </w:tc>
+      </w:tr>
+      <w:tr>
+        <w:tc>
+          <w:tcPr>
+            <w:tcW w:type="dxa" w:w="4929"/>
+            <w:shd w:val="clear" w:fill="F4F5FB"/>
+          </w:tcPr>
+          <w:p>
+            <w:pPr>
+              <w:spacing w:after="40" w:before="40"/>
+            </w:pPr>
+            <w:r>
+              <w:rPr>
+                <w:b/>
+                <w:sz w:val="19"/>
+              </w:rPr>
+              <w:t>Pengaturan → Info Pembayaran</w:t>
+            </w:r>
+          </w:p>
+        </w:tc>
+        <w:tc>
+          <w:tcPr>
+            <w:tcW w:type="dxa" w:w="4929"/>
+            <w:shd w:val="clear" w:fill="F4F5FB"/>
+          </w:tcPr>
+          <w:p>
+            <w:pPr>
+              <w:spacing w:after="40" w:before="40"/>
+            </w:pPr>
+            <w:r>
+              <w:rPr>
+                <w:sz w:val="19"/>
+              </w:rPr>
+              <w:t>Melihat saja — yang mengubahnya Finance atau Owner</w:t>
+            </w:r>
+          </w:p>
+        </w:tc>
+      </w:tr>
+      <w:tr>
+        <w:tc>
+          <w:tcPr>
+            <w:tcW w:type="dxa" w:w="4929"/>
+          </w:tcPr>
+          <w:p>
+            <w:pPr>
+              <w:spacing w:after="40" w:before="40"/>
+            </w:pPr>
+            <w:r>
+              <w:rPr>
+                <w:b/>
+                <w:sz w:val="19"/>
+              </w:rPr>
+              <w:t>Saldo &amp; Pengeluaran</w:t>
+            </w:r>
+          </w:p>
+        </w:tc>
+        <w:tc>
+          <w:tcPr>
+            <w:tcW w:type="dxa" w:w="4929"/>
+          </w:tcPr>
+          <w:p>
+            <w:pPr>
+              <w:spacing w:after="40" w:before="40"/>
+            </w:pPr>
+            <w:r>
+              <w:rPr>
+                <w:sz w:val="19"/>
+              </w:rPr>
+              <w:t>Melihat saldo dan petty cash; pengajuan yang menunggu persetujuan Finance ikut terlihat berikut penandanya</w:t>
+            </w:r>
+          </w:p>
+        </w:tc>
+      </w:tr>
+      <w:tr>
+        <w:tc>
+          <w:tcPr>
+            <w:tcW w:type="dxa" w:w="4929"/>
+            <w:shd w:val="clear" w:fill="F4F5FB"/>
+          </w:tcPr>
+          <w:p>
+            <w:pPr>
+              <w:spacing w:after="40" w:before="40"/>
+            </w:pPr>
+            <w:r>
+              <w:rPr>
+                <w:b/>
+                <w:sz w:val="19"/>
+              </w:rPr>
+              <w:t>Setor Saldo Cash</w:t>
+            </w:r>
+          </w:p>
+        </w:tc>
+        <w:tc>
+          <w:tcPr>
+            <w:tcW w:type="dxa" w:w="4929"/>
+            <w:shd w:val="clear" w:fill="F4F5FB"/>
+          </w:tcPr>
+          <w:p>
+            <w:pPr>
+              <w:spacing w:after="40" w:before="40"/>
+            </w:pPr>
+            <w:r>
+              <w:rPr>
+                <w:sz w:val="19"/>
+              </w:rPr>
+              <w:t>Melihat setoran yang sudah dikonfirmasi maupun yang masih menunggu approval</w:t>
+            </w:r>
+          </w:p>
+        </w:tc>
+      </w:tr>
+      <w:tr>
+        <w:tc>
+          <w:tcPr>
+            <w:tcW w:type="dxa" w:w="4929"/>
+          </w:tcPr>
+          <w:p>
+            <w:pPr>
+              <w:spacing w:after="40" w:before="40"/>
+            </w:pPr>
+            <w:r>
+              <w:rPr>
+                <w:b/>
+                <w:sz w:val="19"/>
+              </w:rPr>
+              <w:t>Kirim Pengumuman</w:t>
+            </w:r>
+          </w:p>
+        </w:tc>
+        <w:tc>
+          <w:tcPr>
+            <w:tcW w:type="dxa" w:w="4929"/>
+          </w:tcPr>
+          <w:p>
+            <w:pPr>
+              <w:spacing w:after="40" w:before="40"/>
+            </w:pPr>
+            <w:r>
+              <w:rPr>
+                <w:sz w:val="19"/>
+              </w:rPr>
+              <w:t>Menulis pengumuman dan memilih sasarannya: Karyawan, Customer, atau Semua</w:t>
+            </w:r>
+          </w:p>
+        </w:tc>
+      </w:tr>
+      <w:tr>
+        <w:tc>
+          <w:tcPr>
+            <w:tcW w:type="dxa" w:w="4929"/>
+            <w:shd w:val="clear" w:fill="F4F5FB"/>
+          </w:tcPr>
+          <w:p>
+            <w:pPr>
+              <w:spacing w:after="40" w:before="40"/>
+            </w:pPr>
+            <w:r>
+              <w:rPr>
+                <w:b/>
+                <w:sz w:val="19"/>
+              </w:rPr>
+              <w:t>Diskon</w:t>
+            </w:r>
+          </w:p>
+        </w:tc>
+        <w:tc>
+          <w:tcPr>
+            <w:tcW w:type="dxa" w:w="4929"/>
+            <w:shd w:val="clear" w:fill="F4F5FB"/>
+          </w:tcPr>
+          <w:p>
+            <w:pPr>
+              <w:spacing w:after="40" w:before="40"/>
+            </w:pPr>
+            <w:r>
+              <w:rPr>
+                <w:sz w:val="19"/>
+              </w:rPr>
+              <w:t>Membuat promo per menu, bundling beberapa menu sekaligus, atau minimum belanja; menetapkan syarat jumlah, bentuk potongan, dan masa berlakunya</w:t>
+            </w:r>
+          </w:p>
+        </w:tc>
+      </w:tr>
+    </w:tbl>
+    <w:p>
+      <w:r>
+        <w:rPr>
           <w:b/>
           <w:sz w:val="21"/>
         </w:rPr>
@@ -30483,6 +32377,429 @@
     <w:p>
       <w:r>
         <w:rPr>
+          <w:sz w:val="21"/>
+        </w:rPr>
+        <w:t>Finance tidak menyentuh pesanan sama sekali. Yang dia pegang adalah dua titik tempat uang berpindah tangan — setoran tunai ke rekening dan top up petty cash — dan keduanya sengaja dibuat menunggu persetujuannya. Selama menunggu, uangnya duduk di akun suspense: sudah tidak ada di laci, tapi belum diakui masuk.</w:t>
+      </w:r>
+    </w:p>
+    <w:tbl>
+      <w:tblPr>
+        <w:tblStyle w:val="TableGrid"/>
+        <w:tblW w:type="auto" w:w="0"/>
+        <w:tblLayout w:type="autofit"/>
+        <w:tblLook w:firstColumn="1" w:firstRow="1" w:lastColumn="0" w:lastRow="0" w:noHBand="0" w:noVBand="1" w:val="04A0"/>
+      </w:tblPr>
+      <w:tblGrid>
+        <w:gridCol w:w="4929"/>
+        <w:gridCol w:w="4929"/>
+      </w:tblGrid>
+      <w:tr>
+        <w:trPr>
+          <w:tblHeader w:val="true"/>
+        </w:trPr>
+        <w:tc>
+          <w:tcPr>
+            <w:tcW w:type="dxa" w:w="4929"/>
+            <w:shd w:val="clear" w:fill="4F46E5"/>
+          </w:tcPr>
+          <w:p>
+            <w:pPr>
+              <w:spacing w:after="40" w:before="40"/>
+            </w:pPr>
+            <w:r>
+              <w:rPr>
+                <w:b/>
+                <w:color w:val="FFFFFF"/>
+                <w:sz w:val="19"/>
+              </w:rPr>
+              <w:t>Layar</w:t>
+            </w:r>
+          </w:p>
+        </w:tc>
+        <w:tc>
+          <w:tcPr>
+            <w:tcW w:type="dxa" w:w="4929"/>
+            <w:shd w:val="clear" w:fill="4F46E5"/>
+          </w:tcPr>
+          <w:p>
+            <w:pPr>
+              <w:spacing w:after="40" w:before="40"/>
+            </w:pPr>
+            <w:r>
+              <w:rPr>
+                <w:b/>
+                <w:color w:val="FFFFFF"/>
+                <w:sz w:val="19"/>
+              </w:rPr>
+              <w:t>Yang bisa dilakukan di sana</w:t>
+            </w:r>
+          </w:p>
+        </w:tc>
+      </w:tr>
+      <w:tr>
+        <w:tc>
+          <w:tcPr>
+            <w:tcW w:type="dxa" w:w="4929"/>
+          </w:tcPr>
+          <w:p>
+            <w:pPr>
+              <w:spacing w:after="40" w:before="40"/>
+            </w:pPr>
+            <w:r>
+              <w:rPr>
+                <w:b/>
+                <w:sz w:val="19"/>
+              </w:rPr>
+              <w:t>Menu Finance</w:t>
+            </w:r>
+          </w:p>
+        </w:tc>
+        <w:tc>
+          <w:tcPr>
+            <w:tcW w:type="dxa" w:w="4929"/>
+          </w:tcPr>
+          <w:p>
+            <w:pPr>
+              <w:spacing w:after="40" w:before="40"/>
+            </w:pPr>
+            <w:r>
+              <w:rPr>
+                <w:sz w:val="19"/>
+              </w:rPr>
+              <w:t>Berpindah resto lewat pemilih di atas — semua angka mengikutinya; penanda merah menunjukkan menu yang sedang menunggu persetujuan</w:t>
+            </w:r>
+          </w:p>
+        </w:tc>
+      </w:tr>
+      <w:tr>
+        <w:tc>
+          <w:tcPr>
+            <w:tcW w:type="dxa" w:w="4929"/>
+            <w:shd w:val="clear" w:fill="F4F5FB"/>
+          </w:tcPr>
+          <w:p>
+            <w:pPr>
+              <w:spacing w:after="40" w:before="40"/>
+            </w:pPr>
+            <w:r>
+              <w:rPr>
+                <w:b/>
+                <w:sz w:val="19"/>
+              </w:rPr>
+              <w:t>Pemasukan</w:t>
+            </w:r>
+          </w:p>
+        </w:tc>
+        <w:tc>
+          <w:tcPr>
+            <w:tcW w:type="dxa" w:w="4929"/>
+            <w:shd w:val="clear" w:fill="F4F5FB"/>
+          </w:tcPr>
+          <w:p>
+            <w:pPr>
+              <w:spacing w:after="40" w:before="40"/>
+            </w:pPr>
+            <w:r>
+              <w:rPr>
+                <w:sz w:val="19"/>
+              </w:rPr>
+              <w:t>Melihat total semua waktu, dirinci per hari dengan pecahan Tunai/QRIS/Transfer</w:t>
+            </w:r>
+          </w:p>
+        </w:tc>
+      </w:tr>
+      <w:tr>
+        <w:tc>
+          <w:tcPr>
+            <w:tcW w:type="dxa" w:w="4929"/>
+          </w:tcPr>
+          <w:p>
+            <w:pPr>
+              <w:spacing w:after="40" w:before="40"/>
+            </w:pPr>
+            <w:r>
+              <w:rPr>
+                <w:b/>
+                <w:sz w:val="19"/>
+              </w:rPr>
+              <w:t>Saldo &amp; Pengeluaran</w:t>
+            </w:r>
+          </w:p>
+        </w:tc>
+        <w:tc>
+          <w:tcPr>
+            <w:tcW w:type="dxa" w:w="4929"/>
+          </w:tcPr>
+          <w:p>
+            <w:pPr>
+              <w:spacing w:after="40" w:before="40"/>
+            </w:pPr>
+            <w:r>
+              <w:rPr>
+                <w:sz w:val="19"/>
+              </w:rPr>
+              <w:t>Melihat saldo total dan pecahan Cash/Non Cash; menyetujui atau menolak top up petty cash; mencatat pengeluaran; melipat bagian Petty Cash dan Riwayat Pengeluaran</w:t>
+            </w:r>
+          </w:p>
+        </w:tc>
+      </w:tr>
+      <w:tr>
+        <w:tc>
+          <w:tcPr>
+            <w:tcW w:type="dxa" w:w="4929"/>
+            <w:shd w:val="clear" w:fill="F4F5FB"/>
+          </w:tcPr>
+          <w:p>
+            <w:pPr>
+              <w:spacing w:after="40" w:before="40"/>
+            </w:pPr>
+            <w:r>
+              <w:rPr>
+                <w:b/>
+                <w:sz w:val="19"/>
+              </w:rPr>
+              <w:t>Dialog persetujuan</w:t>
+            </w:r>
+          </w:p>
+        </w:tc>
+        <w:tc>
+          <w:tcPr>
+            <w:tcW w:type="dxa" w:w="4929"/>
+            <w:shd w:val="clear" w:fill="F4F5FB"/>
+          </w:tcPr>
+          <w:p>
+            <w:pPr>
+              <w:spacing w:after="40" w:before="40"/>
+            </w:pPr>
+            <w:r>
+              <w:rPr>
+                <w:sz w:val="19"/>
+              </w:rPr>
+              <w:t>Membaca perpindahan yang akan terjadi — dari GL Suspense ke GL tujuannya — sebelum menyetujui, dan menambahkan catatan</w:t>
+            </w:r>
+          </w:p>
+        </w:tc>
+      </w:tr>
+      <w:tr>
+        <w:tc>
+          <w:tcPr>
+            <w:tcW w:type="dxa" w:w="4929"/>
+          </w:tcPr>
+          <w:p>
+            <w:pPr>
+              <w:spacing w:after="40" w:before="40"/>
+            </w:pPr>
+            <w:r>
+              <w:rPr>
+                <w:b/>
+                <w:sz w:val="19"/>
+              </w:rPr>
+              <w:t>Setor Saldo Cash</w:t>
+            </w:r>
+          </w:p>
+        </w:tc>
+        <w:tc>
+          <w:tcPr>
+            <w:tcW w:type="dxa" w:w="4929"/>
+          </w:tcPr>
+          <w:p>
+            <w:pPr>
+              <w:spacing w:after="40" w:before="40"/>
+            </w:pPr>
+            <w:r>
+              <w:rPr>
+                <w:sz w:val="19"/>
+              </w:rPr>
+              <w:t>Melihat tunai di laci berikut rinciannya; mengonfirmasi atau menolak setoran kasir setelah mencocokkan nominalnya di rekening</w:t>
+            </w:r>
+          </w:p>
+        </w:tc>
+      </w:tr>
+      <w:tr>
+        <w:tc>
+          <w:tcPr>
+            <w:tcW w:type="dxa" w:w="4929"/>
+            <w:shd w:val="clear" w:fill="F4F5FB"/>
+          </w:tcPr>
+          <w:p>
+            <w:pPr>
+              <w:spacing w:after="40" w:before="40"/>
+            </w:pPr>
+            <w:r>
+              <w:rPr>
+                <w:b/>
+                <w:sz w:val="19"/>
+              </w:rPr>
+              <w:t>Mapping GL Account</w:t>
+            </w:r>
+          </w:p>
+        </w:tc>
+        <w:tc>
+          <w:tcPr>
+            <w:tcW w:type="dxa" w:w="4929"/>
+            <w:shd w:val="clear" w:fill="F4F5FB"/>
+          </w:tcPr>
+          <w:p>
+            <w:pPr>
+              <w:spacing w:after="40" w:before="40"/>
+            </w:pPr>
+            <w:r>
+              <w:rPr>
+                <w:sz w:val="19"/>
+              </w:rPr>
+              <w:t>Menetapkan nomor akun untuk tiap cara bayar, petty cash, pajak, service, total saldo, suspense, gateway, dan diskon; mengatur tarif PPN dan biaya service</w:t>
+            </w:r>
+          </w:p>
+        </w:tc>
+      </w:tr>
+      <w:tr>
+        <w:tc>
+          <w:tcPr>
+            <w:tcW w:type="dxa" w:w="4929"/>
+          </w:tcPr>
+          <w:p>
+            <w:pPr>
+              <w:spacing w:after="40" w:before="40"/>
+            </w:pPr>
+            <w:r>
+              <w:rPr>
+                <w:b/>
+                <w:sz w:val="19"/>
+              </w:rPr>
+              <w:t>Pencairan Gateway</w:t>
+            </w:r>
+          </w:p>
+        </w:tc>
+        <w:tc>
+          <w:tcPr>
+            <w:tcW w:type="dxa" w:w="4929"/>
+          </w:tcPr>
+          <w:p>
+            <w:pPr>
+              <w:spacing w:after="40" w:before="40"/>
+            </w:pPr>
+            <w:r>
+              <w:rPr>
+                <w:sz w:val="19"/>
+              </w:rPr>
+              <w:t>Mencatat dana penyedia pembayaran yang masuk rekening berikut potongan MDR-nya</w:t>
+            </w:r>
+          </w:p>
+        </w:tc>
+      </w:tr>
+      <w:tr>
+        <w:tc>
+          <w:tcPr>
+            <w:tcW w:type="dxa" w:w="4929"/>
+            <w:shd w:val="clear" w:fill="F4F5FB"/>
+          </w:tcPr>
+          <w:p>
+            <w:pPr>
+              <w:spacing w:after="40" w:before="40"/>
+            </w:pPr>
+            <w:r>
+              <w:rPr>
+                <w:b/>
+                <w:sz w:val="19"/>
+              </w:rPr>
+              <w:t>Jurnal GL</w:t>
+            </w:r>
+          </w:p>
+        </w:tc>
+        <w:tc>
+          <w:tcPr>
+            <w:tcW w:type="dxa" w:w="4929"/>
+            <w:shd w:val="clear" w:fill="F4F5FB"/>
+          </w:tcPr>
+          <w:p>
+            <w:pPr>
+              <w:spacing w:after="40" w:before="40"/>
+            </w:pPr>
+            <w:r>
+              <w:rPr>
+                <w:sz w:val="19"/>
+              </w:rPr>
+              <w:t>Membaca jejak audit tiap pergerakan: nomor akun, arah debit/kredit, referensi pesanan, dan pelepasan titipan suspense saat sesuatu disetujui; mencetak atau mengekspornya</w:t>
+            </w:r>
+          </w:p>
+        </w:tc>
+      </w:tr>
+      <w:tr>
+        <w:tc>
+          <w:tcPr>
+            <w:tcW w:type="dxa" w:w="4929"/>
+          </w:tcPr>
+          <w:p>
+            <w:pPr>
+              <w:spacing w:after="40" w:before="40"/>
+            </w:pPr>
+            <w:r>
+              <w:rPr>
+                <w:b/>
+                <w:sz w:val="19"/>
+              </w:rPr>
+              <w:t>Laporan Transaksi</w:t>
+            </w:r>
+          </w:p>
+        </w:tc>
+        <w:tc>
+          <w:tcPr>
+            <w:tcW w:type="dxa" w:w="4929"/>
+          </w:tcPr>
+          <w:p>
+            <w:pPr>
+              <w:spacing w:after="40" w:before="40"/>
+            </w:pPr>
+            <w:r>
+              <w:rPr>
+                <w:sz w:val="19"/>
+              </w:rPr>
+              <w:t>Memilih rentang tanggal, melihat saldo awal dan akhir, mengekspor PDF</w:t>
+            </w:r>
+          </w:p>
+        </w:tc>
+      </w:tr>
+      <w:tr>
+        <w:tc>
+          <w:tcPr>
+            <w:tcW w:type="dxa" w:w="4929"/>
+            <w:shd w:val="clear" w:fill="F4F5FB"/>
+          </w:tcPr>
+          <w:p>
+            <w:pPr>
+              <w:spacing w:after="40" w:before="40"/>
+            </w:pPr>
+            <w:r>
+              <w:rPr>
+                <w:b/>
+                <w:sz w:val="19"/>
+              </w:rPr>
+              <w:t>Pengaturan Pembayaran</w:t>
+            </w:r>
+          </w:p>
+        </w:tc>
+        <w:tc>
+          <w:tcPr>
+            <w:tcW w:type="dxa" w:w="4929"/>
+            <w:shd w:val="clear" w:fill="F4F5FB"/>
+          </w:tcPr>
+          <w:p>
+            <w:pPr>
+              <w:spacing w:after="40" w:before="40"/>
+            </w:pPr>
+            <w:r>
+              <w:rPr>
+                <w:sz w:val="19"/>
+              </w:rPr>
+              <w:t>Melihat data QRIS dan rekening transfer resto</w:t>
+            </w:r>
+          </w:p>
+        </w:tc>
+      </w:tr>
+    </w:tbl>
+    <w:p>
+      <w:r>
+        <w:rPr>
           <w:b/>
           <w:sz w:val="21"/>
         </w:rPr>
@@ -32482,6 +34799,213 @@
         <w:t>A.7 Owner</w:t>
       </w:r>
     </w:p>
+    <w:p>
+      <w:r>
+        <w:rPr>
+          <w:sz w:val="21"/>
+        </w:rPr>
+        <w:t>Owner tidak punya layar khusus miliknya sendiri. Yang dia punya adalah seluruhnya: tiap layar kasir, dapur, admin, dan Finance terbuka untuknya tanpa perlu ditambahkan peran satu per satu. Menunya karena itu dikelompokkan tiga — dan pengelompokan itulah yang membedakan tampilannya dari peran lain.</w:t>
+      </w:r>
+    </w:p>
+    <w:tbl>
+      <w:tblPr>
+        <w:tblStyle w:val="TableGrid"/>
+        <w:tblW w:type="auto" w:w="0"/>
+        <w:tblLayout w:type="autofit"/>
+        <w:tblLook w:firstColumn="1" w:firstRow="1" w:lastColumn="0" w:lastRow="0" w:noHBand="0" w:noVBand="1" w:val="04A0"/>
+      </w:tblPr>
+      <w:tblGrid>
+        <w:gridCol w:w="4929"/>
+        <w:gridCol w:w="4929"/>
+      </w:tblGrid>
+      <w:tr>
+        <w:trPr>
+          <w:tblHeader w:val="true"/>
+        </w:trPr>
+        <w:tc>
+          <w:tcPr>
+            <w:tcW w:type="dxa" w:w="4929"/>
+            <w:shd w:val="clear" w:fill="4F46E5"/>
+          </w:tcPr>
+          <w:p>
+            <w:pPr>
+              <w:spacing w:after="40" w:before="40"/>
+            </w:pPr>
+            <w:r>
+              <w:rPr>
+                <w:b/>
+                <w:color w:val="FFFFFF"/>
+                <w:sz w:val="19"/>
+              </w:rPr>
+              <w:t>Layar</w:t>
+            </w:r>
+          </w:p>
+        </w:tc>
+        <w:tc>
+          <w:tcPr>
+            <w:tcW w:type="dxa" w:w="4929"/>
+            <w:shd w:val="clear" w:fill="4F46E5"/>
+          </w:tcPr>
+          <w:p>
+            <w:pPr>
+              <w:spacing w:after="40" w:before="40"/>
+            </w:pPr>
+            <w:r>
+              <w:rPr>
+                <w:b/>
+                <w:color w:val="FFFFFF"/>
+                <w:sz w:val="19"/>
+              </w:rPr>
+              <w:t>Yang bisa dilakukan di sana</w:t>
+            </w:r>
+          </w:p>
+        </w:tc>
+      </w:tr>
+      <w:tr>
+        <w:tc>
+          <w:tcPr>
+            <w:tcW w:type="dxa" w:w="4929"/>
+          </w:tcPr>
+          <w:p>
+            <w:pPr>
+              <w:spacing w:after="40" w:before="40"/>
+            </w:pPr>
+            <w:r>
+              <w:rPr>
+                <w:b/>
+                <w:sz w:val="19"/>
+              </w:rPr>
+              <w:t>Pemilih resto</w:t>
+            </w:r>
+          </w:p>
+        </w:tc>
+        <w:tc>
+          <w:tcPr>
+            <w:tcW w:type="dxa" w:w="4929"/>
+          </w:tcPr>
+          <w:p>
+            <w:pPr>
+              <w:spacing w:after="40" w:before="40"/>
+            </w:pPr>
+            <w:r>
+              <w:rPr>
+                <w:sz w:val="19"/>
+              </w:rPr>
+              <w:t>Berpindah antar resto yang dimilikinya; seluruh isi menu mengikuti yang dipilih</w:t>
+            </w:r>
+          </w:p>
+        </w:tc>
+      </w:tr>
+      <w:tr>
+        <w:tc>
+          <w:tcPr>
+            <w:tcW w:type="dxa" w:w="4929"/>
+            <w:shd w:val="clear" w:fill="F4F5FB"/>
+          </w:tcPr>
+          <w:p>
+            <w:pPr>
+              <w:spacing w:after="40" w:before="40"/>
+            </w:pPr>
+            <w:r>
+              <w:rPr>
+                <w:b/>
+                <w:sz w:val="19"/>
+              </w:rPr>
+              <w:t>Kelompok PENJUALAN</w:t>
+            </w:r>
+          </w:p>
+        </w:tc>
+        <w:tc>
+          <w:tcPr>
+            <w:tcW w:type="dxa" w:w="4929"/>
+            <w:shd w:val="clear" w:fill="F4F5FB"/>
+          </w:tcPr>
+          <w:p>
+            <w:pPr>
+              <w:spacing w:after="40" w:before="40"/>
+            </w:pPr>
+            <w:r>
+              <w:rPr>
+                <w:sz w:val="19"/>
+              </w:rPr>
+              <w:t>Kasir/Input Pesanan, Pesanan Masuk, Layar Dapur, Pending Payment, Riwayat Kasir</w:t>
+            </w:r>
+          </w:p>
+        </w:tc>
+      </w:tr>
+      <w:tr>
+        <w:tc>
+          <w:tcPr>
+            <w:tcW w:type="dxa" w:w="4929"/>
+          </w:tcPr>
+          <w:p>
+            <w:pPr>
+              <w:spacing w:after="40" w:before="40"/>
+            </w:pPr>
+            <w:r>
+              <w:rPr>
+                <w:b/>
+                <w:sz w:val="19"/>
+              </w:rPr>
+              <w:t>Kelompok KEUANGAN</w:t>
+            </w:r>
+          </w:p>
+        </w:tc>
+        <w:tc>
+          <w:tcPr>
+            <w:tcW w:type="dxa" w:w="4929"/>
+          </w:tcPr>
+          <w:p>
+            <w:pPr>
+              <w:spacing w:after="40" w:before="40"/>
+            </w:pPr>
+            <w:r>
+              <w:rPr>
+                <w:sz w:val="19"/>
+              </w:rPr>
+              <w:t>Pemasukan, Saldo &amp; Pengeluaran, Setor Saldo Cash, Mapping GL Account, Pencairan Gateway, Jurnal GL — sama persis dengan yang dipegang Finance, termasuk hak menyetujui</w:t>
+            </w:r>
+          </w:p>
+        </w:tc>
+      </w:tr>
+      <w:tr>
+        <w:tc>
+          <w:tcPr>
+            <w:tcW w:type="dxa" w:w="4929"/>
+            <w:shd w:val="clear" w:fill="F4F5FB"/>
+          </w:tcPr>
+          <w:p>
+            <w:pPr>
+              <w:spacing w:after="40" w:before="40"/>
+            </w:pPr>
+            <w:r>
+              <w:rPr>
+                <w:b/>
+                <w:sz w:val="19"/>
+              </w:rPr>
+              <w:t>Kelompok PENGELOLAAN</w:t>
+            </w:r>
+          </w:p>
+        </w:tc>
+        <w:tc>
+          <w:tcPr>
+            <w:tcW w:type="dxa" w:w="4929"/>
+            <w:shd w:val="clear" w:fill="F4F5FB"/>
+          </w:tcPr>
+          <w:p>
+            <w:pPr>
+              <w:spacing w:after="40" w:before="40"/>
+            </w:pPr>
+            <w:r>
+              <w:rPr>
+                <w:sz w:val="19"/>
+              </w:rPr>
+              <w:t>Kelola Produk, Pengaturan (termasuk mengubah Info Pembayaran), Kirim Pengumuman, Kotak Masuk berikut jumlah belum dibaca, Diskon, dan Keluar</w:t>
+            </w:r>
+          </w:p>
+        </w:tc>
+      </w:tr>
+    </w:tbl>
     <w:p>
       <w:r>
         <w:rPr>

</xml_diff>

<commit_message>
Diskon: syarat jumlah menempel di tiap menu, dan bundling harus lengkap
Satu angka untuk seluruh promo terlalu longgar: "Nasi Goreng + Es Teh,
beli 2" berlaku untuk keranjang berisi dua Nasi Goreng dan segelas kopi.
Paket yang dijanjikan spanduknya tidak pernah benar-benar dibeli, tapi
restonya tetap membayar potongannya.

Tiap menu sekarang membawa syaratnya sendiri — Minimal atau Tepat — dan
seluruhnya harus terpenuhi. 'Tepat' untuk paket yang isinya sudah pasti:
tiga ayam bukan lagi paket "2 ayam + 1 nasi".

Promo lama dipindahkan apa adanya, termasuk yang memakai min_qty dari
1.45.3.

Co-Authored-By: Claude Opus 5 <noreply@anthropic.com>
</commit_message>
<xml_diff>
--- a/docs/FSD-KAATAGO.docx
+++ b/docs/FSD-KAATAGO.docx
@@ -10208,20 +10208,129 @@
               <w:rPr>
                 <w:sz w:val="19"/>
               </w:rPr>
-              <w:t xml:space="preserve">Diskon berbasis menu dapat mensyaratkan </w:t>
+              <w:t xml:space="preserve">Tiap menu dalam promo membawa </w:t>
             </w:r>
             <w:r>
               <w:rPr>
                 <w:b/>
                 <w:sz w:val="19"/>
               </w:rPr>
-              <w:t>jumlah minimum pembelian</w:t>
-            </w:r>
-            <w:r>
-              <w:rPr>
-                <w:sz w:val="19"/>
-              </w:rPr>
-              <w:t xml:space="preserve"> — "beli 2 lebih murah"; bawaannya 1</w:t>
+              <w:t>syarat jumlahnya sendiri</w:t>
+            </w:r>
+            <w:r>
+              <w:rPr>
+                <w:sz w:val="19"/>
+              </w:rPr>
+              <w:t>, bukan satu angka untuk seluruh promo</w:t>
+            </w:r>
+          </w:p>
+        </w:tc>
+      </w:tr>
+      <w:tr>
+        <w:tc>
+          <w:tcPr>
+            <w:tcW w:type="dxa" w:w="4929"/>
+            <w:shd w:val="clear" w:fill="F4F5FB"/>
+          </w:tcPr>
+          <w:p>
+            <w:pPr>
+              <w:spacing w:after="40" w:before="40"/>
+            </w:pPr>
+            <w:r>
+              <w:rPr>
+                <w:sz w:val="19"/>
+              </w:rPr>
+              <w:t>F-DS-11</w:t>
+            </w:r>
+          </w:p>
+        </w:tc>
+        <w:tc>
+          <w:tcPr>
+            <w:tcW w:type="dxa" w:w="4929"/>
+            <w:shd w:val="clear" w:fill="F4F5FB"/>
+          </w:tcPr>
+          <w:p>
+            <w:pPr>
+              <w:spacing w:after="40" w:before="40"/>
+            </w:pPr>
+            <w:r>
+              <w:rPr>
+                <w:sz w:val="19"/>
+              </w:rPr>
+              <w:t xml:space="preserve">Syarat jumlah berbentuk </w:t>
+            </w:r>
+            <w:r>
+              <w:rPr>
+                <w:b/>
+                <w:sz w:val="19"/>
+              </w:rPr>
+              <w:t>Minimal</w:t>
+            </w:r>
+            <w:r>
+              <w:rPr>
+                <w:sz w:val="19"/>
+              </w:rPr>
+              <w:t xml:space="preserve"> (lebih banyak tetap dapat) atau </w:t>
+            </w:r>
+            <w:r>
+              <w:rPr>
+                <w:b/>
+                <w:sz w:val="19"/>
+              </w:rPr>
+              <w:t>Tepat</w:t>
+            </w:r>
+            <w:r>
+              <w:rPr>
+                <w:sz w:val="19"/>
+              </w:rPr>
+              <w:t xml:space="preserve"> (kurang maupun lebih tidak dapat)</w:t>
+            </w:r>
+          </w:p>
+        </w:tc>
+      </w:tr>
+      <w:tr>
+        <w:tc>
+          <w:tcPr>
+            <w:tcW w:type="dxa" w:w="4929"/>
+          </w:tcPr>
+          <w:p>
+            <w:pPr>
+              <w:spacing w:after="40" w:before="40"/>
+            </w:pPr>
+            <w:r>
+              <w:rPr>
+                <w:sz w:val="19"/>
+              </w:rPr>
+              <w:t>F-DS-12</w:t>
+            </w:r>
+          </w:p>
+        </w:tc>
+        <w:tc>
+          <w:tcPr>
+            <w:tcW w:type="dxa" w:w="4929"/>
+          </w:tcPr>
+          <w:p>
+            <w:pPr>
+              <w:spacing w:after="40" w:before="40"/>
+            </w:pPr>
+            <w:r>
+              <w:rPr>
+                <w:sz w:val="19"/>
+              </w:rPr>
+              <w:t xml:space="preserve">Pada bundling, </w:t>
+            </w:r>
+            <w:r>
+              <w:rPr>
+                <w:b/>
+                <w:sz w:val="19"/>
+              </w:rPr>
+              <w:t>seluruh</w:t>
+            </w:r>
+            <w:r>
+              <w:rPr>
+                <w:sz w:val="19"/>
+              </w:rPr>
+              <w:t xml:space="preserve"> menu yang disebut harus terpenuhi — kurang satu berarti promonya tidak berlaku sama sekali</w:t>
             </w:r>
           </w:p>
         </w:tc>
@@ -10718,36 +10827,36 @@
               <w:rPr>
                 <w:sz w:val="19"/>
               </w:rPr>
-              <w:t xml:space="preserve">Syarat jumlah dihitung </w:t>
+              <w:t xml:space="preserve">Syarat jumlah menempel di </w:t>
             </w:r>
             <w:r>
               <w:rPr>
                 <w:b/>
                 <w:sz w:val="19"/>
               </w:rPr>
-              <w:t>per menu</w:t>
-            </w:r>
-            <w:r>
-              <w:rPr>
-                <w:sz w:val="19"/>
-              </w:rPr>
-              <w:t>, bukan per keranjang</w:t>
-            </w:r>
-          </w:p>
-        </w:tc>
-        <w:tc>
-          <w:tcPr>
-            <w:tcW w:type="dxa" w:w="4929"/>
-          </w:tcPr>
-          <w:p>
-            <w:pPr>
-              <w:spacing w:after="40" w:before="40"/>
-            </w:pPr>
-            <w:r>
-              <w:rPr>
-                <w:sz w:val="19"/>
-              </w:rPr>
-              <w:t>Kalau dijumlahkan lintas menu, keranjang apa pun berisi dua barang lolos "beli 2" — bukan itu yang dijanjikan spanduknya</w:t>
+              <w:t>menunya</w:t>
+            </w:r>
+            <w:r>
+              <w:rPr>
+                <w:sz w:val="19"/>
+              </w:rPr>
+              <w:t>, bukan di promonya</w:t>
+            </w:r>
+          </w:p>
+        </w:tc>
+        <w:tc>
+          <w:tcPr>
+            <w:tcW w:type="dxa" w:w="4929"/>
+          </w:tcPr>
+          <w:p>
+            <w:pPr>
+              <w:spacing w:after="40" w:before="40"/>
+            </w:pPr>
+            <w:r>
+              <w:rPr>
+                <w:sz w:val="19"/>
+              </w:rPr>
+              <w:t>Satu angka untuk seluruh promo membuat "Nasi Goreng + Es Teh, beli 2" lolos oleh keranjang berisi dua Nasi Goreng dan segelas kopi</w:t>
             </w:r>
           </w:p>
         </w:tc>
@@ -10766,7 +10875,20 @@
               <w:rPr>
                 <w:sz w:val="19"/>
               </w:rPr>
-              <w:t>Menu yang belum memenuhi syarat jumlah tidak ikut dihitung, tapi tidak menggugurkan yang sudah</w:t>
+              <w:t xml:space="preserve">Bundling menuntut </w:t>
+            </w:r>
+            <w:r>
+              <w:rPr>
+                <w:b/>
+                <w:sz w:val="19"/>
+              </w:rPr>
+              <w:t>seluruh</w:t>
+            </w:r>
+            <w:r>
+              <w:rPr>
+                <w:sz w:val="19"/>
+              </w:rPr>
+              <w:t xml:space="preserve"> menunya terpenuhi</w:t>
             </w:r>
           </w:p>
         </w:tc>
@@ -10783,7 +10905,7 @@
               <w:rPr>
                 <w:sz w:val="19"/>
               </w:rPr>
-              <w:t>Satu menu yang kurang tidak membatalkan promo untuk menu lain yang sudah memenuhi</w:t>
+              <w:t>Sebagian-cukup berarti paket yang dijanjikan tidak pernah benar-benar dibeli, tapi restonya tetap membayar potongannya</w:t>
             </w:r>
           </w:p>
         </w:tc>
@@ -10801,23 +10923,23 @@
               <w:rPr>
                 <w:sz w:val="19"/>
               </w:rPr>
-              <w:t>Potongan tidak pernah melebihi tagihannya</w:t>
-            </w:r>
-          </w:p>
-        </w:tc>
-        <w:tc>
-          <w:tcPr>
-            <w:tcW w:type="dxa" w:w="4929"/>
-          </w:tcPr>
-          <w:p>
-            <w:pPr>
-              <w:spacing w:after="40" w:before="40"/>
-            </w:pPr>
-            <w:r>
-              <w:rPr>
-                <w:sz w:val="19"/>
-              </w:rPr>
-              <w:t>Kalau tidak, totalnya negatif — resto berutang kepada orang yang belum membayar apa pun</w:t>
+              <w:t>Menu di luar promo tidak ikut dipotong sekalipun ada di keranjang</w:t>
+            </w:r>
+          </w:p>
+        </w:tc>
+        <w:tc>
+          <w:tcPr>
+            <w:tcW w:type="dxa" w:w="4929"/>
+          </w:tcPr>
+          <w:p>
+            <w:pPr>
+              <w:spacing w:after="40" w:before="40"/>
+            </w:pPr>
+            <w:r>
+              <w:rPr>
+                <w:sz w:val="19"/>
+              </w:rPr>
+              <w:t>Potongannya dihitung dari menu yang memang ikut promo</w:t>
             </w:r>
           </w:p>
         </w:tc>
@@ -10836,6 +10958,41 @@
               <w:rPr>
                 <w:sz w:val="19"/>
               </w:rPr>
+              <w:t>Potongan tidak pernah melebihi tagihannya</w:t>
+            </w:r>
+          </w:p>
+        </w:tc>
+        <w:tc>
+          <w:tcPr>
+            <w:tcW w:type="dxa" w:w="4929"/>
+            <w:shd w:val="clear" w:fill="F4F5FB"/>
+          </w:tcPr>
+          <w:p>
+            <w:pPr>
+              <w:spacing w:after="40" w:before="40"/>
+            </w:pPr>
+            <w:r>
+              <w:rPr>
+                <w:sz w:val="19"/>
+              </w:rPr>
+              <w:t>Kalau tidak, totalnya negatif — resto berutang kepada orang yang belum membayar apa pun</w:t>
+            </w:r>
+          </w:p>
+        </w:tc>
+      </w:tr>
+      <w:tr>
+        <w:tc>
+          <w:tcPr>
+            <w:tcW w:type="dxa" w:w="4929"/>
+          </w:tcPr>
+          <w:p>
+            <w:pPr>
+              <w:spacing w:after="40" w:before="40"/>
+            </w:pPr>
+            <w:r>
+              <w:rPr>
+                <w:sz w:val="19"/>
+              </w:rPr>
               <w:t xml:space="preserve">Diskon dihitung dari </w:t>
             </w:r>
             <w:r>
@@ -10850,7 +11007,6 @@
         <w:tc>
           <w:tcPr>
             <w:tcW w:type="dxa" w:w="4929"/>
-            <w:shd w:val="clear" w:fill="F4F5FB"/>
           </w:tcPr>
           <w:p>
             <w:pPr>
@@ -23755,7 +23911,7 @@
               <w:rPr>
                 <w:sz w:val="19"/>
               </w:rPr>
-              <w:t>Membuat dan mengubah promo — per menu, bundling, atau minimum belanja — berikut syarat jumlah dan masa berlakunya</w:t>
+              <w:t>Membuat dan mengubah promo — per menu, bundling, atau minimum belanja; tiap menu diberi syarat jumlahnya sendiri, Minimal atau Tepat</w:t>
             </w:r>
           </w:p>
         </w:tc>
@@ -29363,7 +29519,7 @@
               <w:rPr>
                 <w:sz w:val="19"/>
               </w:rPr>
-              <w:t>Membuat promo per menu, bundling beberapa menu sekaligus, atau minimum belanja; menetapkan syarat jumlah, bentuk potongan, dan masa berlakunya</w:t>
+              <w:t>Membuat promo per menu, bundling beberapa menu sekaligus, atau minimum belanja; tiap menu diberi syarat jumlahnya sendiri (Minimal atau Tepat), lalu bentuk potongan dan masa berlakunya</w:t>
             </w:r>
           </w:p>
         </w:tc>

</xml_diff>

<commit_message>
FSD: nomor versi ke 1.45.4
Co-Authored-By: Claude Opus 5 <noreply@anthropic.com>
</commit_message>
<xml_diff>
--- a/docs/FSD-KAATAGO.docx
+++ b/docs/FSD-KAATAGO.docx
@@ -142,7 +142,7 @@
               <w:rPr>
                 <w:sz w:val="20"/>
               </w:rPr>
-              <w:t>1.45.2 (build 90)</w:t>
+              <w:t>1.45.4 (build 92)</w:t>
             </w:r>
           </w:p>
         </w:tc>
@@ -35992,7 +35992,7 @@
           <w:i/>
           <w:sz w:val="21"/>
         </w:rPr>
-        <w:t>Dokumen ini disusun dari aplikasi versi 1.45.2. Sisi teknisnya — arsitektur, tabel, keamanan baris, prasyarat basis data — ada di `SPESIFIKASI-KAATAGO`.</w:t>
+        <w:t>Dokumen ini disusun dari aplikasi versi 1.45.4. Sisi teknisnya — arsitektur, tabel, keamanan baris, prasyarat basis data — ada di `SPESIFIKASI-KAATAGO`.</w:t>
       </w:r>
     </w:p>
     <w:sectPr>
@@ -36116,7 +36116,7 @@
         <w:color w:val="6E728C"/>
         <w:sz w:val="17"/>
       </w:rPr>
-      <w:t>KaataGo — Functional Specification Document  |  v1.45.2</w:t>
+      <w:t>KaataGo — Functional Specification Document  |  v1.45.4</w:t>
     </w:r>
   </w:p>
 </w:hdr>

</xml_diff>